<commit_message>
Diagrama de casos de uso y su documentación listas
</commit_message>
<xml_diff>
--- a/documentacion/Diagrama de Casos de Uso/PROYECTO-RETO – Diagrama-Casos-De-Uso _ Grupo2.docx
+++ b/documentacion/Diagrama de Casos de Uso/PROYECTO-RETO – Diagrama-Casos-De-Uso _ Grupo2.docx
@@ -852,7 +852,7 @@
                             <w:pPr>
                               <w:pStyle w:val="Ttulo1"/>
                             </w:pPr>
-                            <w:bookmarkStart w:id="0" w:name="_Toc228125415"/>
+                            <w:bookmarkStart w:id="0" w:name="_Toc228141096"/>
                             <w:r>
                               <w:rPr>
                                 <w:rFonts w:ascii="Segoe UI Emoji" w:hAnsi="Segoe UI Emoji"/>
@@ -891,7 +891,7 @@
                       <w:pPr>
                         <w:pStyle w:val="Ttulo1"/>
                       </w:pPr>
-                      <w:bookmarkStart w:id="1" w:name="_Toc228125415"/>
+                      <w:bookmarkStart w:id="1" w:name="_Toc228141096"/>
                       <w:r>
                         <w:rPr>
                           <w:rFonts w:ascii="Segoe UI Emoji" w:hAnsi="Segoe UI Emoji"/>
@@ -967,7 +967,7 @@
           <w:r>
             <w:fldChar w:fldCharType="separate"/>
           </w:r>
-          <w:hyperlink w:anchor="_Toc228125415" w:history="1">
+          <w:hyperlink w:anchor="_Toc228141096" w:history="1">
             <w:r>
               <w:rPr>
                 <w:rStyle w:val="Hipervnculo"/>
@@ -1002,7 +1002,7 @@
                 <w:noProof/>
                 <w:webHidden/>
               </w:rPr>
-              <w:instrText xml:space="preserve"> PAGEREF _Toc228125415 \h </w:instrText>
+              <w:instrText xml:space="preserve"> PAGEREF _Toc228141096 \h </w:instrText>
             </w:r>
             <w:r>
               <w:rPr>
@@ -1049,7 +1049,7 @@
               <w14:ligatures w14:val="standardContextual"/>
             </w:rPr>
           </w:pPr>
-          <w:hyperlink w:anchor="_Toc228125416" w:history="1">
+          <w:hyperlink w:anchor="_Toc228141097" w:history="1">
             <w:r>
               <w:rPr>
                 <w:rStyle w:val="Hipervnculo"/>
@@ -1084,7 +1084,7 @@
                 <w:noProof/>
                 <w:webHidden/>
               </w:rPr>
-              <w:instrText xml:space="preserve"> PAGEREF _Toc228125416 \h </w:instrText>
+              <w:instrText xml:space="preserve"> PAGEREF _Toc228141097 \h </w:instrText>
             </w:r>
             <w:r>
               <w:rPr>
@@ -1129,7 +1129,7 @@
               <w14:ligatures w14:val="standardContextual"/>
             </w:rPr>
           </w:pPr>
-          <w:hyperlink w:anchor="_Toc228125417" w:history="1">
+          <w:hyperlink w:anchor="_Toc228141098" w:history="1">
             <w:r>
               <w:rPr>
                 <w:rStyle w:val="Hipervnculo"/>
@@ -1152,7 +1152,7 @@
               <w:rPr>
                 <w:webHidden/>
               </w:rPr>
-              <w:instrText xml:space="preserve"> PAGEREF _Toc228125417 \h </w:instrText>
+              <w:instrText xml:space="preserve"> PAGEREF _Toc228141098 \h </w:instrText>
             </w:r>
             <w:r>
               <w:rPr>
@@ -1193,7 +1193,7 @@
               <w14:ligatures w14:val="standardContextual"/>
             </w:rPr>
           </w:pPr>
-          <w:hyperlink w:anchor="_Toc228125418" w:history="1">
+          <w:hyperlink w:anchor="_Toc228141099" w:history="1">
             <w:r>
               <w:rPr>
                 <w:rStyle w:val="Hipervnculo"/>
@@ -1216,7 +1216,7 @@
               <w:rPr>
                 <w:webHidden/>
               </w:rPr>
-              <w:instrText xml:space="preserve"> PAGEREF _Toc228125418 \h </w:instrText>
+              <w:instrText xml:space="preserve"> PAGEREF _Toc228141099 \h </w:instrText>
             </w:r>
             <w:r>
               <w:rPr>
@@ -1259,7 +1259,7 @@
               <w14:ligatures w14:val="standardContextual"/>
             </w:rPr>
           </w:pPr>
-          <w:hyperlink w:anchor="_Toc228125419" w:history="1">
+          <w:hyperlink w:anchor="_Toc228141100" w:history="1">
             <w:r>
               <w:rPr>
                 <w:rStyle w:val="Hipervnculo"/>
@@ -1286,7 +1286,7 @@
                 <w:noProof/>
                 <w:webHidden/>
               </w:rPr>
-              <w:instrText xml:space="preserve"> PAGEREF _Toc228125419 \h </w:instrText>
+              <w:instrText xml:space="preserve"> PAGEREF _Toc228141100 \h </w:instrText>
             </w:r>
             <w:r>
               <w:rPr>
@@ -1311,72 +1311,6 @@
             <w:r>
               <w:rPr>
                 <w:noProof/>
-                <w:webHidden/>
-              </w:rPr>
-              <w:fldChar w:fldCharType="end"/>
-            </w:r>
-          </w:hyperlink>
-        </w:p>
-        <w:p>
-          <w:pPr>
-            <w:pStyle w:val="TDC2"/>
-            <w:rPr>
-              <w:rFonts w:eastAsiaTheme="minorEastAsia"/>
-              <w:b w:val="0"/>
-              <w:bCs w:val="0"/>
-              <w:kern w:val="2"/>
-              <w:sz w:val="24"/>
-              <w:szCs w:val="24"/>
-              <w:lang w:eastAsia="es-ES"/>
-              <w14:ligatures w14:val="standardContextual"/>
-            </w:rPr>
-          </w:pPr>
-          <w:hyperlink w:anchor="_Toc228125420" w:history="1">
-            <w:r>
-              <w:rPr>
-                <w:rStyle w:val="Hipervnculo"/>
-              </w:rPr>
-              <w:t>ACCIONES</w:t>
-            </w:r>
-            <w:r>
-              <w:rPr>
-                <w:webHidden/>
-              </w:rPr>
-              <w:tab/>
-            </w:r>
-            <w:r>
-              <w:rPr>
-                <w:webHidden/>
-              </w:rPr>
-              <w:fldChar w:fldCharType="begin"/>
-            </w:r>
-            <w:r>
-              <w:rPr>
-                <w:webHidden/>
-              </w:rPr>
-              <w:instrText xml:space="preserve"> PAGEREF _Toc228125420 \h </w:instrText>
-            </w:r>
-            <w:r>
-              <w:rPr>
-                <w:webHidden/>
-              </w:rPr>
-            </w:r>
-            <w:r>
-              <w:rPr>
-                <w:webHidden/>
-              </w:rPr>
-              <w:fldChar w:fldCharType="separate"/>
-            </w:r>
-            <w:r>
-              <w:rPr>
-                <w:b w:val="0"/>
-                <w:bCs w:val="0"/>
-                <w:webHidden/>
-              </w:rPr>
-              <w:t>¡Error! Marcador no definido.</w:t>
-            </w:r>
-            <w:r>
-              <w:rPr>
                 <w:webHidden/>
               </w:rPr>
               <w:fldChar w:fldCharType="end"/>
@@ -1399,13 +1333,13 @@
               <w14:ligatures w14:val="standardContextual"/>
             </w:rPr>
           </w:pPr>
-          <w:hyperlink w:anchor="_Toc228125421" w:history="1">
+          <w:hyperlink w:anchor="_Toc228141101" w:history="1">
             <w:r>
               <w:rPr>
                 <w:rStyle w:val="Hipervnculo"/>
                 <w:noProof/>
               </w:rPr>
-              <w:t>¿Qué son las acciones?:</w:t>
+              <w:t>Imagen de la jerarquía de generalización de los actores</w:t>
             </w:r>
             <w:r>
               <w:rPr>
@@ -1426,7 +1360,7 @@
                 <w:noProof/>
                 <w:webHidden/>
               </w:rPr>
-              <w:instrText xml:space="preserve"> PAGEREF _Toc228125421 \h </w:instrText>
+              <w:instrText xml:space="preserve"> PAGEREF _Toc228141101 \h </w:instrText>
             </w:r>
             <w:r>
               <w:rPr>
@@ -1443,16 +1377,142 @@
             </w:r>
             <w:r>
               <w:rPr>
-                <w:b/>
-                <w:bCs/>
                 <w:noProof/>
                 <w:webHidden/>
               </w:rPr>
-              <w:t>¡Error! Marcador no definido.</w:t>
+              <w:t>5</w:t>
             </w:r>
             <w:r>
               <w:rPr>
                 <w:noProof/>
+                <w:webHidden/>
+              </w:rPr>
+              <w:fldChar w:fldCharType="end"/>
+            </w:r>
+          </w:hyperlink>
+        </w:p>
+        <w:p>
+          <w:pPr>
+            <w:pStyle w:val="TDC2"/>
+            <w:rPr>
+              <w:rFonts w:eastAsiaTheme="minorEastAsia"/>
+              <w:b w:val="0"/>
+              <w:bCs w:val="0"/>
+              <w:kern w:val="2"/>
+              <w:sz w:val="24"/>
+              <w:szCs w:val="24"/>
+              <w:lang w:eastAsia="es-ES"/>
+              <w14:ligatures w14:val="standardContextual"/>
+            </w:rPr>
+          </w:pPr>
+          <w:hyperlink w:anchor="_Toc228141102" w:history="1">
+            <w:r>
+              <w:rPr>
+                <w:rStyle w:val="Hipervnculo"/>
+              </w:rPr>
+              <w:t>Diagrama de Casos de Uso</w:t>
+            </w:r>
+            <w:r>
+              <w:rPr>
+                <w:webHidden/>
+              </w:rPr>
+              <w:tab/>
+            </w:r>
+            <w:r>
+              <w:rPr>
+                <w:webHidden/>
+              </w:rPr>
+              <w:fldChar w:fldCharType="begin"/>
+            </w:r>
+            <w:r>
+              <w:rPr>
+                <w:webHidden/>
+              </w:rPr>
+              <w:instrText xml:space="preserve"> PAGEREF _Toc228141102 \h </w:instrText>
+            </w:r>
+            <w:r>
+              <w:rPr>
+                <w:webHidden/>
+              </w:rPr>
+            </w:r>
+            <w:r>
+              <w:rPr>
+                <w:webHidden/>
+              </w:rPr>
+              <w:fldChar w:fldCharType="separate"/>
+            </w:r>
+            <w:r>
+              <w:rPr>
+                <w:webHidden/>
+              </w:rPr>
+              <w:t>6</w:t>
+            </w:r>
+            <w:r>
+              <w:rPr>
+                <w:webHidden/>
+              </w:rPr>
+              <w:fldChar w:fldCharType="end"/>
+            </w:r>
+          </w:hyperlink>
+        </w:p>
+        <w:p>
+          <w:pPr>
+            <w:pStyle w:val="TDC2"/>
+            <w:rPr>
+              <w:rFonts w:eastAsiaTheme="minorEastAsia"/>
+              <w:b w:val="0"/>
+              <w:bCs w:val="0"/>
+              <w:kern w:val="2"/>
+              <w:sz w:val="24"/>
+              <w:szCs w:val="24"/>
+              <w:lang w:eastAsia="es-ES"/>
+              <w14:ligatures w14:val="standardContextual"/>
+            </w:rPr>
+          </w:pPr>
+          <w:hyperlink w:anchor="_Toc228141103" w:history="1">
+            <w:r>
+              <w:rPr>
+                <w:rStyle w:val="Hipervnculo"/>
+              </w:rPr>
+              <w:t>Fichas Descriptivas de Casos de Uso</w:t>
+            </w:r>
+            <w:r>
+              <w:rPr>
+                <w:webHidden/>
+              </w:rPr>
+              <w:tab/>
+            </w:r>
+            <w:r>
+              <w:rPr>
+                <w:webHidden/>
+              </w:rPr>
+              <w:fldChar w:fldCharType="begin"/>
+            </w:r>
+            <w:r>
+              <w:rPr>
+                <w:webHidden/>
+              </w:rPr>
+              <w:instrText xml:space="preserve"> PAGEREF _Toc228141103 \h </w:instrText>
+            </w:r>
+            <w:r>
+              <w:rPr>
+                <w:webHidden/>
+              </w:rPr>
+            </w:r>
+            <w:r>
+              <w:rPr>
+                <w:webHidden/>
+              </w:rPr>
+              <w:fldChar w:fldCharType="separate"/>
+            </w:r>
+            <w:r>
+              <w:rPr>
+                <w:webHidden/>
+              </w:rPr>
+              <w:t>7</w:t>
+            </w:r>
+            <w:r>
+              <w:rPr>
                 <w:webHidden/>
               </w:rPr>
               <w:fldChar w:fldCharType="end"/>
@@ -1475,13 +1535,13 @@
               <w14:ligatures w14:val="standardContextual"/>
             </w:rPr>
           </w:pPr>
-          <w:hyperlink w:anchor="_Toc228125422" w:history="1">
+          <w:hyperlink w:anchor="_Toc228141104" w:history="1">
             <w:r>
               <w:rPr>
                 <w:rStyle w:val="Hipervnculo"/>
                 <w:noProof/>
               </w:rPr>
-              <w:t>Asignación de Camas:</w:t>
+              <w:t>Gestión de Asignación y Traslados</w:t>
             </w:r>
             <w:r>
               <w:rPr>
@@ -1502,7 +1562,7 @@
                 <w:noProof/>
                 <w:webHidden/>
               </w:rPr>
-              <w:instrText xml:space="preserve"> PAGEREF _Toc228125422 \h </w:instrText>
+              <w:instrText xml:space="preserve"> PAGEREF _Toc228141104 \h </w:instrText>
             </w:r>
             <w:r>
               <w:rPr>
@@ -1522,7 +1582,7 @@
                 <w:noProof/>
                 <w:webHidden/>
               </w:rPr>
-              <w:t>6</w:t>
+              <w:t>7</w:t>
             </w:r>
             <w:r>
               <w:rPr>
@@ -1549,13 +1609,13 @@
               <w14:ligatures w14:val="standardContextual"/>
             </w:rPr>
           </w:pPr>
-          <w:hyperlink w:anchor="_Toc228125423" w:history="1">
+          <w:hyperlink w:anchor="_Toc228141105" w:history="1">
             <w:r>
               <w:rPr>
                 <w:rStyle w:val="Hipervnculo"/>
                 <w:noProof/>
               </w:rPr>
-              <w:t>Proceso de Rondas Medicas Diarias:</w:t>
+              <w:t>Seguimiento Clínico</w:t>
             </w:r>
             <w:r>
               <w:rPr>
@@ -1576,7 +1636,7 @@
                 <w:noProof/>
                 <w:webHidden/>
               </w:rPr>
-              <w:instrText xml:space="preserve"> PAGEREF _Toc228125423 \h </w:instrText>
+              <w:instrText xml:space="preserve"> PAGEREF _Toc228141105 \h </w:instrText>
             </w:r>
             <w:r>
               <w:rPr>
@@ -1593,12 +1653,10 @@
             </w:r>
             <w:r>
               <w:rPr>
-                <w:b/>
-                <w:bCs/>
                 <w:noProof/>
                 <w:webHidden/>
               </w:rPr>
-              <w:t>¡Error! Marcador no definido.</w:t>
+              <w:t>12</w:t>
             </w:r>
             <w:r>
               <w:rPr>
@@ -1625,13 +1683,13 @@
               <w14:ligatures w14:val="standardContextual"/>
             </w:rPr>
           </w:pPr>
-          <w:hyperlink w:anchor="_Toc228125424" w:history="1">
+          <w:hyperlink w:anchor="_Toc228141106" w:history="1">
             <w:r>
               <w:rPr>
                 <w:rStyle w:val="Hipervnculo"/>
                 <w:noProof/>
               </w:rPr>
-              <w:t>Evaluación final a un Paciente</w:t>
+              <w:t>Gestión de Altas</w:t>
             </w:r>
             <w:r>
               <w:rPr>
@@ -1652,7 +1710,7 @@
                 <w:noProof/>
                 <w:webHidden/>
               </w:rPr>
-              <w:instrText xml:space="preserve"> PAGEREF _Toc228125424 \h </w:instrText>
+              <w:instrText xml:space="preserve"> PAGEREF _Toc228141106 \h </w:instrText>
             </w:r>
             <w:r>
               <w:rPr>
@@ -1669,894 +1727,10 @@
             </w:r>
             <w:r>
               <w:rPr>
-                <w:b/>
-                <w:bCs/>
                 <w:noProof/>
                 <w:webHidden/>
               </w:rPr>
-              <w:t>¡Error! Marcador no definido.</w:t>
-            </w:r>
-            <w:r>
-              <w:rPr>
-                <w:noProof/>
-                <w:webHidden/>
-              </w:rPr>
-              <w:fldChar w:fldCharType="end"/>
-            </w:r>
-          </w:hyperlink>
-        </w:p>
-        <w:p>
-          <w:pPr>
-            <w:pStyle w:val="TDC3"/>
-            <w:tabs>
-              <w:tab w:val="right" w:leader="dot" w:pos="8494"/>
-            </w:tabs>
-            <w:rPr>
-              <w:rFonts w:eastAsiaTheme="minorEastAsia"/>
-              <w:noProof/>
-              <w:kern w:val="2"/>
-              <w:sz w:val="24"/>
-              <w:szCs w:val="24"/>
-              <w:lang w:eastAsia="es-ES"/>
-              <w14:ligatures w14:val="standardContextual"/>
-            </w:rPr>
-          </w:pPr>
-          <w:hyperlink w:anchor="_Toc228125425" w:history="1">
-            <w:r>
-              <w:rPr>
-                <w:rStyle w:val="Hipervnculo"/>
-                <w:noProof/>
-              </w:rPr>
-              <w:t>Documentación del Alta de un Paciente</w:t>
-            </w:r>
-            <w:r>
-              <w:rPr>
-                <w:noProof/>
-                <w:webHidden/>
-              </w:rPr>
-              <w:tab/>
-            </w:r>
-            <w:r>
-              <w:rPr>
-                <w:noProof/>
-                <w:webHidden/>
-              </w:rPr>
-              <w:fldChar w:fldCharType="begin"/>
-            </w:r>
-            <w:r>
-              <w:rPr>
-                <w:noProof/>
-                <w:webHidden/>
-              </w:rPr>
-              <w:instrText xml:space="preserve"> PAGEREF _Toc228125425 \h </w:instrText>
-            </w:r>
-            <w:r>
-              <w:rPr>
-                <w:noProof/>
-                <w:webHidden/>
-              </w:rPr>
-            </w:r>
-            <w:r>
-              <w:rPr>
-                <w:noProof/>
-                <w:webHidden/>
-              </w:rPr>
-              <w:fldChar w:fldCharType="separate"/>
-            </w:r>
-            <w:r>
-              <w:rPr>
-                <w:b/>
-                <w:bCs/>
-                <w:noProof/>
-                <w:webHidden/>
-              </w:rPr>
-              <w:t>¡Error! Marcador no definido.</w:t>
-            </w:r>
-            <w:r>
-              <w:rPr>
-                <w:noProof/>
-                <w:webHidden/>
-              </w:rPr>
-              <w:fldChar w:fldCharType="end"/>
-            </w:r>
-          </w:hyperlink>
-        </w:p>
-        <w:p>
-          <w:pPr>
-            <w:pStyle w:val="TDC3"/>
-            <w:tabs>
-              <w:tab w:val="right" w:leader="dot" w:pos="8494"/>
-            </w:tabs>
-            <w:rPr>
-              <w:rFonts w:eastAsiaTheme="minorEastAsia"/>
-              <w:noProof/>
-              <w:kern w:val="2"/>
-              <w:sz w:val="24"/>
-              <w:szCs w:val="24"/>
-              <w:lang w:eastAsia="es-ES"/>
-              <w14:ligatures w14:val="standardContextual"/>
-            </w:rPr>
-          </w:pPr>
-          <w:hyperlink w:anchor="_Toc228125426" w:history="1">
-            <w:r>
-              <w:rPr>
-                <w:rStyle w:val="Hipervnculo"/>
-                <w:noProof/>
-              </w:rPr>
-              <w:t>Traslado de un paciente a otra unidad u otro centro médico</w:t>
-            </w:r>
-            <w:r>
-              <w:rPr>
-                <w:noProof/>
-                <w:webHidden/>
-              </w:rPr>
-              <w:tab/>
-            </w:r>
-            <w:r>
-              <w:rPr>
-                <w:noProof/>
-                <w:webHidden/>
-              </w:rPr>
-              <w:fldChar w:fldCharType="begin"/>
-            </w:r>
-            <w:r>
-              <w:rPr>
-                <w:noProof/>
-                <w:webHidden/>
-              </w:rPr>
-              <w:instrText xml:space="preserve"> PAGEREF _Toc228125426 \h </w:instrText>
-            </w:r>
-            <w:r>
-              <w:rPr>
-                <w:noProof/>
-                <w:webHidden/>
-              </w:rPr>
-            </w:r>
-            <w:r>
-              <w:rPr>
-                <w:noProof/>
-                <w:webHidden/>
-              </w:rPr>
-              <w:fldChar w:fldCharType="separate"/>
-            </w:r>
-            <w:r>
-              <w:rPr>
-                <w:b/>
-                <w:bCs/>
-                <w:noProof/>
-                <w:webHidden/>
-              </w:rPr>
-              <w:t>¡Error! Marcador no definido.</w:t>
-            </w:r>
-            <w:r>
-              <w:rPr>
-                <w:noProof/>
-                <w:webHidden/>
-              </w:rPr>
-              <w:fldChar w:fldCharType="end"/>
-            </w:r>
-          </w:hyperlink>
-        </w:p>
-        <w:p>
-          <w:pPr>
-            <w:pStyle w:val="TDC2"/>
-            <w:rPr>
-              <w:rFonts w:eastAsiaTheme="minorEastAsia"/>
-              <w:b w:val="0"/>
-              <w:bCs w:val="0"/>
-              <w:kern w:val="2"/>
-              <w:sz w:val="24"/>
-              <w:szCs w:val="24"/>
-              <w:lang w:eastAsia="es-ES"/>
-              <w14:ligatures w14:val="standardContextual"/>
-            </w:rPr>
-          </w:pPr>
-          <w:hyperlink w:anchor="_Toc228125427" w:history="1">
-            <w:r>
-              <w:rPr>
-                <w:rStyle w:val="Hipervnculo"/>
-              </w:rPr>
-              <w:t>REGLAS DEL SISTEMA</w:t>
-            </w:r>
-            <w:r>
-              <w:rPr>
-                <w:webHidden/>
-              </w:rPr>
-              <w:tab/>
-            </w:r>
-            <w:r>
-              <w:rPr>
-                <w:webHidden/>
-              </w:rPr>
-              <w:fldChar w:fldCharType="begin"/>
-            </w:r>
-            <w:r>
-              <w:rPr>
-                <w:webHidden/>
-              </w:rPr>
-              <w:instrText xml:space="preserve"> PAGEREF _Toc228125427 \h </w:instrText>
-            </w:r>
-            <w:r>
-              <w:rPr>
-                <w:webHidden/>
-              </w:rPr>
-            </w:r>
-            <w:r>
-              <w:rPr>
-                <w:webHidden/>
-              </w:rPr>
-              <w:fldChar w:fldCharType="separate"/>
-            </w:r>
-            <w:r>
-              <w:rPr>
-                <w:b w:val="0"/>
-                <w:bCs w:val="0"/>
-                <w:webHidden/>
-              </w:rPr>
-              <w:t>¡Error! Marcador no definido.</w:t>
-            </w:r>
-            <w:r>
-              <w:rPr>
-                <w:webHidden/>
-              </w:rPr>
-              <w:fldChar w:fldCharType="end"/>
-            </w:r>
-          </w:hyperlink>
-        </w:p>
-        <w:p>
-          <w:pPr>
-            <w:pStyle w:val="TDC2"/>
-            <w:rPr>
-              <w:rFonts w:eastAsiaTheme="minorEastAsia"/>
-              <w:b w:val="0"/>
-              <w:bCs w:val="0"/>
-              <w:kern w:val="2"/>
-              <w:sz w:val="24"/>
-              <w:szCs w:val="24"/>
-              <w:lang w:eastAsia="es-ES"/>
-              <w14:ligatures w14:val="standardContextual"/>
-            </w:rPr>
-          </w:pPr>
-          <w:hyperlink w:anchor="_Toc228125428" w:history="1">
-            <w:r>
-              <w:rPr>
-                <w:rStyle w:val="Hipervnculo"/>
-              </w:rPr>
-              <w:t>DATOS DE CADA ACTOR Y ENTIDAD</w:t>
-            </w:r>
-            <w:r>
-              <w:rPr>
-                <w:webHidden/>
-              </w:rPr>
-              <w:tab/>
-            </w:r>
-            <w:r>
-              <w:rPr>
-                <w:webHidden/>
-              </w:rPr>
-              <w:fldChar w:fldCharType="begin"/>
-            </w:r>
-            <w:r>
-              <w:rPr>
-                <w:webHidden/>
-              </w:rPr>
-              <w:instrText xml:space="preserve"> PAGEREF _Toc228125428 \h </w:instrText>
-            </w:r>
-            <w:r>
-              <w:rPr>
-                <w:webHidden/>
-              </w:rPr>
-            </w:r>
-            <w:r>
-              <w:rPr>
-                <w:webHidden/>
-              </w:rPr>
-              <w:fldChar w:fldCharType="separate"/>
-            </w:r>
-            <w:r>
-              <w:rPr>
-                <w:b w:val="0"/>
-                <w:bCs w:val="0"/>
-                <w:webHidden/>
-              </w:rPr>
-              <w:t>¡Error! Marcador no definido.</w:t>
-            </w:r>
-            <w:r>
-              <w:rPr>
-                <w:webHidden/>
-              </w:rPr>
-              <w:fldChar w:fldCharType="end"/>
-            </w:r>
-          </w:hyperlink>
-        </w:p>
-        <w:p>
-          <w:pPr>
-            <w:pStyle w:val="TDC3"/>
-            <w:tabs>
-              <w:tab w:val="right" w:leader="dot" w:pos="8494"/>
-            </w:tabs>
-            <w:rPr>
-              <w:rFonts w:eastAsiaTheme="minorEastAsia"/>
-              <w:noProof/>
-              <w:kern w:val="2"/>
-              <w:sz w:val="24"/>
-              <w:szCs w:val="24"/>
-              <w:lang w:eastAsia="es-ES"/>
-              <w14:ligatures w14:val="standardContextual"/>
-            </w:rPr>
-          </w:pPr>
-          <w:hyperlink w:anchor="_Toc228125429" w:history="1">
-            <w:r>
-              <w:rPr>
-                <w:rStyle w:val="Hipervnculo"/>
-                <w:noProof/>
-              </w:rPr>
-              <w:t>ACTORES</w:t>
-            </w:r>
-            <w:r>
-              <w:rPr>
-                <w:noProof/>
-                <w:webHidden/>
-              </w:rPr>
-              <w:tab/>
-            </w:r>
-            <w:r>
-              <w:rPr>
-                <w:noProof/>
-                <w:webHidden/>
-              </w:rPr>
-              <w:fldChar w:fldCharType="begin"/>
-            </w:r>
-            <w:r>
-              <w:rPr>
-                <w:noProof/>
-                <w:webHidden/>
-              </w:rPr>
-              <w:instrText xml:space="preserve"> PAGEREF _Toc228125429 \h </w:instrText>
-            </w:r>
-            <w:r>
-              <w:rPr>
-                <w:noProof/>
-                <w:webHidden/>
-              </w:rPr>
-            </w:r>
-            <w:r>
-              <w:rPr>
-                <w:noProof/>
-                <w:webHidden/>
-              </w:rPr>
-              <w:fldChar w:fldCharType="separate"/>
-            </w:r>
-            <w:r>
-              <w:rPr>
-                <w:b/>
-                <w:bCs/>
-                <w:noProof/>
-                <w:webHidden/>
-              </w:rPr>
-              <w:t>¡Error! Marcador no definido.</w:t>
-            </w:r>
-            <w:r>
-              <w:rPr>
-                <w:noProof/>
-                <w:webHidden/>
-              </w:rPr>
-              <w:fldChar w:fldCharType="end"/>
-            </w:r>
-          </w:hyperlink>
-        </w:p>
-        <w:p>
-          <w:pPr>
-            <w:pStyle w:val="TDC3"/>
-            <w:tabs>
-              <w:tab w:val="right" w:leader="dot" w:pos="8494"/>
-            </w:tabs>
-            <w:rPr>
-              <w:rFonts w:eastAsiaTheme="minorEastAsia"/>
-              <w:noProof/>
-              <w:kern w:val="2"/>
-              <w:sz w:val="24"/>
-              <w:szCs w:val="24"/>
-              <w:lang w:eastAsia="es-ES"/>
-              <w14:ligatures w14:val="standardContextual"/>
-            </w:rPr>
-          </w:pPr>
-          <w:hyperlink w:anchor="_Toc228125430" w:history="1">
-            <w:r>
-              <w:rPr>
-                <w:rStyle w:val="Hipervnculo"/>
-                <w:noProof/>
-              </w:rPr>
-              <w:t>ENTIDADES</w:t>
-            </w:r>
-            <w:r>
-              <w:rPr>
-                <w:noProof/>
-                <w:webHidden/>
-              </w:rPr>
-              <w:tab/>
-            </w:r>
-            <w:r>
-              <w:rPr>
-                <w:noProof/>
-                <w:webHidden/>
-              </w:rPr>
-              <w:fldChar w:fldCharType="begin"/>
-            </w:r>
-            <w:r>
-              <w:rPr>
-                <w:noProof/>
-                <w:webHidden/>
-              </w:rPr>
-              <w:instrText xml:space="preserve"> PAGEREF _Toc228125430 \h </w:instrText>
-            </w:r>
-            <w:r>
-              <w:rPr>
-                <w:noProof/>
-                <w:webHidden/>
-              </w:rPr>
-            </w:r>
-            <w:r>
-              <w:rPr>
-                <w:noProof/>
-                <w:webHidden/>
-              </w:rPr>
-              <w:fldChar w:fldCharType="separate"/>
-            </w:r>
-            <w:r>
-              <w:rPr>
-                <w:b/>
-                <w:bCs/>
-                <w:noProof/>
-                <w:webHidden/>
-              </w:rPr>
-              <w:t>¡Error! Marcador no definido.</w:t>
-            </w:r>
-            <w:r>
-              <w:rPr>
-                <w:noProof/>
-                <w:webHidden/>
-              </w:rPr>
-              <w:fldChar w:fldCharType="end"/>
-            </w:r>
-          </w:hyperlink>
-        </w:p>
-        <w:p>
-          <w:pPr>
-            <w:pStyle w:val="TDC2"/>
-            <w:rPr>
-              <w:rFonts w:eastAsiaTheme="minorEastAsia"/>
-              <w:b w:val="0"/>
-              <w:bCs w:val="0"/>
-              <w:kern w:val="2"/>
-              <w:sz w:val="24"/>
-              <w:szCs w:val="24"/>
-              <w:lang w:eastAsia="es-ES"/>
-              <w14:ligatures w14:val="standardContextual"/>
-            </w:rPr>
-          </w:pPr>
-          <w:hyperlink w:anchor="_Toc228125431" w:history="1">
-            <w:r>
-              <w:rPr>
-                <w:rStyle w:val="Hipervnculo"/>
-              </w:rPr>
-              <w:t>DECISIONES TOMADAS Y JUSTIFICADAS</w:t>
-            </w:r>
-            <w:r>
-              <w:rPr>
-                <w:webHidden/>
-              </w:rPr>
-              <w:tab/>
-            </w:r>
-            <w:r>
-              <w:rPr>
-                <w:webHidden/>
-              </w:rPr>
-              <w:fldChar w:fldCharType="begin"/>
-            </w:r>
-            <w:r>
-              <w:rPr>
-                <w:webHidden/>
-              </w:rPr>
-              <w:instrText xml:space="preserve"> PAGEREF _Toc228125431 \h </w:instrText>
-            </w:r>
-            <w:r>
-              <w:rPr>
-                <w:webHidden/>
-              </w:rPr>
-            </w:r>
-            <w:r>
-              <w:rPr>
-                <w:webHidden/>
-              </w:rPr>
-              <w:fldChar w:fldCharType="separate"/>
-            </w:r>
-            <w:r>
-              <w:rPr>
-                <w:b w:val="0"/>
-                <w:bCs w:val="0"/>
-                <w:webHidden/>
-              </w:rPr>
-              <w:t>¡Error! Marcador no definido.</w:t>
-            </w:r>
-            <w:r>
-              <w:rPr>
-                <w:webHidden/>
-              </w:rPr>
-              <w:fldChar w:fldCharType="end"/>
-            </w:r>
-          </w:hyperlink>
-        </w:p>
-        <w:p>
-          <w:pPr>
-            <w:pStyle w:val="TDC3"/>
-            <w:tabs>
-              <w:tab w:val="right" w:leader="dot" w:pos="8494"/>
-            </w:tabs>
-            <w:rPr>
-              <w:rFonts w:eastAsiaTheme="minorEastAsia"/>
-              <w:noProof/>
-              <w:kern w:val="2"/>
-              <w:sz w:val="24"/>
-              <w:szCs w:val="24"/>
-              <w:lang w:eastAsia="es-ES"/>
-              <w14:ligatures w14:val="standardContextual"/>
-            </w:rPr>
-          </w:pPr>
-          <w:hyperlink w:anchor="_Toc228125432" w:history="1">
-            <w:r>
-              <w:rPr>
-                <w:rStyle w:val="Hipervnculo"/>
-                <w:noProof/>
-              </w:rPr>
-              <w:t>¿Cómo simular el tiempo?</w:t>
-            </w:r>
-            <w:r>
-              <w:rPr>
-                <w:noProof/>
-                <w:webHidden/>
-              </w:rPr>
-              <w:tab/>
-            </w:r>
-            <w:r>
-              <w:rPr>
-                <w:noProof/>
-                <w:webHidden/>
-              </w:rPr>
-              <w:fldChar w:fldCharType="begin"/>
-            </w:r>
-            <w:r>
-              <w:rPr>
-                <w:noProof/>
-                <w:webHidden/>
-              </w:rPr>
-              <w:instrText xml:space="preserve"> PAGEREF _Toc228125432 \h </w:instrText>
-            </w:r>
-            <w:r>
-              <w:rPr>
-                <w:noProof/>
-                <w:webHidden/>
-              </w:rPr>
-            </w:r>
-            <w:r>
-              <w:rPr>
-                <w:noProof/>
-                <w:webHidden/>
-              </w:rPr>
-              <w:fldChar w:fldCharType="separate"/>
-            </w:r>
-            <w:r>
-              <w:rPr>
-                <w:b/>
-                <w:bCs/>
-                <w:noProof/>
-                <w:webHidden/>
-              </w:rPr>
-              <w:t>¡Error! Marcador no definido.</w:t>
-            </w:r>
-            <w:r>
-              <w:rPr>
-                <w:noProof/>
-                <w:webHidden/>
-              </w:rPr>
-              <w:fldChar w:fldCharType="end"/>
-            </w:r>
-          </w:hyperlink>
-        </w:p>
-        <w:p>
-          <w:pPr>
-            <w:pStyle w:val="TDC3"/>
-            <w:tabs>
-              <w:tab w:val="right" w:leader="dot" w:pos="8494"/>
-            </w:tabs>
-            <w:rPr>
-              <w:rFonts w:eastAsiaTheme="minorEastAsia"/>
-              <w:noProof/>
-              <w:kern w:val="2"/>
-              <w:sz w:val="24"/>
-              <w:szCs w:val="24"/>
-              <w:lang w:eastAsia="es-ES"/>
-              <w14:ligatures w14:val="standardContextual"/>
-            </w:rPr>
-          </w:pPr>
-          <w:hyperlink w:anchor="_Toc228125433" w:history="1">
-            <w:r>
-              <w:rPr>
-                <w:rStyle w:val="Hipervnculo"/>
-                <w:noProof/>
-              </w:rPr>
-              <w:t>¿Qué se entiende por “médicos y personal de salud”?</w:t>
-            </w:r>
-            <w:r>
-              <w:rPr>
-                <w:noProof/>
-                <w:webHidden/>
-              </w:rPr>
-              <w:tab/>
-            </w:r>
-            <w:r>
-              <w:rPr>
-                <w:noProof/>
-                <w:webHidden/>
-              </w:rPr>
-              <w:fldChar w:fldCharType="begin"/>
-            </w:r>
-            <w:r>
-              <w:rPr>
-                <w:noProof/>
-                <w:webHidden/>
-              </w:rPr>
-              <w:instrText xml:space="preserve"> PAGEREF _Toc228125433 \h </w:instrText>
-            </w:r>
-            <w:r>
-              <w:rPr>
-                <w:noProof/>
-                <w:webHidden/>
-              </w:rPr>
-            </w:r>
-            <w:r>
-              <w:rPr>
-                <w:noProof/>
-                <w:webHidden/>
-              </w:rPr>
-              <w:fldChar w:fldCharType="separate"/>
-            </w:r>
-            <w:r>
-              <w:rPr>
-                <w:b/>
-                <w:bCs/>
-                <w:noProof/>
-                <w:webHidden/>
-              </w:rPr>
-              <w:t>¡Error! Marcador no definido.</w:t>
-            </w:r>
-            <w:r>
-              <w:rPr>
-                <w:noProof/>
-                <w:webHidden/>
-              </w:rPr>
-              <w:fldChar w:fldCharType="end"/>
-            </w:r>
-          </w:hyperlink>
-        </w:p>
-        <w:p>
-          <w:pPr>
-            <w:pStyle w:val="TDC3"/>
-            <w:tabs>
-              <w:tab w:val="right" w:leader="dot" w:pos="8494"/>
-            </w:tabs>
-            <w:rPr>
-              <w:rFonts w:eastAsiaTheme="minorEastAsia"/>
-              <w:noProof/>
-              <w:kern w:val="2"/>
-              <w:sz w:val="24"/>
-              <w:szCs w:val="24"/>
-              <w:lang w:eastAsia="es-ES"/>
-              <w14:ligatures w14:val="standardContextual"/>
-            </w:rPr>
-          </w:pPr>
-          <w:hyperlink w:anchor="_Toc228125434" w:history="1">
-            <w:r>
-              <w:rPr>
-                <w:rStyle w:val="Hipervnculo"/>
-                <w:noProof/>
-              </w:rPr>
-              <w:t>¿Quién gestiona el traslado de pacientes?</w:t>
-            </w:r>
-            <w:r>
-              <w:rPr>
-                <w:noProof/>
-                <w:webHidden/>
-              </w:rPr>
-              <w:tab/>
-            </w:r>
-            <w:r>
-              <w:rPr>
-                <w:noProof/>
-                <w:webHidden/>
-              </w:rPr>
-              <w:fldChar w:fldCharType="begin"/>
-            </w:r>
-            <w:r>
-              <w:rPr>
-                <w:noProof/>
-                <w:webHidden/>
-              </w:rPr>
-              <w:instrText xml:space="preserve"> PAGEREF _Toc228125434 \h </w:instrText>
-            </w:r>
-            <w:r>
-              <w:rPr>
-                <w:noProof/>
-                <w:webHidden/>
-              </w:rPr>
-            </w:r>
-            <w:r>
-              <w:rPr>
-                <w:noProof/>
-                <w:webHidden/>
-              </w:rPr>
-              <w:fldChar w:fldCharType="separate"/>
-            </w:r>
-            <w:r>
-              <w:rPr>
-                <w:b/>
-                <w:bCs/>
-                <w:noProof/>
-                <w:webHidden/>
-              </w:rPr>
-              <w:t>¡Error! Marcador no definido.</w:t>
-            </w:r>
-            <w:r>
-              <w:rPr>
-                <w:noProof/>
-                <w:webHidden/>
-              </w:rPr>
-              <w:fldChar w:fldCharType="end"/>
-            </w:r>
-          </w:hyperlink>
-        </w:p>
-        <w:p>
-          <w:pPr>
-            <w:pStyle w:val="TDC3"/>
-            <w:tabs>
-              <w:tab w:val="right" w:leader="dot" w:pos="8494"/>
-            </w:tabs>
-            <w:rPr>
-              <w:rFonts w:eastAsiaTheme="minorEastAsia"/>
-              <w:noProof/>
-              <w:kern w:val="2"/>
-              <w:sz w:val="24"/>
-              <w:szCs w:val="24"/>
-              <w:lang w:eastAsia="es-ES"/>
-              <w14:ligatures w14:val="standardContextual"/>
-            </w:rPr>
-          </w:pPr>
-          <w:hyperlink w:anchor="_Toc228125435" w:history="1">
-            <w:r>
-              <w:rPr>
-                <w:rStyle w:val="Hipervnculo"/>
-                <w:noProof/>
-              </w:rPr>
-              <w:t>¿Quién se encarga de la evaluación final de los pacientes?</w:t>
-            </w:r>
-            <w:r>
-              <w:rPr>
-                <w:noProof/>
-                <w:webHidden/>
-              </w:rPr>
-              <w:tab/>
-            </w:r>
-            <w:r>
-              <w:rPr>
-                <w:noProof/>
-                <w:webHidden/>
-              </w:rPr>
-              <w:fldChar w:fldCharType="begin"/>
-            </w:r>
-            <w:r>
-              <w:rPr>
-                <w:noProof/>
-                <w:webHidden/>
-              </w:rPr>
-              <w:instrText xml:space="preserve"> PAGEREF _Toc228125435 \h </w:instrText>
-            </w:r>
-            <w:r>
-              <w:rPr>
-                <w:noProof/>
-                <w:webHidden/>
-              </w:rPr>
-            </w:r>
-            <w:r>
-              <w:rPr>
-                <w:noProof/>
-                <w:webHidden/>
-              </w:rPr>
-              <w:fldChar w:fldCharType="separate"/>
-            </w:r>
-            <w:r>
-              <w:rPr>
-                <w:b/>
-                <w:bCs/>
-                <w:noProof/>
-                <w:webHidden/>
-              </w:rPr>
-              <w:t>¡Error! Marcador no definido.</w:t>
-            </w:r>
-            <w:r>
-              <w:rPr>
-                <w:noProof/>
-                <w:webHidden/>
-              </w:rPr>
-              <w:fldChar w:fldCharType="end"/>
-            </w:r>
-          </w:hyperlink>
-        </w:p>
-        <w:p>
-          <w:pPr>
-            <w:pStyle w:val="TDC3"/>
-            <w:tabs>
-              <w:tab w:val="right" w:leader="dot" w:pos="8494"/>
-            </w:tabs>
-            <w:rPr>
-              <w:rFonts w:eastAsiaTheme="minorEastAsia"/>
-              <w:noProof/>
-              <w:kern w:val="2"/>
-              <w:sz w:val="24"/>
-              <w:szCs w:val="24"/>
-              <w:lang w:eastAsia="es-ES"/>
-              <w14:ligatures w14:val="standardContextual"/>
-            </w:rPr>
-          </w:pPr>
-          <w:hyperlink w:anchor="_Toc228125436" w:history="1">
-            <w:r>
-              <w:rPr>
-                <w:rStyle w:val="Hipervnculo"/>
-                <w:noProof/>
-              </w:rPr>
-              <w:t>¿Cómo sabe el sistema que un paciente está listo para la evaluación final?</w:t>
-            </w:r>
-            <w:r>
-              <w:rPr>
-                <w:noProof/>
-                <w:webHidden/>
-              </w:rPr>
-              <w:tab/>
-            </w:r>
-            <w:r>
-              <w:rPr>
-                <w:noProof/>
-                <w:webHidden/>
-              </w:rPr>
-              <w:fldChar w:fldCharType="begin"/>
-            </w:r>
-            <w:r>
-              <w:rPr>
-                <w:noProof/>
-                <w:webHidden/>
-              </w:rPr>
-              <w:instrText xml:space="preserve"> PAGEREF _Toc228125436 \h </w:instrText>
-            </w:r>
-            <w:r>
-              <w:rPr>
-                <w:noProof/>
-                <w:webHidden/>
-              </w:rPr>
-            </w:r>
-            <w:r>
-              <w:rPr>
-                <w:noProof/>
-                <w:webHidden/>
-              </w:rPr>
-              <w:fldChar w:fldCharType="separate"/>
-            </w:r>
-            <w:r>
-              <w:rPr>
-                <w:b/>
-                <w:bCs/>
-                <w:noProof/>
-                <w:webHidden/>
-              </w:rPr>
-              <w:t>¡Error! Marcador no definido.</w:t>
+              <w:t>14</w:t>
             </w:r>
             <w:r>
               <w:rPr>
@@ -2641,7 +1815,7 @@
                             <w:bookmarkStart w:id="2" w:name="_Toc201837460"/>
                             <w:bookmarkStart w:id="3" w:name="_Toc201837471"/>
                             <w:bookmarkStart w:id="4" w:name="_Toc201837593"/>
-                            <w:bookmarkStart w:id="5" w:name="_Toc228125416"/>
+                            <w:bookmarkStart w:id="5" w:name="_Toc228141097"/>
                             <w:r>
                               <w:rPr>
                                 <w:rFonts w:ascii="Segoe UI Emoji" w:hAnsi="Segoe UI Emoji"/>
@@ -2686,7 +1860,7 @@
                       <w:bookmarkStart w:id="6" w:name="_Toc201837460"/>
                       <w:bookmarkStart w:id="7" w:name="_Toc201837471"/>
                       <w:bookmarkStart w:id="8" w:name="_Toc201837593"/>
-                      <w:bookmarkStart w:id="9" w:name="_Toc228125416"/>
+                      <w:bookmarkStart w:id="9" w:name="_Toc228141097"/>
                       <w:r>
                         <w:rPr>
                           <w:rFonts w:ascii="Segoe UI Emoji" w:hAnsi="Segoe UI Emoji"/>
@@ -2717,7 +1891,7 @@
       <w:pPr>
         <w:pStyle w:val="Ttulo2"/>
       </w:pPr>
-      <w:bookmarkStart w:id="10" w:name="_Toc228125417"/>
+      <w:bookmarkStart w:id="10" w:name="_Toc228141098"/>
       <w:r>
         <w:lastRenderedPageBreak/>
         <w:t>Propósito del Sistema</w:t>
@@ -2760,7 +1934,7 @@
       <w:pPr>
         <w:pStyle w:val="Ttulo2"/>
       </w:pPr>
-      <w:bookmarkStart w:id="11" w:name="_Toc228125418"/>
+      <w:bookmarkStart w:id="11" w:name="_Toc228141099"/>
       <w:r>
         <w:t>ACTORES</w:t>
       </w:r>
@@ -3032,7 +2206,7 @@
       <w:pPr>
         <w:pStyle w:val="Ttulo3"/>
       </w:pPr>
-      <w:bookmarkStart w:id="12" w:name="_Toc228125419"/>
+      <w:bookmarkStart w:id="12" w:name="_Toc228141100"/>
       <w:r>
         <w:t xml:space="preserve">¿Por qué </w:t>
       </w:r>
@@ -3078,10 +2252,12 @@
       <w:pPr>
         <w:pStyle w:val="Ttulo3"/>
       </w:pPr>
+      <w:bookmarkStart w:id="13" w:name="_Toc228141101"/>
       <w:r>
         <w:lastRenderedPageBreak/>
         <w:t>Imagen de la jerarquía de generalización de los actores</w:t>
       </w:r>
+      <w:bookmarkEnd w:id="13"/>
     </w:p>
     <w:p>
       <w:r>
@@ -3144,11 +2320,12 @@
       <w:pPr>
         <w:pStyle w:val="Ttulo2"/>
       </w:pPr>
-      <w:bookmarkStart w:id="13" w:name="_Toc228125422"/>
+      <w:bookmarkStart w:id="14" w:name="_Toc228141102"/>
       <w:r>
         <w:lastRenderedPageBreak/>
         <w:t>Diagrama de Casos de Uso</w:t>
       </w:r>
+      <w:bookmarkEnd w:id="14"/>
     </w:p>
     <w:p>
       <w:pPr>
@@ -3163,17 +2340,16 @@
         <w:t>A continuación, se puede observar una imagen del diagrama de casos de uso del sistema:</w:t>
       </w:r>
     </w:p>
-    <w:bookmarkEnd w:id="13"/>
     <w:p>
       <w:r>
         <w:rPr>
           <w:noProof/>
         </w:rPr>
         <w:drawing>
-          <wp:inline distT="0" distB="0" distL="0" distR="0" wp14:anchorId="7186581A" wp14:editId="6DFE21DE">
-            <wp:extent cx="5391150" cy="5177790"/>
-            <wp:effectExtent l="0" t="0" r="0" b="3810"/>
-            <wp:docPr id="9" name="Imagen 9"/>
+          <wp:inline distT="0" distB="0" distL="0" distR="0" wp14:anchorId="75F99F7A" wp14:editId="2CA916A2">
+            <wp:extent cx="5391150" cy="4770755"/>
+            <wp:effectExtent l="0" t="0" r="0" b="0"/>
+            <wp:docPr id="21" name="Imagen 21"/>
             <wp:cNvGraphicFramePr>
               <a:graphicFrameLocks xmlns:a="http://schemas.openxmlformats.org/drawingml/2006/main" noChangeAspect="1"/>
             </wp:cNvGraphicFramePr>
@@ -3181,7 +2357,7 @@
               <a:graphicData uri="http://schemas.openxmlformats.org/drawingml/2006/picture">
                 <pic:pic xmlns:pic="http://schemas.openxmlformats.org/drawingml/2006/picture">
                   <pic:nvPicPr>
-                    <pic:cNvPr id="0" name="Picture 1"/>
+                    <pic:cNvPr id="0" name="Picture 4"/>
                     <pic:cNvPicPr>
                       <a:picLocks noChangeAspect="1" noChangeArrowheads="1"/>
                     </pic:cNvPicPr>
@@ -3202,7 +2378,7 @@
                   <pic:spPr bwMode="auto">
                     <a:xfrm>
                       <a:off x="0" y="0"/>
-                      <a:ext cx="5391150" cy="5177790"/>
+                      <a:ext cx="5391150" cy="4770755"/>
                     </a:xfrm>
                     <a:prstGeom prst="rect">
                       <a:avLst/>
@@ -3236,10 +2412,12 @@
     <w:p/>
     <w:p/>
     <w:p/>
+    <w:p/>
     <w:p>
       <w:pPr>
         <w:pStyle w:val="Ttulo2"/>
       </w:pPr>
+      <w:bookmarkStart w:id="15" w:name="_Toc228141103"/>
       <w:r>
         <w:lastRenderedPageBreak/>
         <w:t xml:space="preserve">Fichas Descriptivas </w:t>
@@ -3250,14 +2428,17 @@
       <w:r>
         <w:t>Casos de Uso</w:t>
       </w:r>
+      <w:bookmarkEnd w:id="15"/>
     </w:p>
     <w:p>
       <w:pPr>
         <w:pStyle w:val="Ttulo3"/>
       </w:pPr>
+      <w:bookmarkStart w:id="16" w:name="_Toc228141104"/>
       <w:r>
         <w:t>Gestión de Asignación y Traslados</w:t>
       </w:r>
+      <w:bookmarkEnd w:id="16"/>
     </w:p>
     <w:tbl>
       <w:tblPr>
@@ -3441,7 +2622,10 @@
               <w:t xml:space="preserve"> en el hospital</w:t>
             </w:r>
             <w:r>
-              <w:t>, que no tengan una unidad asignada aun</w:t>
+              <w:t xml:space="preserve">, que no tengan una unidad asignada </w:t>
+            </w:r>
+            <w:r>
+              <w:t>aún</w:t>
             </w:r>
             <w:r>
               <w:t>.</w:t>
@@ -5035,6 +4219,7 @@
       <w:pPr>
         <w:pStyle w:val="Ttulo3"/>
       </w:pPr>
+      <w:bookmarkStart w:id="17" w:name="_Toc228141105"/>
       <w:r>
         <w:lastRenderedPageBreak/>
         <w:t xml:space="preserve">Seguimiento </w:t>
@@ -5042,6 +4227,7 @@
       <w:r>
         <w:t>Clínico</w:t>
       </w:r>
+      <w:bookmarkEnd w:id="17"/>
     </w:p>
     <w:tbl>
       <w:tblPr>
@@ -5211,7 +4397,10 @@
               <w:spacing w:before="120"/>
             </w:pPr>
             <w:r>
-              <w:t>El actor debe haber seleccionado “Ver información Paciente” en los casos de uso “Asignar Paciente” o “Traslado Paciente”.</w:t>
+              <w:t>Debe haber pacientes ingresados que poder mostrar</w:t>
+            </w:r>
+            <w:r>
+              <w:t>.</w:t>
             </w:r>
           </w:p>
           <w:p/>
@@ -5247,7 +4436,19 @@
               <w:t xml:space="preserve">1.- </w:t>
             </w:r>
             <w:r>
-              <w:t xml:space="preserve">El actor Selecciona “Ver Información del Paciente”. </w:t>
+              <w:t>El actor</w:t>
+            </w:r>
+            <w:r>
+              <w:t xml:space="preserve"> pulsa</w:t>
+            </w:r>
+            <w:r>
+              <w:t xml:space="preserve"> “</w:t>
+            </w:r>
+            <w:r>
+              <w:t>Registrar Ronda Medica Diaria</w:t>
+            </w:r>
+            <w:r>
+              <w:t xml:space="preserve">”. </w:t>
             </w:r>
           </w:p>
           <w:p>
@@ -5258,7 +4459,104 @@
               <w:t>2</w:t>
             </w:r>
             <w:r>
-              <w:t>.- El sistema muestra la información del paciente</w:t>
+              <w:t xml:space="preserve">.- El sistema muestra </w:t>
+            </w:r>
+            <w:r>
+              <w:t xml:space="preserve">una lista de </w:t>
+            </w:r>
+            <w:r>
+              <w:t>la</w:t>
+            </w:r>
+            <w:r>
+              <w:t>s unidades con pacientes ingresados.</w:t>
+            </w:r>
+          </w:p>
+          <w:p>
+            <w:pPr>
+              <w:spacing w:before="120"/>
+            </w:pPr>
+            <w:r>
+              <w:t>3.- El actor selecciona la unidad del paciente que le interesa.</w:t>
+            </w:r>
+          </w:p>
+          <w:p>
+            <w:pPr>
+              <w:spacing w:before="120"/>
+            </w:pPr>
+            <w:r>
+              <w:t>4.- El sistema muestra una lista de los pacientes ingresados de esa unidad,</w:t>
+            </w:r>
+            <w:r>
+              <w:t xml:space="preserve"> </w:t>
+            </w:r>
+            <w:r>
+              <w:t>con el estado de cada paciente</w:t>
+            </w:r>
+            <w:r>
+              <w:t xml:space="preserve"> y si ya se registró una observación ese día en cada paciente</w:t>
+            </w:r>
+            <w:r>
+              <w:t>.</w:t>
+            </w:r>
+          </w:p>
+          <w:p>
+            <w:pPr>
+              <w:spacing w:before="120"/>
+            </w:pPr>
+            <w:r>
+              <w:t>5.- El actor selecciona un paciente.</w:t>
+            </w:r>
+          </w:p>
+          <w:p>
+            <w:pPr>
+              <w:spacing w:before="120"/>
+            </w:pPr>
+            <w:r>
+              <w:t>6.- El actor ingresa la observación de la ronda medica diaria que realizo en la vida real.</w:t>
+            </w:r>
+          </w:p>
+          <w:p>
+            <w:pPr>
+              <w:spacing w:before="120"/>
+            </w:pPr>
+            <w:r>
+              <w:t>7.- El sistema pregunta si el paciente ya se considera apto para la evaluación final.</w:t>
+            </w:r>
+          </w:p>
+          <w:p>
+            <w:pPr>
+              <w:spacing w:before="120"/>
+            </w:pPr>
+            <w:r>
+              <w:t>8.- El actor responde “si” o “no”.</w:t>
+            </w:r>
+          </w:p>
+          <w:p>
+            <w:pPr>
+              <w:spacing w:before="120"/>
+            </w:pPr>
+            <w:r>
+              <w:t>9</w:t>
+            </w:r>
+            <w:r>
+              <w:t>.- El sistema pregunta al actor si quiere actualizar los tratamientos</w:t>
+            </w:r>
+            <w:r>
+              <w:t xml:space="preserve"> (Caso de Uso “Actualizar Tratamientos del Paciente”).</w:t>
+            </w:r>
+          </w:p>
+          <w:p>
+            <w:pPr>
+              <w:spacing w:before="120"/>
+            </w:pPr>
+            <w:r>
+              <w:t>10</w:t>
+            </w:r>
+            <w:r>
+              <w:t xml:space="preserve">.- </w:t>
+            </w:r>
+            <w:r>
+              <w:t>El sistema registra la ronda medica diaria.</w:t>
             </w:r>
           </w:p>
           <w:p>
@@ -5293,6 +4591,17 @@
           <w:p>
             <w:pPr>
               <w:spacing w:before="120"/>
+            </w:pPr>
+            <w:r>
+              <w:t>1</w:t>
+            </w:r>
+            <w:r>
+              <w:t>.A.- Si no hay ninguna unidad con pacientes ingresados, se avisara de ello.</w:t>
+            </w:r>
+          </w:p>
+          <w:p>
+            <w:pPr>
+              <w:spacing w:before="120"/>
               <w:rPr>
                 <w:b/>
                 <w:bCs/>
@@ -5322,6 +4631,43 @@
               </w:rPr>
               <w:t>Postcondiciones:</w:t>
             </w:r>
+            <w:r>
+              <w:t xml:space="preserve"> </w:t>
+            </w:r>
+          </w:p>
+          <w:p>
+            <w:pPr>
+              <w:spacing w:before="120"/>
+            </w:pPr>
+            <w:r>
+              <w:t>El sistema guarda la observación</w:t>
+            </w:r>
+            <w:r>
+              <w:t xml:space="preserve"> </w:t>
+            </w:r>
+            <w:r>
+              <w:t>de la ronda medica diaria en el sistema.</w:t>
+            </w:r>
+          </w:p>
+          <w:p>
+            <w:pPr>
+              <w:spacing w:before="120"/>
+            </w:pPr>
+            <w:r>
+              <w:t>El sistema guarda información de cada ronda medica diaria registrada, como la fecha, el paciente al que se lo hicieron</w:t>
+            </w:r>
+            <w:r>
+              <w:t xml:space="preserve">, </w:t>
+            </w:r>
+            <w:r>
+              <w:t>el personal que lo realizo</w:t>
+            </w:r>
+            <w:r>
+              <w:t xml:space="preserve"> y si en esa ronda médica el paciente ya se considera apto para la evaluación final</w:t>
+            </w:r>
+            <w:r>
+              <w:t>.</w:t>
+            </w:r>
           </w:p>
           <w:p>
             <w:pPr>
@@ -5336,8 +4682,2215 @@
       </w:tr>
     </w:tbl>
     <w:p/>
+    <w:p/>
+    <w:tbl>
+      <w:tblPr>
+        <w:tblStyle w:val="Tablaconcuadrcula"/>
+        <w:tblW w:w="0" w:type="auto"/>
+        <w:tblLook w:val="04A0" w:firstRow="1" w:lastRow="0" w:firstColumn="1" w:lastColumn="0" w:noHBand="0" w:noVBand="1"/>
+      </w:tblPr>
+      <w:tblGrid>
+        <w:gridCol w:w="1980"/>
+        <w:gridCol w:w="6514"/>
+      </w:tblGrid>
+      <w:tr>
+        <w:tc>
+          <w:tcPr>
+            <w:tcW w:w="1980" w:type="dxa"/>
+          </w:tcPr>
+          <w:p>
+            <w:pPr>
+              <w:spacing w:before="120" w:after="120"/>
+              <w:rPr>
+                <w:b/>
+                <w:bCs/>
+              </w:rPr>
+            </w:pPr>
+            <w:r>
+              <w:rPr>
+                <w:b/>
+                <w:bCs/>
+              </w:rPr>
+              <w:lastRenderedPageBreak/>
+              <w:t>Nombre</w:t>
+            </w:r>
+            <w:r>
+              <w:rPr>
+                <w:b/>
+                <w:bCs/>
+              </w:rPr>
+              <w:t>:</w:t>
+            </w:r>
+          </w:p>
+        </w:tc>
+        <w:tc>
+          <w:tcPr>
+            <w:tcW w:w="6514" w:type="dxa"/>
+          </w:tcPr>
+          <w:p>
+            <w:pPr>
+              <w:spacing w:before="120"/>
+            </w:pPr>
+            <w:r>
+              <w:t>Actualizar Tratamientos del Paciente</w:t>
+            </w:r>
+          </w:p>
+        </w:tc>
+      </w:tr>
+      <w:tr>
+        <w:tc>
+          <w:tcPr>
+            <w:tcW w:w="1980" w:type="dxa"/>
+          </w:tcPr>
+          <w:p>
+            <w:pPr>
+              <w:spacing w:before="120" w:after="120"/>
+              <w:rPr>
+                <w:b/>
+                <w:bCs/>
+              </w:rPr>
+            </w:pPr>
+            <w:r>
+              <w:rPr>
+                <w:b/>
+                <w:bCs/>
+              </w:rPr>
+              <w:t>Actor o Actores</w:t>
+            </w:r>
+            <w:r>
+              <w:rPr>
+                <w:b/>
+                <w:bCs/>
+              </w:rPr>
+              <w:t>:</w:t>
+            </w:r>
+          </w:p>
+        </w:tc>
+        <w:tc>
+          <w:tcPr>
+            <w:tcW w:w="6514" w:type="dxa"/>
+          </w:tcPr>
+          <w:p>
+            <w:pPr>
+              <w:spacing w:before="120"/>
+            </w:pPr>
+            <w:r>
+              <w:t>Personal De Salud</w:t>
+            </w:r>
+          </w:p>
+        </w:tc>
+      </w:tr>
+      <w:tr>
+        <w:tc>
+          <w:tcPr>
+            <w:tcW w:w="8494" w:type="dxa"/>
+            <w:gridSpan w:val="2"/>
+          </w:tcPr>
+          <w:p>
+            <w:pPr>
+              <w:spacing w:before="120"/>
+              <w:rPr>
+                <w:b/>
+                <w:bCs/>
+              </w:rPr>
+            </w:pPr>
+            <w:r>
+              <w:rPr>
+                <w:b/>
+                <w:bCs/>
+              </w:rPr>
+              <w:t>Descripción:</w:t>
+            </w:r>
+          </w:p>
+          <w:p>
+            <w:pPr>
+              <w:spacing w:before="120"/>
+            </w:pPr>
+            <w:r>
+              <w:t xml:space="preserve">El actor podrá </w:t>
+            </w:r>
+            <w:r>
+              <w:t>registrar el cambio de los tratamientos que se le deben suministrar a un paciente</w:t>
+            </w:r>
+            <w:r>
+              <w:t xml:space="preserve"> al registrar una ronda medica diaria</w:t>
+            </w:r>
+            <w:r>
+              <w:t>.</w:t>
+            </w:r>
+          </w:p>
+          <w:p/>
+        </w:tc>
+      </w:tr>
+      <w:tr>
+        <w:tc>
+          <w:tcPr>
+            <w:tcW w:w="8494" w:type="dxa"/>
+            <w:gridSpan w:val="2"/>
+          </w:tcPr>
+          <w:p>
+            <w:pPr>
+              <w:spacing w:before="120"/>
+              <w:rPr>
+                <w:b/>
+                <w:bCs/>
+              </w:rPr>
+            </w:pPr>
+            <w:r>
+              <w:rPr>
+                <w:b/>
+                <w:bCs/>
+              </w:rPr>
+              <w:t>Precondiciones:</w:t>
+            </w:r>
+          </w:p>
+          <w:p>
+            <w:pPr>
+              <w:spacing w:before="120"/>
+            </w:pPr>
+            <w:r>
+              <w:t>Se debe haber hecho antes, el caso de uso de “Registrar Ronda Medica Diaria de Paciente”</w:t>
+            </w:r>
+            <w:r>
+              <w:t>.</w:t>
+            </w:r>
+          </w:p>
+          <w:p/>
+        </w:tc>
+      </w:tr>
+      <w:tr>
+        <w:tc>
+          <w:tcPr>
+            <w:tcW w:w="8494" w:type="dxa"/>
+            <w:gridSpan w:val="2"/>
+          </w:tcPr>
+          <w:p>
+            <w:pPr>
+              <w:spacing w:before="120"/>
+              <w:rPr>
+                <w:b/>
+                <w:bCs/>
+              </w:rPr>
+            </w:pPr>
+            <w:r>
+              <w:rPr>
+                <w:b/>
+                <w:bCs/>
+              </w:rPr>
+              <w:t>Flujo Principal:</w:t>
+            </w:r>
+          </w:p>
+          <w:p>
+            <w:pPr>
+              <w:spacing w:before="120"/>
+            </w:pPr>
+            <w:r>
+              <w:t xml:space="preserve">1.- </w:t>
+            </w:r>
+            <w:r>
+              <w:t>El sistema pregunta al actor si quiere actualizar los tratamie</w:t>
+            </w:r>
+            <w:r>
+              <w:t>ntos</w:t>
+            </w:r>
+            <w:r>
+              <w:t>.</w:t>
+            </w:r>
+          </w:p>
+          <w:p>
+            <w:pPr>
+              <w:spacing w:before="120"/>
+            </w:pPr>
+            <w:r>
+              <w:t>2.- El actor acepta.</w:t>
+            </w:r>
+          </w:p>
+          <w:p>
+            <w:pPr>
+              <w:spacing w:before="120"/>
+            </w:pPr>
+            <w:r>
+              <w:t>3.- El sistema pregunta cuantos tratamientos quiere establecer al paciente.</w:t>
+            </w:r>
+          </w:p>
+          <w:p>
+            <w:pPr>
+              <w:spacing w:before="120"/>
+            </w:pPr>
+            <w:r>
+              <w:t>4.- El actor escribe el número de tratamientos quiere establecer al paciente.</w:t>
+            </w:r>
+          </w:p>
+          <w:p>
+            <w:pPr>
+              <w:spacing w:before="120"/>
+            </w:pPr>
+            <w:r>
+              <w:t>5.- El sistema muestra una lista de tratamientos.</w:t>
+            </w:r>
+          </w:p>
+          <w:p>
+            <w:pPr>
+              <w:spacing w:before="120"/>
+            </w:pPr>
+            <w:r>
+              <w:t>6.- El actor elige los tratamientos.</w:t>
+            </w:r>
+          </w:p>
+          <w:p>
+            <w:pPr>
+              <w:spacing w:before="120"/>
+            </w:pPr>
+          </w:p>
+        </w:tc>
+      </w:tr>
+      <w:tr>
+        <w:tc>
+          <w:tcPr>
+            <w:tcW w:w="8494" w:type="dxa"/>
+            <w:gridSpan w:val="2"/>
+          </w:tcPr>
+          <w:p>
+            <w:pPr>
+              <w:spacing w:before="120"/>
+              <w:rPr>
+                <w:b/>
+                <w:bCs/>
+              </w:rPr>
+            </w:pPr>
+            <w:r>
+              <w:rPr>
+                <w:b/>
+                <w:bCs/>
+              </w:rPr>
+              <w:t>Flujos Alternativos:</w:t>
+            </w:r>
+          </w:p>
+          <w:p>
+            <w:pPr>
+              <w:spacing w:before="120"/>
+              <w:rPr>
+                <w:b/>
+                <w:bCs/>
+              </w:rPr>
+            </w:pPr>
+          </w:p>
+        </w:tc>
+      </w:tr>
+      <w:tr>
+        <w:tc>
+          <w:tcPr>
+            <w:tcW w:w="8494" w:type="dxa"/>
+            <w:gridSpan w:val="2"/>
+          </w:tcPr>
+          <w:p>
+            <w:pPr>
+              <w:spacing w:before="120"/>
+              <w:rPr>
+                <w:b/>
+                <w:bCs/>
+              </w:rPr>
+            </w:pPr>
+            <w:r>
+              <w:rPr>
+                <w:b/>
+                <w:bCs/>
+              </w:rPr>
+              <w:t>Postcondiciones:</w:t>
+            </w:r>
+          </w:p>
+          <w:p>
+            <w:pPr>
+              <w:spacing w:before="120"/>
+            </w:pPr>
+            <w:r>
+              <w:t xml:space="preserve">El sistema </w:t>
+            </w:r>
+            <w:r>
+              <w:t>registra internamente el cambio de tratamientos al paciente especificado</w:t>
+            </w:r>
+            <w:r>
+              <w:t>.</w:t>
+            </w:r>
+          </w:p>
+          <w:p>
+            <w:pPr>
+              <w:spacing w:before="120"/>
+              <w:rPr>
+                <w:b/>
+                <w:bCs/>
+              </w:rPr>
+            </w:pPr>
+          </w:p>
+        </w:tc>
+      </w:tr>
+    </w:tbl>
+    <w:p/>
+    <w:p/>
+    <w:p/>
+    <w:p/>
+    <w:p/>
+    <w:p/>
+    <w:p/>
+    <w:p/>
+    <w:p/>
+    <w:p/>
+    <w:p/>
+    <w:p>
+      <w:pPr>
+        <w:pStyle w:val="Ttulo3"/>
+      </w:pPr>
+      <w:bookmarkStart w:id="18" w:name="_Toc228141106"/>
+      <w:r>
+        <w:lastRenderedPageBreak/>
+        <w:t>Gestión de Altas</w:t>
+      </w:r>
+      <w:bookmarkEnd w:id="18"/>
+    </w:p>
+    <w:tbl>
+      <w:tblPr>
+        <w:tblStyle w:val="Tablaconcuadrcula"/>
+        <w:tblW w:w="0" w:type="auto"/>
+        <w:tblLook w:val="04A0" w:firstRow="1" w:lastRow="0" w:firstColumn="1" w:lastColumn="0" w:noHBand="0" w:noVBand="1"/>
+      </w:tblPr>
+      <w:tblGrid>
+        <w:gridCol w:w="1980"/>
+        <w:gridCol w:w="6514"/>
+      </w:tblGrid>
+      <w:tr>
+        <w:tc>
+          <w:tcPr>
+            <w:tcW w:w="1980" w:type="dxa"/>
+          </w:tcPr>
+          <w:p>
+            <w:pPr>
+              <w:spacing w:before="120" w:after="120"/>
+              <w:rPr>
+                <w:b/>
+                <w:bCs/>
+              </w:rPr>
+            </w:pPr>
+            <w:r>
+              <w:rPr>
+                <w:b/>
+                <w:bCs/>
+              </w:rPr>
+              <w:t>Nombre</w:t>
+            </w:r>
+            <w:r>
+              <w:rPr>
+                <w:b/>
+                <w:bCs/>
+              </w:rPr>
+              <w:t>:</w:t>
+            </w:r>
+          </w:p>
+        </w:tc>
+        <w:tc>
+          <w:tcPr>
+            <w:tcW w:w="6514" w:type="dxa"/>
+          </w:tcPr>
+          <w:p>
+            <w:pPr>
+              <w:spacing w:before="120"/>
+            </w:pPr>
+            <w:r>
+              <w:t>Confirmar Evaluación Final</w:t>
+            </w:r>
+          </w:p>
+        </w:tc>
+      </w:tr>
+      <w:tr>
+        <w:tc>
+          <w:tcPr>
+            <w:tcW w:w="1980" w:type="dxa"/>
+          </w:tcPr>
+          <w:p>
+            <w:pPr>
+              <w:spacing w:before="120" w:after="120"/>
+              <w:rPr>
+                <w:b/>
+                <w:bCs/>
+              </w:rPr>
+            </w:pPr>
+            <w:r>
+              <w:rPr>
+                <w:b/>
+                <w:bCs/>
+              </w:rPr>
+              <w:t>Actor o Actores</w:t>
+            </w:r>
+            <w:r>
+              <w:rPr>
+                <w:b/>
+                <w:bCs/>
+              </w:rPr>
+              <w:t>:</w:t>
+            </w:r>
+          </w:p>
+        </w:tc>
+        <w:tc>
+          <w:tcPr>
+            <w:tcW w:w="6514" w:type="dxa"/>
+          </w:tcPr>
+          <w:p>
+            <w:pPr>
+              <w:spacing w:before="120"/>
+            </w:pPr>
+            <w:r>
+              <w:t>Medico</w:t>
+            </w:r>
+          </w:p>
+        </w:tc>
+      </w:tr>
+      <w:tr>
+        <w:tc>
+          <w:tcPr>
+            <w:tcW w:w="8494" w:type="dxa"/>
+            <w:gridSpan w:val="2"/>
+          </w:tcPr>
+          <w:p>
+            <w:pPr>
+              <w:spacing w:before="120"/>
+              <w:rPr>
+                <w:b/>
+                <w:bCs/>
+              </w:rPr>
+            </w:pPr>
+            <w:r>
+              <w:rPr>
+                <w:b/>
+                <w:bCs/>
+              </w:rPr>
+              <w:t>Descripción:</w:t>
+            </w:r>
+          </w:p>
+          <w:p>
+            <w:pPr>
+              <w:spacing w:before="120"/>
+            </w:pPr>
+            <w:r>
+              <w:t xml:space="preserve">El actor podrá </w:t>
+            </w:r>
+            <w:r>
+              <w:t>confirmar la evaluación final de un paciente especificado.</w:t>
+            </w:r>
+          </w:p>
+          <w:p/>
+        </w:tc>
+      </w:tr>
+      <w:tr>
+        <w:tc>
+          <w:tcPr>
+            <w:tcW w:w="8494" w:type="dxa"/>
+            <w:gridSpan w:val="2"/>
+          </w:tcPr>
+          <w:p>
+            <w:pPr>
+              <w:spacing w:before="120"/>
+              <w:rPr>
+                <w:b/>
+                <w:bCs/>
+              </w:rPr>
+            </w:pPr>
+            <w:r>
+              <w:rPr>
+                <w:b/>
+                <w:bCs/>
+              </w:rPr>
+              <w:t>Precondiciones:</w:t>
+            </w:r>
+          </w:p>
+          <w:p>
+            <w:pPr>
+              <w:spacing w:before="120"/>
+            </w:pPr>
+            <w:r>
+              <w:t>Debe haber pacientes donde su última ronda médica registrada marquen que están listos para confirmar la evaluación final.</w:t>
+            </w:r>
+          </w:p>
+          <w:p/>
+        </w:tc>
+      </w:tr>
+      <w:tr>
+        <w:tc>
+          <w:tcPr>
+            <w:tcW w:w="8494" w:type="dxa"/>
+            <w:gridSpan w:val="2"/>
+          </w:tcPr>
+          <w:p>
+            <w:pPr>
+              <w:spacing w:before="120"/>
+              <w:rPr>
+                <w:b/>
+                <w:bCs/>
+              </w:rPr>
+            </w:pPr>
+            <w:r>
+              <w:rPr>
+                <w:b/>
+                <w:bCs/>
+              </w:rPr>
+              <w:t>Flujo Principal:</w:t>
+            </w:r>
+          </w:p>
+          <w:p>
+            <w:pPr>
+              <w:spacing w:before="120"/>
+            </w:pPr>
+            <w:r>
+              <w:t>1.- El actor pulsa “Confirmar Evaluación Final”.</w:t>
+            </w:r>
+          </w:p>
+          <w:p>
+            <w:pPr>
+              <w:spacing w:before="120"/>
+            </w:pPr>
+            <w:r>
+              <w:t>2</w:t>
+            </w:r>
+            <w:r>
+              <w:t xml:space="preserve">.- El sistema </w:t>
+            </w:r>
+            <w:r>
+              <w:t>muestra una lista de los pacientes, cuya ultima ronda medica registrada marquen que están listos para que le confirmen la evaluación final.</w:t>
+            </w:r>
+          </w:p>
+          <w:p>
+            <w:pPr>
+              <w:spacing w:before="120"/>
+            </w:pPr>
+            <w:r>
+              <w:t>3</w:t>
+            </w:r>
+            <w:r>
+              <w:t>.- El actor selecciona al paciente.</w:t>
+            </w:r>
+          </w:p>
+          <w:p>
+            <w:pPr>
+              <w:spacing w:before="120"/>
+            </w:pPr>
+            <w:r>
+              <w:t>4</w:t>
+            </w:r>
+            <w:r>
+              <w:t>.- El sistema pide confirmación.</w:t>
+            </w:r>
+          </w:p>
+          <w:p>
+            <w:pPr>
+              <w:spacing w:before="120"/>
+            </w:pPr>
+            <w:r>
+              <w:t>5</w:t>
+            </w:r>
+            <w:r>
+              <w:t>.- El actor confirma</w:t>
+            </w:r>
+            <w:r>
+              <w:t xml:space="preserve"> la evaluación final</w:t>
+            </w:r>
+            <w:r>
+              <w:t>.</w:t>
+            </w:r>
+          </w:p>
+          <w:p>
+            <w:pPr>
+              <w:spacing w:before="120"/>
+            </w:pPr>
+          </w:p>
+        </w:tc>
+      </w:tr>
+      <w:tr>
+        <w:tc>
+          <w:tcPr>
+            <w:tcW w:w="8494" w:type="dxa"/>
+            <w:gridSpan w:val="2"/>
+          </w:tcPr>
+          <w:p>
+            <w:pPr>
+              <w:spacing w:before="120"/>
+              <w:rPr>
+                <w:b/>
+                <w:bCs/>
+              </w:rPr>
+            </w:pPr>
+            <w:r>
+              <w:rPr>
+                <w:b/>
+                <w:bCs/>
+              </w:rPr>
+              <w:t>Flujos Alternativos:</w:t>
+            </w:r>
+          </w:p>
+          <w:p>
+            <w:pPr>
+              <w:spacing w:before="120"/>
+            </w:pPr>
+            <w:r>
+              <w:t xml:space="preserve">1.A.- Si no hay pacientes donde </w:t>
+            </w:r>
+            <w:r>
+              <w:t>su última ronda médica registrada marquen que están listos para confirmar la evaluación final</w:t>
+            </w:r>
+            <w:r>
+              <w:t>, se le avisara.</w:t>
+            </w:r>
+          </w:p>
+          <w:p>
+            <w:pPr>
+              <w:spacing w:before="120"/>
+              <w:rPr>
+                <w:b/>
+                <w:bCs/>
+              </w:rPr>
+            </w:pPr>
+          </w:p>
+        </w:tc>
+      </w:tr>
+      <w:tr>
+        <w:tc>
+          <w:tcPr>
+            <w:tcW w:w="8494" w:type="dxa"/>
+            <w:gridSpan w:val="2"/>
+          </w:tcPr>
+          <w:p>
+            <w:pPr>
+              <w:spacing w:before="120"/>
+              <w:rPr>
+                <w:b/>
+                <w:bCs/>
+              </w:rPr>
+            </w:pPr>
+            <w:r>
+              <w:rPr>
+                <w:b/>
+                <w:bCs/>
+              </w:rPr>
+              <w:t>Postcondiciones:</w:t>
+            </w:r>
+          </w:p>
+          <w:p>
+            <w:pPr>
+              <w:spacing w:before="120"/>
+            </w:pPr>
+            <w:r>
+              <w:t>Una vez confirmada la evaluación final, e</w:t>
+            </w:r>
+            <w:r>
+              <w:t>l sistema registr</w:t>
+            </w:r>
+            <w:r>
+              <w:t>a en el expediente del paciente el alta</w:t>
+            </w:r>
+            <w:r>
+              <w:t xml:space="preserve"> por recuperación</w:t>
+            </w:r>
+            <w:r>
+              <w:t>, con información como la fecha del alta, etc</w:t>
+            </w:r>
+            <w:r>
+              <w:t>.</w:t>
+            </w:r>
+          </w:p>
+          <w:p>
+            <w:pPr>
+              <w:spacing w:before="120"/>
+              <w:rPr>
+                <w:b/>
+                <w:bCs/>
+              </w:rPr>
+            </w:pPr>
+          </w:p>
+        </w:tc>
+      </w:tr>
+    </w:tbl>
+    <w:p/>
+    <w:p/>
+    <w:p/>
+    <w:p/>
+    <w:p/>
+    <w:p/>
+    <w:p/>
+    <w:p/>
+    <w:tbl>
+      <w:tblPr>
+        <w:tblStyle w:val="Tablaconcuadrcula"/>
+        <w:tblW w:w="0" w:type="auto"/>
+        <w:tblLook w:val="04A0" w:firstRow="1" w:lastRow="0" w:firstColumn="1" w:lastColumn="0" w:noHBand="0" w:noVBand="1"/>
+      </w:tblPr>
+      <w:tblGrid>
+        <w:gridCol w:w="1980"/>
+        <w:gridCol w:w="6514"/>
+      </w:tblGrid>
+      <w:tr>
+        <w:tc>
+          <w:tcPr>
+            <w:tcW w:w="1980" w:type="dxa"/>
+          </w:tcPr>
+          <w:p>
+            <w:pPr>
+              <w:spacing w:before="120" w:after="120"/>
+              <w:rPr>
+                <w:b/>
+                <w:bCs/>
+              </w:rPr>
+            </w:pPr>
+            <w:r>
+              <w:rPr>
+                <w:b/>
+                <w:bCs/>
+              </w:rPr>
+              <w:lastRenderedPageBreak/>
+              <w:t>Nombre</w:t>
+            </w:r>
+            <w:r>
+              <w:rPr>
+                <w:b/>
+                <w:bCs/>
+              </w:rPr>
+              <w:t>:</w:t>
+            </w:r>
+          </w:p>
+        </w:tc>
+        <w:tc>
+          <w:tcPr>
+            <w:tcW w:w="6514" w:type="dxa"/>
+          </w:tcPr>
+          <w:p>
+            <w:pPr>
+              <w:spacing w:before="120"/>
+            </w:pPr>
+            <w:r>
+              <w:t>Documentar Alta</w:t>
+            </w:r>
+          </w:p>
+        </w:tc>
+      </w:tr>
+      <w:tr>
+        <w:tc>
+          <w:tcPr>
+            <w:tcW w:w="1980" w:type="dxa"/>
+          </w:tcPr>
+          <w:p>
+            <w:pPr>
+              <w:spacing w:before="120" w:after="120"/>
+              <w:rPr>
+                <w:b/>
+                <w:bCs/>
+              </w:rPr>
+            </w:pPr>
+            <w:r>
+              <w:rPr>
+                <w:b/>
+                <w:bCs/>
+              </w:rPr>
+              <w:t>Actor o Actores</w:t>
+            </w:r>
+            <w:r>
+              <w:rPr>
+                <w:b/>
+                <w:bCs/>
+              </w:rPr>
+              <w:t>:</w:t>
+            </w:r>
+          </w:p>
+        </w:tc>
+        <w:tc>
+          <w:tcPr>
+            <w:tcW w:w="6514" w:type="dxa"/>
+          </w:tcPr>
+          <w:p>
+            <w:pPr>
+              <w:spacing w:before="120"/>
+            </w:pPr>
+            <w:r>
+              <w:t>Medico</w:t>
+            </w:r>
+          </w:p>
+        </w:tc>
+      </w:tr>
+      <w:tr>
+        <w:tc>
+          <w:tcPr>
+            <w:tcW w:w="8494" w:type="dxa"/>
+            <w:gridSpan w:val="2"/>
+          </w:tcPr>
+          <w:p>
+            <w:pPr>
+              <w:spacing w:before="120"/>
+              <w:rPr>
+                <w:b/>
+                <w:bCs/>
+              </w:rPr>
+            </w:pPr>
+            <w:r>
+              <w:rPr>
+                <w:b/>
+                <w:bCs/>
+              </w:rPr>
+              <w:t>Descripción:</w:t>
+            </w:r>
+          </w:p>
+          <w:p>
+            <w:pPr>
+              <w:spacing w:before="120"/>
+            </w:pPr>
+            <w:r>
+              <w:t xml:space="preserve">El actor </w:t>
+            </w:r>
+            <w:r>
+              <w:t>documentar las altas de los pacientes que fueron dados de alta.</w:t>
+            </w:r>
+          </w:p>
+          <w:p/>
+        </w:tc>
+      </w:tr>
+      <w:tr>
+        <w:tc>
+          <w:tcPr>
+            <w:tcW w:w="8494" w:type="dxa"/>
+            <w:gridSpan w:val="2"/>
+          </w:tcPr>
+          <w:p>
+            <w:pPr>
+              <w:spacing w:before="120"/>
+              <w:rPr>
+                <w:b/>
+                <w:bCs/>
+              </w:rPr>
+            </w:pPr>
+            <w:r>
+              <w:rPr>
+                <w:b/>
+                <w:bCs/>
+              </w:rPr>
+              <w:t>Precondiciones:</w:t>
+            </w:r>
+          </w:p>
+          <w:p>
+            <w:pPr>
+              <w:spacing w:before="120"/>
+            </w:pPr>
+            <w:r>
+              <w:t xml:space="preserve">Debe </w:t>
+            </w:r>
+            <w:r>
+              <w:t>haber pacientes que hayan sido dados de alta por recuperación o traslado</w:t>
+            </w:r>
+            <w:r>
+              <w:t xml:space="preserve"> en algún ingreso.</w:t>
+            </w:r>
+          </w:p>
+          <w:p/>
+        </w:tc>
+      </w:tr>
+      <w:tr>
+        <w:tc>
+          <w:tcPr>
+            <w:tcW w:w="8494" w:type="dxa"/>
+            <w:gridSpan w:val="2"/>
+          </w:tcPr>
+          <w:p>
+            <w:pPr>
+              <w:spacing w:before="120"/>
+              <w:rPr>
+                <w:b/>
+                <w:bCs/>
+              </w:rPr>
+            </w:pPr>
+            <w:r>
+              <w:rPr>
+                <w:b/>
+                <w:bCs/>
+              </w:rPr>
+              <w:t>Flujo Principal:</w:t>
+            </w:r>
+          </w:p>
+          <w:p>
+            <w:pPr>
+              <w:spacing w:before="120"/>
+            </w:pPr>
+            <w:r>
+              <w:t>1.- El actor pulsa “Documentar Alta”.</w:t>
+            </w:r>
+          </w:p>
+          <w:p>
+            <w:pPr>
+              <w:spacing w:before="120"/>
+            </w:pPr>
+            <w:r>
+              <w:t>2</w:t>
+            </w:r>
+            <w:r>
+              <w:t>.- El sistema muestra una lista de los pacientes</w:t>
+            </w:r>
+            <w:r>
+              <w:t xml:space="preserve"> que falta por documentar sus altas</w:t>
+            </w:r>
+            <w:r>
+              <w:t>.</w:t>
+            </w:r>
+          </w:p>
+          <w:p>
+            <w:pPr>
+              <w:spacing w:before="120"/>
+            </w:pPr>
+            <w:r>
+              <w:t>3</w:t>
+            </w:r>
+            <w:r>
+              <w:t>.- El actor selecciona al paciente.</w:t>
+            </w:r>
+          </w:p>
+          <w:p>
+            <w:pPr>
+              <w:spacing w:before="120"/>
+            </w:pPr>
+            <w:r>
+              <w:t>4</w:t>
+            </w:r>
+            <w:r>
+              <w:t>.- El s</w:t>
+            </w:r>
+            <w:r>
+              <w:t>istema muestra una lista con las altas de cada ingreso del paciente que faltan por documentar, junto con información para diferenciarlas, como la fecha</w:t>
+            </w:r>
+            <w:r>
+              <w:t>.</w:t>
+            </w:r>
+          </w:p>
+          <w:p>
+            <w:pPr>
+              <w:spacing w:before="120"/>
+            </w:pPr>
+            <w:r>
+              <w:t>5</w:t>
+            </w:r>
+            <w:r>
+              <w:t>.- El</w:t>
+            </w:r>
+            <w:r>
+              <w:t xml:space="preserve"> actor selecciona el alta a documentar</w:t>
+            </w:r>
+            <w:r>
+              <w:t>.</w:t>
+            </w:r>
+          </w:p>
+          <w:p>
+            <w:pPr>
+              <w:spacing w:before="120"/>
+            </w:pPr>
+            <w:r>
+              <w:t>6.- El sistema le pide que escriba la documentación.</w:t>
+            </w:r>
+          </w:p>
+          <w:p>
+            <w:pPr>
+              <w:spacing w:before="120"/>
+            </w:pPr>
+            <w:r>
+              <w:t>7.- El actor escribe la documentación.</w:t>
+            </w:r>
+          </w:p>
+          <w:p>
+            <w:pPr>
+              <w:spacing w:before="120"/>
+            </w:pPr>
+            <w:r>
+              <w:t>8.- El sistema registra la documentación.</w:t>
+            </w:r>
+          </w:p>
+          <w:p>
+            <w:pPr>
+              <w:spacing w:before="120"/>
+            </w:pPr>
+          </w:p>
+        </w:tc>
+      </w:tr>
+      <w:tr>
+        <w:tc>
+          <w:tcPr>
+            <w:tcW w:w="8494" w:type="dxa"/>
+            <w:gridSpan w:val="2"/>
+          </w:tcPr>
+          <w:p>
+            <w:pPr>
+              <w:spacing w:before="120"/>
+              <w:rPr>
+                <w:b/>
+                <w:bCs/>
+              </w:rPr>
+            </w:pPr>
+            <w:r>
+              <w:rPr>
+                <w:b/>
+                <w:bCs/>
+              </w:rPr>
+              <w:t>Flujos Alternativos:</w:t>
+            </w:r>
+          </w:p>
+          <w:p>
+            <w:pPr>
+              <w:spacing w:before="120"/>
+            </w:pPr>
+            <w:r>
+              <w:t xml:space="preserve">1.A.- Si no hay </w:t>
+            </w:r>
+            <w:r>
+              <w:t>ningún paciente al que documentarle las altas, se le avisara al actor</w:t>
+            </w:r>
+            <w:r>
+              <w:t>.</w:t>
+            </w:r>
+          </w:p>
+          <w:p>
+            <w:pPr>
+              <w:spacing w:before="120"/>
+              <w:rPr>
+                <w:b/>
+                <w:bCs/>
+              </w:rPr>
+            </w:pPr>
+          </w:p>
+        </w:tc>
+      </w:tr>
+      <w:tr>
+        <w:tc>
+          <w:tcPr>
+            <w:tcW w:w="8494" w:type="dxa"/>
+            <w:gridSpan w:val="2"/>
+          </w:tcPr>
+          <w:p>
+            <w:pPr>
+              <w:spacing w:before="120"/>
+              <w:rPr>
+                <w:b/>
+                <w:bCs/>
+              </w:rPr>
+            </w:pPr>
+            <w:r>
+              <w:rPr>
+                <w:b/>
+                <w:bCs/>
+              </w:rPr>
+              <w:t>Postcondiciones:</w:t>
+            </w:r>
+          </w:p>
+          <w:p>
+            <w:pPr>
+              <w:spacing w:before="120"/>
+            </w:pPr>
+            <w:r>
+              <w:t>El sistema registra en el alta del paciente, la documentación que el actor introdujo.</w:t>
+            </w:r>
+          </w:p>
+          <w:p>
+            <w:pPr>
+              <w:spacing w:before="120"/>
+              <w:rPr>
+                <w:b/>
+                <w:bCs/>
+              </w:rPr>
+            </w:pPr>
+          </w:p>
+        </w:tc>
+      </w:tr>
+    </w:tbl>
+    <w:p>
+      <w:r>
+        <w:br/>
+      </w:r>
+    </w:p>
+    <w:p/>
+    <w:p/>
+    <w:p/>
+    <w:p/>
+    <w:p/>
+    <w:p/>
+    <w:p>
+      <w:pPr>
+        <w:pStyle w:val="Ttulo3"/>
+      </w:pPr>
+      <w:r>
+        <w:lastRenderedPageBreak/>
+        <w:t>Otros casos de uso</w:t>
+      </w:r>
+    </w:p>
+    <w:tbl>
+      <w:tblPr>
+        <w:tblStyle w:val="Tablaconcuadrcula"/>
+        <w:tblW w:w="0" w:type="auto"/>
+        <w:tblLook w:val="04A0" w:firstRow="1" w:lastRow="0" w:firstColumn="1" w:lastColumn="0" w:noHBand="0" w:noVBand="1"/>
+      </w:tblPr>
+      <w:tblGrid>
+        <w:gridCol w:w="1980"/>
+        <w:gridCol w:w="6514"/>
+      </w:tblGrid>
+      <w:tr>
+        <w:tc>
+          <w:tcPr>
+            <w:tcW w:w="1980" w:type="dxa"/>
+          </w:tcPr>
+          <w:p>
+            <w:pPr>
+              <w:spacing w:before="120" w:after="120"/>
+              <w:rPr>
+                <w:b/>
+                <w:bCs/>
+              </w:rPr>
+            </w:pPr>
+            <w:r>
+              <w:rPr>
+                <w:b/>
+                <w:bCs/>
+              </w:rPr>
+              <w:t>Nombre</w:t>
+            </w:r>
+            <w:r>
+              <w:rPr>
+                <w:b/>
+                <w:bCs/>
+              </w:rPr>
+              <w:t>:</w:t>
+            </w:r>
+          </w:p>
+        </w:tc>
+        <w:tc>
+          <w:tcPr>
+            <w:tcW w:w="6514" w:type="dxa"/>
+          </w:tcPr>
+          <w:p>
+            <w:pPr>
+              <w:spacing w:before="120"/>
+            </w:pPr>
+            <w:r>
+              <w:t>Iniciar Sesión</w:t>
+            </w:r>
+          </w:p>
+        </w:tc>
+      </w:tr>
+      <w:tr>
+        <w:tc>
+          <w:tcPr>
+            <w:tcW w:w="1980" w:type="dxa"/>
+          </w:tcPr>
+          <w:p>
+            <w:pPr>
+              <w:spacing w:before="120" w:after="120"/>
+              <w:rPr>
+                <w:b/>
+                <w:bCs/>
+              </w:rPr>
+            </w:pPr>
+            <w:r>
+              <w:rPr>
+                <w:b/>
+                <w:bCs/>
+              </w:rPr>
+              <w:t>Actor o Actores</w:t>
+            </w:r>
+            <w:r>
+              <w:rPr>
+                <w:b/>
+                <w:bCs/>
+              </w:rPr>
+              <w:t>:</w:t>
+            </w:r>
+          </w:p>
+        </w:tc>
+        <w:tc>
+          <w:tcPr>
+            <w:tcW w:w="6514" w:type="dxa"/>
+          </w:tcPr>
+          <w:p>
+            <w:pPr>
+              <w:spacing w:before="120"/>
+            </w:pPr>
+            <w:r>
+              <w:t>Usuario Sin Autenticar</w:t>
+            </w:r>
+          </w:p>
+        </w:tc>
+      </w:tr>
+      <w:tr>
+        <w:tc>
+          <w:tcPr>
+            <w:tcW w:w="8494" w:type="dxa"/>
+            <w:gridSpan w:val="2"/>
+          </w:tcPr>
+          <w:p>
+            <w:pPr>
+              <w:spacing w:before="120"/>
+              <w:rPr>
+                <w:b/>
+                <w:bCs/>
+              </w:rPr>
+            </w:pPr>
+            <w:r>
+              <w:rPr>
+                <w:b/>
+                <w:bCs/>
+              </w:rPr>
+              <w:t>Descripción:</w:t>
+            </w:r>
+          </w:p>
+          <w:p>
+            <w:pPr>
+              <w:spacing w:before="120"/>
+            </w:pPr>
+            <w:r>
+              <w:t xml:space="preserve">El actor </w:t>
+            </w:r>
+            <w:r>
+              <w:t>entra al sistema eligiendo un rol</w:t>
+            </w:r>
+            <w:r>
+              <w:t>.</w:t>
+            </w:r>
+          </w:p>
+          <w:p/>
+        </w:tc>
+      </w:tr>
+      <w:tr>
+        <w:tc>
+          <w:tcPr>
+            <w:tcW w:w="8494" w:type="dxa"/>
+            <w:gridSpan w:val="2"/>
+          </w:tcPr>
+          <w:p>
+            <w:pPr>
+              <w:spacing w:before="120"/>
+              <w:rPr>
+                <w:b/>
+                <w:bCs/>
+              </w:rPr>
+            </w:pPr>
+            <w:r>
+              <w:rPr>
+                <w:b/>
+                <w:bCs/>
+              </w:rPr>
+              <w:t>Precondiciones:</w:t>
+            </w:r>
+          </w:p>
+          <w:p>
+            <w:pPr>
+              <w:spacing w:before="120"/>
+              <w:rPr>
+                <w:b/>
+                <w:bCs/>
+              </w:rPr>
+            </w:pPr>
+          </w:p>
+        </w:tc>
+      </w:tr>
+      <w:tr>
+        <w:tc>
+          <w:tcPr>
+            <w:tcW w:w="8494" w:type="dxa"/>
+            <w:gridSpan w:val="2"/>
+          </w:tcPr>
+          <w:p>
+            <w:pPr>
+              <w:spacing w:before="120"/>
+              <w:rPr>
+                <w:b/>
+                <w:bCs/>
+              </w:rPr>
+            </w:pPr>
+            <w:r>
+              <w:rPr>
+                <w:b/>
+                <w:bCs/>
+              </w:rPr>
+              <w:t>Flujo Principal:</w:t>
+            </w:r>
+          </w:p>
+          <w:p>
+            <w:pPr>
+              <w:spacing w:before="120"/>
+            </w:pPr>
+            <w:r>
+              <w:t xml:space="preserve">1.- El actor </w:t>
+            </w:r>
+            <w:r>
+              <w:t>entra al programa</w:t>
+            </w:r>
+            <w:r>
+              <w:t>.</w:t>
+            </w:r>
+          </w:p>
+          <w:p>
+            <w:pPr>
+              <w:spacing w:before="120"/>
+            </w:pPr>
+            <w:r>
+              <w:t xml:space="preserve">2.- El sistema muestra una lista </w:t>
+            </w:r>
+            <w:r>
+              <w:t>con los roles con los que puede entrar</w:t>
+            </w:r>
+            <w:r>
+              <w:t>.</w:t>
+            </w:r>
+          </w:p>
+          <w:p>
+            <w:pPr>
+              <w:spacing w:before="120"/>
+            </w:pPr>
+            <w:r>
+              <w:t>3.- El actor elige el rol con el que entrar.</w:t>
+            </w:r>
+          </w:p>
+          <w:p>
+            <w:pPr>
+              <w:spacing w:before="120"/>
+            </w:pPr>
+          </w:p>
+        </w:tc>
+      </w:tr>
+      <w:tr>
+        <w:tc>
+          <w:tcPr>
+            <w:tcW w:w="8494" w:type="dxa"/>
+            <w:gridSpan w:val="2"/>
+          </w:tcPr>
+          <w:p>
+            <w:pPr>
+              <w:spacing w:before="120"/>
+              <w:rPr>
+                <w:b/>
+                <w:bCs/>
+              </w:rPr>
+            </w:pPr>
+            <w:r>
+              <w:rPr>
+                <w:b/>
+                <w:bCs/>
+              </w:rPr>
+              <w:t>Flujos Alternativos:</w:t>
+            </w:r>
+          </w:p>
+          <w:p>
+            <w:pPr>
+              <w:spacing w:before="120"/>
+              <w:rPr>
+                <w:b/>
+                <w:bCs/>
+              </w:rPr>
+            </w:pPr>
+          </w:p>
+        </w:tc>
+      </w:tr>
+      <w:tr>
+        <w:tc>
+          <w:tcPr>
+            <w:tcW w:w="8494" w:type="dxa"/>
+            <w:gridSpan w:val="2"/>
+          </w:tcPr>
+          <w:p>
+            <w:pPr>
+              <w:spacing w:before="120"/>
+              <w:rPr>
+                <w:b/>
+                <w:bCs/>
+              </w:rPr>
+            </w:pPr>
+            <w:r>
+              <w:rPr>
+                <w:b/>
+                <w:bCs/>
+              </w:rPr>
+              <w:t>Postcondiciones:</w:t>
+            </w:r>
+          </w:p>
+          <w:p>
+            <w:pPr>
+              <w:spacing w:before="120"/>
+            </w:pPr>
+            <w:r>
+              <w:t>El actor accede al menú del rol elegido, donde podrá realizar sobre el sistema las acciones propias de dicho rol.</w:t>
+            </w:r>
+          </w:p>
+          <w:p>
+            <w:pPr>
+              <w:spacing w:before="120"/>
+            </w:pPr>
+          </w:p>
+        </w:tc>
+      </w:tr>
+    </w:tbl>
+    <w:p/>
+    <w:p/>
+    <w:p/>
+    <w:p/>
+    <w:p/>
+    <w:p/>
+    <w:p/>
+    <w:p/>
+    <w:p/>
+    <w:p>
+      <w:r>
+        <w:br w:type="page"/>
+      </w:r>
+    </w:p>
+    <w:p>
+      <w:pPr>
+        <w:pStyle w:val="Ttulo2"/>
+      </w:pPr>
+      <w:r>
+        <w:lastRenderedPageBreak/>
+        <w:t>Justificación de Casos de Uso</w:t>
+      </w:r>
+    </w:p>
+    <w:p>
+      <w:pPr>
+        <w:pStyle w:val="Ttulo4"/>
+      </w:pPr>
+      <w:r>
+        <w:t>Casos de uso Principales</w:t>
+      </w:r>
+    </w:p>
+    <w:p>
+      <w:pPr>
+        <w:jc w:val="both"/>
+      </w:pPr>
+      <w:r>
+        <w:t>Los casos de usos principales son las que se conectan directamente con los actores.</w:t>
+      </w:r>
+    </w:p>
+    <w:p>
+      <w:pPr>
+        <w:jc w:val="both"/>
+      </w:pPr>
+      <w:r>
+        <w:t>Estos casos de uso son las acciones directas que pueden realizar los usuarios en cuanto entran al sistema.</w:t>
+      </w:r>
+    </w:p>
+    <w:p>
+      <w:pPr>
+        <w:jc w:val="both"/>
+      </w:pPr>
+      <w:r>
+        <w:rPr>
+          <w:noProof/>
+        </w:rPr>
+        <w:drawing>
+          <wp:inline distT="0" distB="0" distL="0" distR="0" wp14:anchorId="03A1A893" wp14:editId="1CA4B4CC">
+            <wp:extent cx="5371126" cy="6627495"/>
+            <wp:effectExtent l="19050" t="19050" r="20320" b="20955"/>
+            <wp:docPr id="20" name="Imagen 20"/>
+            <wp:cNvGraphicFramePr>
+              <a:graphicFrameLocks xmlns:a="http://schemas.openxmlformats.org/drawingml/2006/main" noChangeAspect="1"/>
+            </wp:cNvGraphicFramePr>
+            <a:graphic xmlns:a="http://schemas.openxmlformats.org/drawingml/2006/main">
+              <a:graphicData uri="http://schemas.openxmlformats.org/drawingml/2006/picture">
+                <pic:pic xmlns:pic="http://schemas.openxmlformats.org/drawingml/2006/picture">
+                  <pic:nvPicPr>
+                    <pic:cNvPr id="0" name="Picture 3"/>
+                    <pic:cNvPicPr>
+                      <a:picLocks noChangeAspect="1" noChangeArrowheads="1"/>
+                    </pic:cNvPicPr>
+                  </pic:nvPicPr>
+                  <pic:blipFill rotWithShape="1">
+                    <a:blip r:embed="rId11">
+                      <a:extLst>
+                        <a:ext uri="{28A0092B-C50C-407E-A947-70E740481C1C}">
+                          <a14:useLocalDpi xmlns:a14="http://schemas.microsoft.com/office/drawing/2010/main" val="0"/>
+                        </a:ext>
+                      </a:extLst>
+                    </a:blip>
+                    <a:srcRect l="327" t="7499" r="38350" b="6993"/>
+                    <a:stretch/>
+                  </pic:blipFill>
+                  <pic:spPr bwMode="auto">
+                    <a:xfrm>
+                      <a:off x="0" y="0"/>
+                      <a:ext cx="5391089" cy="6652127"/>
+                    </a:xfrm>
+                    <a:prstGeom prst="rect">
+                      <a:avLst/>
+                    </a:prstGeom>
+                    <a:noFill/>
+                    <a:ln w="9525" cap="flat" cmpd="sng" algn="ctr">
+                      <a:solidFill>
+                        <a:srgbClr val="156082"/>
+                      </a:solidFill>
+                      <a:prstDash val="solid"/>
+                      <a:round/>
+                      <a:headEnd type="none" w="med" len="med"/>
+                      <a:tailEnd type="none" w="med" len="med"/>
+                      <a:extLst>
+                        <a:ext uri="{C807C97D-BFC1-408E-A445-0C87EB9F89A2}">
+                          <ask:lineSketchStyleProps xmlns:ask="http://schemas.microsoft.com/office/drawing/2018/sketchyshapes" sd="0">
+                            <a:custGeom>
+                              <a:avLst/>
+                              <a:gdLst/>
+                              <a:ahLst/>
+                              <a:cxnLst/>
+                              <a:rect l="0" t="0" r="0" b="0"/>
+                              <a:pathLst/>
+                            </a:custGeom>
+                            <ask:type/>
+                          </ask:lineSketchStyleProps>
+                        </a:ext>
+                      </a:extLst>
+                    </a:ln>
+                    <a:extLst>
+                      <a:ext uri="{53640926-AAD7-44D8-BBD7-CCE9431645EC}">
+                        <a14:shadowObscured xmlns:a14="http://schemas.microsoft.com/office/drawing/2010/main"/>
+                      </a:ext>
+                    </a:extLst>
+                  </pic:spPr>
+                </pic:pic>
+              </a:graphicData>
+            </a:graphic>
+          </wp:inline>
+        </w:drawing>
+      </w:r>
+    </w:p>
+    <w:p>
+      <w:pPr>
+        <w:pStyle w:val="Ttulo4"/>
+      </w:pPr>
+      <w:r>
+        <w:lastRenderedPageBreak/>
+        <w:t xml:space="preserve">Casos de Uso Secundarios debido a </w:t>
+      </w:r>
+      <w:r>
+        <w:t>subpasos</w:t>
+      </w:r>
+    </w:p>
+    <w:p>
+      <w:pPr>
+        <w:jc w:val="both"/>
+      </w:pPr>
+      <w:r>
+        <w:t>Para determinar la existencia de un caso de uso hice lo siguiente:</w:t>
+      </w:r>
+    </w:p>
+    <w:p>
+      <w:pPr>
+        <w:jc w:val="both"/>
+      </w:pPr>
+      <w:r>
+        <w:t>Cuando en un caso de uso principal</w:t>
+      </w:r>
+      <w:r>
+        <w:t xml:space="preserve">, la acción directa del actor divide un paso en subpasos relacionados, es señal de que deberíamos sacar un caso secundario representando esa acción que genera subpasos. </w:t>
+      </w:r>
+    </w:p>
+    <w:p>
+      <w:pPr>
+        <w:jc w:val="both"/>
+      </w:pPr>
+      <w:r>
+        <w:t>Eso es lo que paso con el caso de uso “Actualizar Tratamientos del Paciente”.</w:t>
+      </w:r>
+    </w:p>
+    <w:p>
+      <w:pPr>
+        <w:jc w:val="both"/>
+      </w:pPr>
+      <w:r>
+        <w:drawing>
+          <wp:inline distT="0" distB="0" distL="0" distR="0" wp14:anchorId="4FD5645A" wp14:editId="3B892663">
+            <wp:extent cx="5400040" cy="884555"/>
+            <wp:effectExtent l="19050" t="19050" r="10160" b="10795"/>
+            <wp:docPr id="16" name="Imagen 16"/>
+            <wp:cNvGraphicFramePr>
+              <a:graphicFrameLocks xmlns:a="http://schemas.openxmlformats.org/drawingml/2006/main" noChangeAspect="1"/>
+            </wp:cNvGraphicFramePr>
+            <a:graphic xmlns:a="http://schemas.openxmlformats.org/drawingml/2006/main">
+              <a:graphicData uri="http://schemas.openxmlformats.org/drawingml/2006/picture">
+                <pic:pic xmlns:pic="http://schemas.openxmlformats.org/drawingml/2006/picture">
+                  <pic:nvPicPr>
+                    <pic:cNvPr id="1" name=""/>
+                    <pic:cNvPicPr/>
+                  </pic:nvPicPr>
+                  <pic:blipFill>
+                    <a:blip r:embed="rId12"/>
+                    <a:stretch>
+                      <a:fillRect/>
+                    </a:stretch>
+                  </pic:blipFill>
+                  <pic:spPr>
+                    <a:xfrm>
+                      <a:off x="0" y="0"/>
+                      <a:ext cx="5400040" cy="884555"/>
+                    </a:xfrm>
+                    <a:prstGeom prst="rect">
+                      <a:avLst/>
+                    </a:prstGeom>
+                    <a:ln>
+                      <a:solidFill>
+                        <a:schemeClr val="accent1"/>
+                      </a:solidFill>
+                    </a:ln>
+                  </pic:spPr>
+                </pic:pic>
+              </a:graphicData>
+            </a:graphic>
+          </wp:inline>
+        </w:drawing>
+      </w:r>
+    </w:p>
+    <w:p>
+      <w:pPr>
+        <w:pStyle w:val="Ttulo4"/>
+      </w:pPr>
+      <w:r>
+        <w:t xml:space="preserve">Casos de </w:t>
+      </w:r>
+      <w:r>
+        <w:t>U</w:t>
+      </w:r>
+      <w:r>
+        <w:t xml:space="preserve">so </w:t>
+      </w:r>
+      <w:r>
+        <w:t xml:space="preserve">Secundarios debido a </w:t>
+      </w:r>
+      <w:r>
+        <w:t>especialización</w:t>
+      </w:r>
+    </w:p>
+    <w:p>
+      <w:pPr>
+        <w:jc w:val="both"/>
+      </w:pPr>
+      <w:r>
+        <w:t>Para determinar la existencia de un caso de uso hice lo siguiente:</w:t>
+      </w:r>
+    </w:p>
+    <w:p>
+      <w:pPr>
+        <w:jc w:val="both"/>
+      </w:pPr>
+      <w:r>
+        <w:t xml:space="preserve">Cuando en un caso de uso principal hay </w:t>
+      </w:r>
+      <w:r>
+        <w:t>una elección donde</w:t>
+      </w:r>
+      <w:r>
+        <w:t>:</w:t>
+      </w:r>
+    </w:p>
+    <w:p>
+      <w:pPr>
+        <w:pStyle w:val="Prrafodelista"/>
+        <w:numPr>
+          <w:ilvl w:val="0"/>
+          <w:numId w:val="23"/>
+        </w:numPr>
+        <w:jc w:val="both"/>
+      </w:pPr>
+      <w:r>
+        <w:t>E</w:t>
+      </w:r>
+      <w:r>
+        <w:t>l</w:t>
+      </w:r>
+      <w:r>
+        <w:t xml:space="preserve"> </w:t>
+      </w:r>
+      <w:r>
+        <w:t>actor</w:t>
+      </w:r>
+      <w:r>
+        <w:t xml:space="preserve"> tiene 2 </w:t>
+      </w:r>
+      <w:r>
+        <w:t>o más</w:t>
+      </w:r>
+      <w:r>
+        <w:t xml:space="preserve"> rutas y solo puede elegir una</w:t>
+      </w:r>
+      <w:r>
+        <w:t xml:space="preserve">, diversificando el caso de uso </w:t>
+      </w:r>
+      <w:r>
+        <w:t>de forma significativa</w:t>
+      </w:r>
+      <w:r>
+        <w:t xml:space="preserve"> en varias ramas principales</w:t>
+      </w:r>
+      <w:r>
+        <w:t>.</w:t>
+      </w:r>
+    </w:p>
+    <w:p>
+      <w:pPr>
+        <w:jc w:val="both"/>
+      </w:pPr>
+      <w:r>
+        <w:t>E</w:t>
+      </w:r>
+      <w:r>
+        <w:t>s una señal de que deberíamos sacar casos de uso secundarios del caso de uso principal</w:t>
+      </w:r>
+      <w:r>
+        <w:t xml:space="preserve"> y relacionarlos con una relación de especialización</w:t>
+      </w:r>
+      <w:r>
+        <w:t>.</w:t>
+      </w:r>
+    </w:p>
+    <w:p>
+      <w:pPr>
+        <w:jc w:val="both"/>
+      </w:pPr>
+      <w:r>
+        <w:t>Es</w:t>
+      </w:r>
+      <w:r>
+        <w:t>o</w:t>
+      </w:r>
+      <w:r>
+        <w:t xml:space="preserve"> es lo que paso con del caso de uso “Traslado Paciente” con “Traslado Paciente otra Unidad” y “Traslado Paciente otro Hospital”.</w:t>
+      </w:r>
+    </w:p>
+    <w:p>
+      <w:pPr>
+        <w:jc w:val="both"/>
+      </w:pPr>
+      <w:r>
+        <w:t>Dónde los 2 casos de uso resultantes son una especi</w:t>
+      </w:r>
+      <w:r>
+        <w:t>alización</w:t>
+      </w:r>
+      <w:r>
+        <w:t xml:space="preserve"> del caso de uso principal.</w:t>
+      </w:r>
+    </w:p>
+    <w:p>
+      <w:r>
+        <w:drawing>
+          <wp:inline distT="0" distB="0" distL="0" distR="0" wp14:anchorId="1540C330" wp14:editId="04395CBF">
+            <wp:extent cx="5400040" cy="1838960"/>
+            <wp:effectExtent l="19050" t="19050" r="10160" b="27940"/>
+            <wp:docPr id="12" name="Imagen 12"/>
+            <wp:cNvGraphicFramePr>
+              <a:graphicFrameLocks xmlns:a="http://schemas.openxmlformats.org/drawingml/2006/main" noChangeAspect="1"/>
+            </wp:cNvGraphicFramePr>
+            <a:graphic xmlns:a="http://schemas.openxmlformats.org/drawingml/2006/main">
+              <a:graphicData uri="http://schemas.openxmlformats.org/drawingml/2006/picture">
+                <pic:pic xmlns:pic="http://schemas.openxmlformats.org/drawingml/2006/picture">
+                  <pic:nvPicPr>
+                    <pic:cNvPr id="1" name=""/>
+                    <pic:cNvPicPr/>
+                  </pic:nvPicPr>
+                  <pic:blipFill>
+                    <a:blip r:embed="rId13"/>
+                    <a:stretch>
+                      <a:fillRect/>
+                    </a:stretch>
+                  </pic:blipFill>
+                  <pic:spPr>
+                    <a:xfrm>
+                      <a:off x="0" y="0"/>
+                      <a:ext cx="5400040" cy="1838960"/>
+                    </a:xfrm>
+                    <a:prstGeom prst="rect">
+                      <a:avLst/>
+                    </a:prstGeom>
+                    <a:ln>
+                      <a:solidFill>
+                        <a:schemeClr val="accent1"/>
+                      </a:solidFill>
+                    </a:ln>
+                  </pic:spPr>
+                </pic:pic>
+              </a:graphicData>
+            </a:graphic>
+          </wp:inline>
+        </w:drawing>
+      </w:r>
+    </w:p>
+    <w:p/>
+    <w:p/>
+    <w:p/>
+    <w:p/>
+    <w:p>
+      <w:pPr>
+        <w:pStyle w:val="Ttulo4"/>
+      </w:pPr>
+      <w:r>
+        <w:lastRenderedPageBreak/>
+        <w:t>Casos de Uso</w:t>
+      </w:r>
+      <w:r>
+        <w:t xml:space="preserve"> Secundarios debido a uso común</w:t>
+      </w:r>
+    </w:p>
+    <w:p>
+      <w:r>
+        <w:t>Para determinar la existencia de un caso de uso hice lo siguiente:</w:t>
+      </w:r>
+    </w:p>
+    <w:p>
+      <w:r>
+        <w:t>Cuando en</w:t>
+      </w:r>
+      <w:r>
+        <w:t xml:space="preserve"> los pasos de 2 o más casos de uso, se repite varios pasos relacionados a la acción del actor sobre el sistema, es señal de que deberíamos sacar un caso de uso secundario relacionado a dichos casos de uso</w:t>
+      </w:r>
+      <w:r>
+        <w:t>.</w:t>
+      </w:r>
+    </w:p>
+    <w:p>
+      <w:r>
+        <w:t>Eso es lo que pasa con los casos de uso “Consultar Información Paciente” y “Traslado Paciente otra Unidad”.</w:t>
+      </w:r>
+    </w:p>
+    <w:p>
+      <w:r>
+        <w:drawing>
+          <wp:inline distT="0" distB="0" distL="0" distR="0" wp14:anchorId="3BA1AA8B" wp14:editId="36EBAFC9">
+            <wp:extent cx="5400040" cy="2357120"/>
+            <wp:effectExtent l="19050" t="19050" r="10160" b="24130"/>
+            <wp:docPr id="13" name="Imagen 13"/>
+            <wp:cNvGraphicFramePr>
+              <a:graphicFrameLocks xmlns:a="http://schemas.openxmlformats.org/drawingml/2006/main" noChangeAspect="1"/>
+            </wp:cNvGraphicFramePr>
+            <a:graphic xmlns:a="http://schemas.openxmlformats.org/drawingml/2006/main">
+              <a:graphicData uri="http://schemas.openxmlformats.org/drawingml/2006/picture">
+                <pic:pic xmlns:pic="http://schemas.openxmlformats.org/drawingml/2006/picture">
+                  <pic:nvPicPr>
+                    <pic:cNvPr id="1" name=""/>
+                    <pic:cNvPicPr/>
+                  </pic:nvPicPr>
+                  <pic:blipFill>
+                    <a:blip r:embed="rId14"/>
+                    <a:stretch>
+                      <a:fillRect/>
+                    </a:stretch>
+                  </pic:blipFill>
+                  <pic:spPr>
+                    <a:xfrm>
+                      <a:off x="0" y="0"/>
+                      <a:ext cx="5400040" cy="2357120"/>
+                    </a:xfrm>
+                    <a:prstGeom prst="rect">
+                      <a:avLst/>
+                    </a:prstGeom>
+                    <a:ln>
+                      <a:solidFill>
+                        <a:schemeClr val="accent1"/>
+                      </a:solidFill>
+                    </a:ln>
+                  </pic:spPr>
+                </pic:pic>
+              </a:graphicData>
+            </a:graphic>
+          </wp:inline>
+        </w:drawing>
+      </w:r>
+    </w:p>
+    <w:p>
+      <w:r>
+        <w:t xml:space="preserve">En el caso de “Traslado Paciente otra Unidad”, aparte de ser un paso común entre 2 casos de uso principales, también es una especialización de uno de esos 2 caso de uso </w:t>
+      </w:r>
+      <w:r>
+        <w:t>principales</w:t>
+      </w:r>
+      <w:r>
+        <w:t>.</w:t>
+      </w:r>
+    </w:p>
+    <w:p/>
+    <w:p/>
+    <w:p/>
+    <w:p/>
+    <w:p/>
+    <w:p/>
+    <w:p/>
+    <w:p/>
+    <w:p/>
+    <w:p/>
+    <w:p/>
+    <w:p/>
+    <w:p/>
+    <w:p>
+      <w:pPr>
+        <w:pStyle w:val="Ttulo3"/>
+      </w:pPr>
+      <w:r>
+        <w:lastRenderedPageBreak/>
+        <w:t>Relaciones entre Casos de Uso</w:t>
+      </w:r>
+    </w:p>
+    <w:p>
+      <w:pPr>
+        <w:pStyle w:val="Ttulo4"/>
+      </w:pPr>
+      <w:r>
+        <w:t>Relaciones &lt;&lt;Include&gt;&gt;</w:t>
+      </w:r>
+    </w:p>
+    <w:p>
+      <w:pPr>
+        <w:jc w:val="both"/>
+      </w:pPr>
+      <w:r>
+        <w:t xml:space="preserve">Una relación &lt;&lt;Include&gt;&gt; marca que un caso de uso usa si o si otro. </w:t>
+      </w:r>
+    </w:p>
+    <w:p>
+      <w:pPr>
+        <w:jc w:val="both"/>
+      </w:pPr>
+      <w:r>
+        <w:t>Un caso de uso secundario no es más que un paso dentro de otro caso de uso, si un paso es obligatorio ¿Por qué habría que separarlo del caso de uso principal?, esto estos pasos obligatorios lo comparten varios casos de uso.</w:t>
+      </w:r>
+    </w:p>
+    <w:p>
+      <w:pPr>
+        <w:jc w:val="both"/>
+      </w:pPr>
+      <w:r>
+        <w:t>Este caso descrito es lo que pasa con la relación entre el caso de uso “Asignar Paciente” y “Traslado Paciente otra Unidad”.</w:t>
+      </w:r>
+    </w:p>
+    <w:p>
+      <w:pPr>
+        <w:jc w:val="both"/>
+      </w:pPr>
+      <w:r>
+        <w:t>“Traslado Paciente otra Unidad” que es un paso obligatorio no tendría por qué estar separado, pero como es un paso común en varios casos de uso, se le separa y se le marca con una relación &lt;&lt;include&gt;&gt;.</w:t>
+      </w:r>
+    </w:p>
+    <w:p>
+      <w:pPr>
+        <w:jc w:val="both"/>
+      </w:pPr>
+      <w:r>
+        <w:drawing>
+          <wp:inline distT="0" distB="0" distL="0" distR="0" wp14:anchorId="78138339" wp14:editId="6E565C13">
+            <wp:extent cx="5400040" cy="1198880"/>
+            <wp:effectExtent l="19050" t="19050" r="10160" b="20320"/>
+            <wp:docPr id="11" name="Imagen 11"/>
+            <wp:cNvGraphicFramePr>
+              <a:graphicFrameLocks xmlns:a="http://schemas.openxmlformats.org/drawingml/2006/main" noChangeAspect="1"/>
+            </wp:cNvGraphicFramePr>
+            <a:graphic xmlns:a="http://schemas.openxmlformats.org/drawingml/2006/main">
+              <a:graphicData uri="http://schemas.openxmlformats.org/drawingml/2006/picture">
+                <pic:pic xmlns:pic="http://schemas.openxmlformats.org/drawingml/2006/picture">
+                  <pic:nvPicPr>
+                    <pic:cNvPr id="1" name=""/>
+                    <pic:cNvPicPr/>
+                  </pic:nvPicPr>
+                  <pic:blipFill>
+                    <a:blip r:embed="rId15"/>
+                    <a:stretch>
+                      <a:fillRect/>
+                    </a:stretch>
+                  </pic:blipFill>
+                  <pic:spPr>
+                    <a:xfrm>
+                      <a:off x="0" y="0"/>
+                      <a:ext cx="5400040" cy="1198880"/>
+                    </a:xfrm>
+                    <a:prstGeom prst="rect">
+                      <a:avLst/>
+                    </a:prstGeom>
+                    <a:ln>
+                      <a:solidFill>
+                        <a:schemeClr val="accent1"/>
+                      </a:solidFill>
+                    </a:ln>
+                  </pic:spPr>
+                </pic:pic>
+              </a:graphicData>
+            </a:graphic>
+          </wp:inline>
+        </w:drawing>
+      </w:r>
+    </w:p>
+    <w:p>
+      <w:pPr>
+        <w:pStyle w:val="Ttulo4"/>
+        <w:jc w:val="both"/>
+      </w:pPr>
+      <w:r>
+        <w:t>Relaciones &lt;&lt;extend&gt;&gt;</w:t>
+      </w:r>
+    </w:p>
+    <w:p>
+      <w:pPr>
+        <w:jc w:val="both"/>
+      </w:pPr>
+      <w:r>
+        <w:t>Una relación &lt;&lt;extend&gt;&gt; marca que un caso de uso puede opcionalmente usar a otro.</w:t>
+      </w:r>
+    </w:p>
+    <w:p>
+      <w:pPr>
+        <w:jc w:val="both"/>
+      </w:pPr>
+      <w:r>
+        <w:t>Un caso de uso secundario no es más que un paso dentro de otro caso de uso, puede ocurrir que un paso opcional</w:t>
+      </w:r>
+      <w:r>
+        <w:t xml:space="preserve"> genere subpasos dentro del caso de uso principal, la decisión es sacar un caso de uso de ello y, al ser opcional, marcarlo con &lt;&lt;extend&gt;&gt;.</w:t>
+      </w:r>
+    </w:p>
+    <w:p>
+      <w:pPr>
+        <w:jc w:val="both"/>
+      </w:pPr>
+      <w:r>
+        <w:t>Eso es lo que ocurre con el caso de uso “Actualizar Tratamientos del Paciente”.</w:t>
+      </w:r>
+    </w:p>
+    <w:p>
+      <w:pPr>
+        <w:jc w:val="both"/>
+      </w:pPr>
+      <w:r>
+        <w:drawing>
+          <wp:inline distT="0" distB="0" distL="0" distR="0" wp14:anchorId="211C502A" wp14:editId="6B0E5CE6">
+            <wp:extent cx="5400040" cy="885825"/>
+            <wp:effectExtent l="19050" t="19050" r="10160" b="28575"/>
+            <wp:docPr id="22" name="Imagen 22"/>
+            <wp:cNvGraphicFramePr>
+              <a:graphicFrameLocks xmlns:a="http://schemas.openxmlformats.org/drawingml/2006/main" noChangeAspect="1"/>
+            </wp:cNvGraphicFramePr>
+            <a:graphic xmlns:a="http://schemas.openxmlformats.org/drawingml/2006/main">
+              <a:graphicData uri="http://schemas.openxmlformats.org/drawingml/2006/picture">
+                <pic:pic xmlns:pic="http://schemas.openxmlformats.org/drawingml/2006/picture">
+                  <pic:nvPicPr>
+                    <pic:cNvPr id="1" name=""/>
+                    <pic:cNvPicPr/>
+                  </pic:nvPicPr>
+                  <pic:blipFill>
+                    <a:blip r:embed="rId16"/>
+                    <a:stretch>
+                      <a:fillRect/>
+                    </a:stretch>
+                  </pic:blipFill>
+                  <pic:spPr>
+                    <a:xfrm>
+                      <a:off x="0" y="0"/>
+                      <a:ext cx="5400040" cy="885825"/>
+                    </a:xfrm>
+                    <a:prstGeom prst="rect">
+                      <a:avLst/>
+                    </a:prstGeom>
+                    <a:ln>
+                      <a:solidFill>
+                        <a:schemeClr val="accent1"/>
+                      </a:solidFill>
+                    </a:ln>
+                  </pic:spPr>
+                </pic:pic>
+              </a:graphicData>
+            </a:graphic>
+          </wp:inline>
+        </w:drawing>
+      </w:r>
+    </w:p>
+    <w:p>
+      <w:pPr>
+        <w:jc w:val="both"/>
+      </w:pPr>
+    </w:p>
+    <w:p>
+      <w:pPr>
+        <w:jc w:val="both"/>
+      </w:pPr>
+    </w:p>
+    <w:p>
+      <w:pPr>
+        <w:jc w:val="both"/>
+      </w:pPr>
+    </w:p>
+    <w:p>
+      <w:pPr>
+        <w:jc w:val="both"/>
+      </w:pPr>
+    </w:p>
+    <w:p>
+      <w:pPr>
+        <w:jc w:val="both"/>
+      </w:pPr>
+    </w:p>
+    <w:p>
+      <w:pPr>
+        <w:jc w:val="both"/>
+      </w:pPr>
+    </w:p>
+    <w:p>
+      <w:pPr>
+        <w:jc w:val="both"/>
+      </w:pPr>
+      <w:r>
+        <w:lastRenderedPageBreak/>
+        <w:t>También puede ocurrir lo del caso de uso “Consultar Información”, como 2 casos de uso usan la misma serie de pasos, se</w:t>
+      </w:r>
+      <w:r>
+        <w:t xml:space="preserve"> saca un caso de uso como resultado, además, como ese uso era opcional, se marca &lt;&lt;extend&gt;&gt; en la relación.</w:t>
+      </w:r>
+    </w:p>
+    <w:p>
+      <w:pPr>
+        <w:jc w:val="both"/>
+      </w:pPr>
+      <w:r>
+        <w:drawing>
+          <wp:inline distT="0" distB="0" distL="0" distR="0" wp14:anchorId="6676797C" wp14:editId="6BFCC64E">
+            <wp:extent cx="5400040" cy="2357120"/>
+            <wp:effectExtent l="19050" t="19050" r="10160" b="24130"/>
+            <wp:docPr id="23" name="Imagen 23"/>
+            <wp:cNvGraphicFramePr>
+              <a:graphicFrameLocks xmlns:a="http://schemas.openxmlformats.org/drawingml/2006/main" noChangeAspect="1"/>
+            </wp:cNvGraphicFramePr>
+            <a:graphic xmlns:a="http://schemas.openxmlformats.org/drawingml/2006/main">
+              <a:graphicData uri="http://schemas.openxmlformats.org/drawingml/2006/picture">
+                <pic:pic xmlns:pic="http://schemas.openxmlformats.org/drawingml/2006/picture">
+                  <pic:nvPicPr>
+                    <pic:cNvPr id="1" name=""/>
+                    <pic:cNvPicPr/>
+                  </pic:nvPicPr>
+                  <pic:blipFill>
+                    <a:blip r:embed="rId14"/>
+                    <a:stretch>
+                      <a:fillRect/>
+                    </a:stretch>
+                  </pic:blipFill>
+                  <pic:spPr>
+                    <a:xfrm>
+                      <a:off x="0" y="0"/>
+                      <a:ext cx="5400040" cy="2357120"/>
+                    </a:xfrm>
+                    <a:prstGeom prst="rect">
+                      <a:avLst/>
+                    </a:prstGeom>
+                    <a:ln>
+                      <a:solidFill>
+                        <a:schemeClr val="accent1"/>
+                      </a:solidFill>
+                    </a:ln>
+                  </pic:spPr>
+                </pic:pic>
+              </a:graphicData>
+            </a:graphic>
+          </wp:inline>
+        </w:drawing>
+      </w:r>
+    </w:p>
+    <w:p>
+      <w:pPr>
+        <w:jc w:val="both"/>
+      </w:pPr>
+    </w:p>
     <w:sectPr>
-      <w:footerReference w:type="default" r:id="rId11"/>
+      <w:footerReference w:type="default" r:id="rId17"/>
       <w:pgSz w:w="11906" w:h="16838"/>
       <w:pgMar w:top="1417" w:right="1701" w:bottom="1417" w:left="1701" w:header="708" w:footer="708" w:gutter="0"/>
       <w:pgBorders w:offsetFrom="page">
@@ -5697,6 +7250,119 @@
 <file path=word/numbering.xml><?xml version="1.0" encoding="utf-8"?>
 <w:numbering xmlns:wpc="http://schemas.microsoft.com/office/word/2010/wordprocessingCanvas" xmlns:cx="http://schemas.microsoft.com/office/drawing/2014/chartex" xmlns:cx1="http://schemas.microsoft.com/office/drawing/2015/9/8/chartex" xmlns:cx2="http://schemas.microsoft.com/office/drawing/2015/10/21/chartex" xmlns:cx3="http://schemas.microsoft.com/office/drawing/2016/5/9/chartex" xmlns:cx4="http://schemas.microsoft.com/office/drawing/2016/5/10/chartex" xmlns:cx5="http://schemas.microsoft.com/office/drawing/2016/5/11/chartex" xmlns:cx6="http://schemas.microsoft.com/office/drawing/2016/5/12/chartex" xmlns:cx7="http://schemas.microsoft.com/office/drawing/2016/5/13/chartex" xmlns:cx8="http://schemas.microsoft.com/office/drawing/2016/5/14/chartex" xmlns:mc="http://schemas.openxmlformats.org/markup-compatibility/2006" xmlns:aink="http://schemas.microsoft.com/office/drawing/2016/ink" xmlns:am3d="http://schemas.microsoft.com/office/drawing/2017/model3d" xmlns:o="urn:schemas-microsoft-com:office:office" xmlns:oel="http://schemas.microsoft.com/office/2019/extlst" xmlns:r="http://schemas.openxmlformats.org/officeDocument/2006/relationships" xmlns:m="http://schemas.openxmlformats.org/officeDocument/2006/math" xmlns:v="urn:schemas-microsoft-com:vml" xmlns:wp14="http://schemas.microsoft.com/office/word/2010/wordprocessingDrawing" xmlns:wp="http://schemas.openxmlformats.org/drawingml/2006/wordprocessingDrawing" xmlns:w10="urn:schemas-microsoft-com:office:word" xmlns:w="http://schemas.openxmlformats.org/wordprocessingml/2006/main" xmlns:w14="http://schemas.microsoft.com/office/word/2010/wordml" xmlns:w15="http://schemas.microsoft.com/office/word/2012/wordml" xmlns:w16cex="http://schemas.microsoft.com/office/word/2018/wordml/cex" xmlns:w16cid="http://schemas.microsoft.com/office/word/2016/wordml/cid" xmlns:w16="http://schemas.microsoft.com/office/word/2018/wordml" xmlns:w16sdtdh="http://schemas.microsoft.com/office/word/2020/wordml/sdtdatahash" xmlns:w16se="http://schemas.microsoft.com/office/word/2015/wordml/symex" xmlns:wpg="http://schemas.microsoft.com/office/word/2010/wordprocessingGroup" xmlns:wpi="http://schemas.microsoft.com/office/word/2010/wordprocessingInk" xmlns:wne="http://schemas.microsoft.com/office/word/2006/wordml" xmlns:wps="http://schemas.microsoft.com/office/word/2010/wordprocessingShape" mc:Ignorable="w14 w15 w16se w16cid w16 w16cex w16sdtdh wp14">
   <w:abstractNum w:abstractNumId="0" w15:restartNumberingAfterBreak="0">
+    <w:nsid w:val="0D227D4B"/>
+    <w:multiLevelType w:val="hybridMultilevel"/>
+    <w:tmpl w:val="DB2CB690"/>
+    <w:lvl w:ilvl="0" w:tplc="0C0A0001">
+      <w:start w:val="1"/>
+      <w:numFmt w:val="bullet"/>
+      <w:lvlText w:val=""/>
+      <w:lvlJc w:val="left"/>
+      <w:pPr>
+        <w:ind w:left="360" w:hanging="360"/>
+      </w:pPr>
+      <w:rPr>
+        <w:rFonts w:ascii="Symbol" w:hAnsi="Symbol" w:hint="default"/>
+      </w:rPr>
+    </w:lvl>
+    <w:lvl w:ilvl="1" w:tplc="0C0A0003" w:tentative="1">
+      <w:start w:val="1"/>
+      <w:numFmt w:val="bullet"/>
+      <w:lvlText w:val="o"/>
+      <w:lvlJc w:val="left"/>
+      <w:pPr>
+        <w:ind w:left="1080" w:hanging="360"/>
+      </w:pPr>
+      <w:rPr>
+        <w:rFonts w:ascii="Courier New" w:hAnsi="Courier New" w:cs="Courier New" w:hint="default"/>
+      </w:rPr>
+    </w:lvl>
+    <w:lvl w:ilvl="2" w:tplc="0C0A0005" w:tentative="1">
+      <w:start w:val="1"/>
+      <w:numFmt w:val="bullet"/>
+      <w:lvlText w:val=""/>
+      <w:lvlJc w:val="left"/>
+      <w:pPr>
+        <w:ind w:left="1800" w:hanging="360"/>
+      </w:pPr>
+      <w:rPr>
+        <w:rFonts w:ascii="Wingdings" w:hAnsi="Wingdings" w:hint="default"/>
+      </w:rPr>
+    </w:lvl>
+    <w:lvl w:ilvl="3" w:tplc="0C0A0001" w:tentative="1">
+      <w:start w:val="1"/>
+      <w:numFmt w:val="bullet"/>
+      <w:lvlText w:val=""/>
+      <w:lvlJc w:val="left"/>
+      <w:pPr>
+        <w:ind w:left="2520" w:hanging="360"/>
+      </w:pPr>
+      <w:rPr>
+        <w:rFonts w:ascii="Symbol" w:hAnsi="Symbol" w:hint="default"/>
+      </w:rPr>
+    </w:lvl>
+    <w:lvl w:ilvl="4" w:tplc="0C0A0003" w:tentative="1">
+      <w:start w:val="1"/>
+      <w:numFmt w:val="bullet"/>
+      <w:lvlText w:val="o"/>
+      <w:lvlJc w:val="left"/>
+      <w:pPr>
+        <w:ind w:left="3240" w:hanging="360"/>
+      </w:pPr>
+      <w:rPr>
+        <w:rFonts w:ascii="Courier New" w:hAnsi="Courier New" w:cs="Courier New" w:hint="default"/>
+      </w:rPr>
+    </w:lvl>
+    <w:lvl w:ilvl="5" w:tplc="0C0A0005" w:tentative="1">
+      <w:start w:val="1"/>
+      <w:numFmt w:val="bullet"/>
+      <w:lvlText w:val=""/>
+      <w:lvlJc w:val="left"/>
+      <w:pPr>
+        <w:ind w:left="3960" w:hanging="360"/>
+      </w:pPr>
+      <w:rPr>
+        <w:rFonts w:ascii="Wingdings" w:hAnsi="Wingdings" w:hint="default"/>
+      </w:rPr>
+    </w:lvl>
+    <w:lvl w:ilvl="6" w:tplc="0C0A0001" w:tentative="1">
+      <w:start w:val="1"/>
+      <w:numFmt w:val="bullet"/>
+      <w:lvlText w:val=""/>
+      <w:lvlJc w:val="left"/>
+      <w:pPr>
+        <w:ind w:left="4680" w:hanging="360"/>
+      </w:pPr>
+      <w:rPr>
+        <w:rFonts w:ascii="Symbol" w:hAnsi="Symbol" w:hint="default"/>
+      </w:rPr>
+    </w:lvl>
+    <w:lvl w:ilvl="7" w:tplc="0C0A0003" w:tentative="1">
+      <w:start w:val="1"/>
+      <w:numFmt w:val="bullet"/>
+      <w:lvlText w:val="o"/>
+      <w:lvlJc w:val="left"/>
+      <w:pPr>
+        <w:ind w:left="5400" w:hanging="360"/>
+      </w:pPr>
+      <w:rPr>
+        <w:rFonts w:ascii="Courier New" w:hAnsi="Courier New" w:cs="Courier New" w:hint="default"/>
+      </w:rPr>
+    </w:lvl>
+    <w:lvl w:ilvl="8" w:tplc="0C0A0005" w:tentative="1">
+      <w:start w:val="1"/>
+      <w:numFmt w:val="bullet"/>
+      <w:lvlText w:val=""/>
+      <w:lvlJc w:val="left"/>
+      <w:pPr>
+        <w:ind w:left="6120" w:hanging="360"/>
+      </w:pPr>
+      <w:rPr>
+        <w:rFonts w:ascii="Wingdings" w:hAnsi="Wingdings" w:hint="default"/>
+      </w:rPr>
+    </w:lvl>
+  </w:abstractNum>
+  <w:abstractNum w:abstractNumId="1" w15:restartNumberingAfterBreak="0">
     <w:nsid w:val="13E2731F"/>
     <w:multiLevelType w:val="hybridMultilevel"/>
     <w:tmpl w:val="C7D49EC6"/>
@@ -5809,7 +7475,7 @@
       </w:rPr>
     </w:lvl>
   </w:abstractNum>
-  <w:abstractNum w:abstractNumId="1" w15:restartNumberingAfterBreak="0">
+  <w:abstractNum w:abstractNumId="2" w15:restartNumberingAfterBreak="0">
     <w:nsid w:val="25A721A0"/>
     <w:multiLevelType w:val="hybridMultilevel"/>
     <w:tmpl w:val="5B96E3D0"/>
@@ -5922,7 +7588,7 @@
       </w:rPr>
     </w:lvl>
   </w:abstractNum>
-  <w:abstractNum w:abstractNumId="2" w15:restartNumberingAfterBreak="0">
+  <w:abstractNum w:abstractNumId="3" w15:restartNumberingAfterBreak="0">
     <w:nsid w:val="275D601C"/>
     <w:multiLevelType w:val="hybridMultilevel"/>
     <w:tmpl w:val="A8B0ED7E"/>
@@ -6035,7 +7701,7 @@
       </w:rPr>
     </w:lvl>
   </w:abstractNum>
-  <w:abstractNum w:abstractNumId="3" w15:restartNumberingAfterBreak="0">
+  <w:abstractNum w:abstractNumId="4" w15:restartNumberingAfterBreak="0">
     <w:nsid w:val="2A9E25C7"/>
     <w:multiLevelType w:val="hybridMultilevel"/>
     <w:tmpl w:val="AC34DB3A"/>
@@ -6125,7 +7791,7 @@
       </w:pPr>
     </w:lvl>
   </w:abstractNum>
-  <w:abstractNum w:abstractNumId="4" w15:restartNumberingAfterBreak="0">
+  <w:abstractNum w:abstractNumId="5" w15:restartNumberingAfterBreak="0">
     <w:nsid w:val="320F1660"/>
     <w:multiLevelType w:val="hybridMultilevel"/>
     <w:tmpl w:val="18EA2C56"/>
@@ -6238,7 +7904,7 @@
       </w:rPr>
     </w:lvl>
   </w:abstractNum>
-  <w:abstractNum w:abstractNumId="5" w15:restartNumberingAfterBreak="0">
+  <w:abstractNum w:abstractNumId="6" w15:restartNumberingAfterBreak="0">
     <w:nsid w:val="36005D6E"/>
     <w:multiLevelType w:val="hybridMultilevel"/>
     <w:tmpl w:val="37368146"/>
@@ -6351,7 +8017,7 @@
       </w:rPr>
     </w:lvl>
   </w:abstractNum>
-  <w:abstractNum w:abstractNumId="6" w15:restartNumberingAfterBreak="0">
+  <w:abstractNum w:abstractNumId="7" w15:restartNumberingAfterBreak="0">
     <w:nsid w:val="615A12E5"/>
     <w:multiLevelType w:val="hybridMultilevel"/>
     <w:tmpl w:val="1F4E46E8"/>
@@ -6464,7 +8130,7 @@
       </w:rPr>
     </w:lvl>
   </w:abstractNum>
-  <w:abstractNum w:abstractNumId="7" w15:restartNumberingAfterBreak="0">
+  <w:abstractNum w:abstractNumId="8" w15:restartNumberingAfterBreak="0">
     <w:nsid w:val="6A034D38"/>
     <w:multiLevelType w:val="hybridMultilevel"/>
     <w:tmpl w:val="B50E7A38"/>
@@ -6577,7 +8243,7 @@
       </w:rPr>
     </w:lvl>
   </w:abstractNum>
-  <w:abstractNum w:abstractNumId="8" w15:restartNumberingAfterBreak="0">
+  <w:abstractNum w:abstractNumId="9" w15:restartNumberingAfterBreak="0">
     <w:nsid w:val="6C4C6EEC"/>
     <w:multiLevelType w:val="hybridMultilevel"/>
     <w:tmpl w:val="11868D88"/>
@@ -6690,7 +8356,7 @@
       </w:rPr>
     </w:lvl>
   </w:abstractNum>
-  <w:abstractNum w:abstractNumId="9" w15:restartNumberingAfterBreak="0">
+  <w:abstractNum w:abstractNumId="10" w15:restartNumberingAfterBreak="0">
     <w:nsid w:val="7E5979B7"/>
     <w:multiLevelType w:val="hybridMultilevel"/>
     <w:tmpl w:val="46D6D0BA"/>
@@ -6804,103 +8470,106 @@
     </w:lvl>
   </w:abstractNum>
   <w:num w:numId="1" w16cid:durableId="1776972621">
-    <w:abstractNumId w:val="0"/>
+    <w:abstractNumId w:val="1"/>
   </w:num>
   <w:num w:numId="2" w16cid:durableId="785199316">
-    <w:abstractNumId w:val="6"/>
+    <w:abstractNumId w:val="7"/>
   </w:num>
   <w:num w:numId="3" w16cid:durableId="1034815384">
-    <w:abstractNumId w:val="9"/>
+    <w:abstractNumId w:val="10"/>
   </w:num>
   <w:num w:numId="4" w16cid:durableId="2094232998">
-    <w:abstractNumId w:val="1"/>
+    <w:abstractNumId w:val="2"/>
   </w:num>
   <w:num w:numId="5" w16cid:durableId="595942021">
-    <w:abstractNumId w:val="3"/>
+    <w:abstractNumId w:val="4"/>
   </w:num>
   <w:num w:numId="6" w16cid:durableId="30696377">
-    <w:abstractNumId w:val="3"/>
+    <w:abstractNumId w:val="4"/>
     <w:lvlOverride w:ilvl="0">
       <w:startOverride w:val="1"/>
     </w:lvlOverride>
   </w:num>
   <w:num w:numId="7" w16cid:durableId="1497454434">
-    <w:abstractNumId w:val="3"/>
+    <w:abstractNumId w:val="4"/>
     <w:lvlOverride w:ilvl="0">
       <w:startOverride w:val="1"/>
     </w:lvlOverride>
   </w:num>
   <w:num w:numId="8" w16cid:durableId="1955400455">
-    <w:abstractNumId w:val="3"/>
+    <w:abstractNumId w:val="4"/>
     <w:lvlOverride w:ilvl="0">
       <w:startOverride w:val="1"/>
     </w:lvlOverride>
   </w:num>
   <w:num w:numId="9" w16cid:durableId="1289239669">
-    <w:abstractNumId w:val="3"/>
+    <w:abstractNumId w:val="4"/>
   </w:num>
   <w:num w:numId="10" w16cid:durableId="1924872436">
-    <w:abstractNumId w:val="3"/>
+    <w:abstractNumId w:val="4"/>
     <w:lvlOverride w:ilvl="0">
       <w:startOverride w:val="1"/>
     </w:lvlOverride>
   </w:num>
   <w:num w:numId="11" w16cid:durableId="1077289320">
-    <w:abstractNumId w:val="3"/>
+    <w:abstractNumId w:val="4"/>
     <w:lvlOverride w:ilvl="0">
       <w:startOverride w:val="1"/>
     </w:lvlOverride>
   </w:num>
   <w:num w:numId="12" w16cid:durableId="2076706517">
-    <w:abstractNumId w:val="3"/>
+    <w:abstractNumId w:val="4"/>
     <w:lvlOverride w:ilvl="0">
       <w:startOverride w:val="1"/>
     </w:lvlOverride>
   </w:num>
   <w:num w:numId="13" w16cid:durableId="1978993480">
-    <w:abstractNumId w:val="3"/>
+    <w:abstractNumId w:val="4"/>
     <w:lvlOverride w:ilvl="0">
       <w:startOverride w:val="1"/>
     </w:lvlOverride>
   </w:num>
   <w:num w:numId="14" w16cid:durableId="1284845735">
-    <w:abstractNumId w:val="3"/>
+    <w:abstractNumId w:val="4"/>
     <w:lvlOverride w:ilvl="0">
       <w:startOverride w:val="1"/>
     </w:lvlOverride>
   </w:num>
   <w:num w:numId="15" w16cid:durableId="295377968">
-    <w:abstractNumId w:val="3"/>
+    <w:abstractNumId w:val="4"/>
     <w:lvlOverride w:ilvl="0">
       <w:startOverride w:val="1"/>
     </w:lvlOverride>
   </w:num>
   <w:num w:numId="16" w16cid:durableId="1245333001">
-    <w:abstractNumId w:val="3"/>
+    <w:abstractNumId w:val="4"/>
     <w:lvlOverride w:ilvl="0">
       <w:startOverride w:val="1"/>
     </w:lvlOverride>
   </w:num>
   <w:num w:numId="17" w16cid:durableId="202064803">
-    <w:abstractNumId w:val="3"/>
+    <w:abstractNumId w:val="4"/>
     <w:lvlOverride w:ilvl="0">
       <w:startOverride w:val="1"/>
     </w:lvlOverride>
   </w:num>
   <w:num w:numId="18" w16cid:durableId="1607270865">
+    <w:abstractNumId w:val="9"/>
+  </w:num>
+  <w:num w:numId="19" w16cid:durableId="2009819921">
+    <w:abstractNumId w:val="6"/>
+  </w:num>
+  <w:num w:numId="20" w16cid:durableId="410663188">
     <w:abstractNumId w:val="8"/>
   </w:num>
-  <w:num w:numId="19" w16cid:durableId="2009819921">
+  <w:num w:numId="21" w16cid:durableId="1981298628">
+    <w:abstractNumId w:val="3"/>
+  </w:num>
+  <w:num w:numId="22" w16cid:durableId="1871185921">
     <w:abstractNumId w:val="5"/>
   </w:num>
-  <w:num w:numId="20" w16cid:durableId="410663188">
-    <w:abstractNumId w:val="7"/>
-  </w:num>
-  <w:num w:numId="21" w16cid:durableId="1981298628">
-    <w:abstractNumId w:val="2"/>
-  </w:num>
-  <w:num w:numId="22" w16cid:durableId="1871185921">
-    <w:abstractNumId w:val="4"/>
+  <w:num w:numId="23" w16cid:durableId="457187096">
+    <w:abstractNumId w:val="0"/>
   </w:num>
   <w:numIdMacAtCleanup w:val="20"/>
 </w:numbering>

</xml_diff>

<commit_message>
Corrección de la documentación del diagrama de casos de uso
</commit_message>
<xml_diff>
--- a/documentacion/Diagrama de Casos de Uso/PROYECTO-RETO – Diagrama-Casos-De-Uso _ Grupo2.docx
+++ b/documentacion/Diagrama de Casos de Uso/PROYECTO-RETO – Diagrama-Casos-De-Uso _ Grupo2.docx
@@ -116,7 +116,29 @@
                                     <w:sz w:val="24"/>
                                     <w:szCs w:val="24"/>
                                   </w:rPr>
-                                  <w:t>Diana Rodriguez Pinillos</w:t>
+                                  <w:t xml:space="preserve">Diana </w:t>
+                                </w:r>
+                                <w:proofErr w:type="spellStart"/>
+                                <w:r>
+                                  <w:rPr>
+                                    <w:rFonts w:ascii="Calisto MT" w:hAnsi="Calisto MT"/>
+                                    <w:b/>
+                                    <w:bCs/>
+                                    <w:sz w:val="24"/>
+                                    <w:szCs w:val="24"/>
+                                  </w:rPr>
+                                  <w:t>Rodriguez</w:t>
+                                </w:r>
+                                <w:proofErr w:type="spellEnd"/>
+                                <w:r>
+                                  <w:rPr>
+                                    <w:rFonts w:ascii="Calisto MT" w:hAnsi="Calisto MT"/>
+                                    <w:b/>
+                                    <w:bCs/>
+                                    <w:sz w:val="24"/>
+                                    <w:szCs w:val="24"/>
+                                  </w:rPr>
+                                  <w:t xml:space="preserve"> Pinillos</w:t>
                                 </w:r>
                               </w:p>
                               <w:p>
@@ -138,8 +160,42 @@
                                     <w:sz w:val="24"/>
                                     <w:szCs w:val="24"/>
                                   </w:rPr>
-                                  <w:t>Alex Andrei Stoica</w:t>
+                                  <w:t xml:space="preserve">Alex </w:t>
                                 </w:r>
+                                <w:proofErr w:type="spellStart"/>
+                                <w:r>
+                                  <w:rPr>
+                                    <w:rFonts w:ascii="Calisto MT" w:hAnsi="Calisto MT"/>
+                                    <w:b/>
+                                    <w:bCs/>
+                                    <w:sz w:val="24"/>
+                                    <w:szCs w:val="24"/>
+                                  </w:rPr>
+                                  <w:t>Andrei</w:t>
+                                </w:r>
+                                <w:proofErr w:type="spellEnd"/>
+                                <w:r>
+                                  <w:rPr>
+                                    <w:rFonts w:ascii="Calisto MT" w:hAnsi="Calisto MT"/>
+                                    <w:b/>
+                                    <w:bCs/>
+                                    <w:sz w:val="24"/>
+                                    <w:szCs w:val="24"/>
+                                  </w:rPr>
+                                  <w:t xml:space="preserve"> </w:t>
+                                </w:r>
+                                <w:proofErr w:type="spellStart"/>
+                                <w:r>
+                                  <w:rPr>
+                                    <w:rFonts w:ascii="Calisto MT" w:hAnsi="Calisto MT"/>
+                                    <w:b/>
+                                    <w:bCs/>
+                                    <w:sz w:val="24"/>
+                                    <w:szCs w:val="24"/>
+                                  </w:rPr>
+                                  <w:t>Stoica</w:t>
+                                </w:r>
+                                <w:proofErr w:type="spellEnd"/>
                               </w:p>
                               <w:p>
                                 <w:pPr>
@@ -245,7 +301,29 @@
                               <w:sz w:val="24"/>
                               <w:szCs w:val="24"/>
                             </w:rPr>
-                            <w:t>Diana Rodriguez Pinillos</w:t>
+                            <w:t xml:space="preserve">Diana </w:t>
+                          </w:r>
+                          <w:proofErr w:type="spellStart"/>
+                          <w:r>
+                            <w:rPr>
+                              <w:rFonts w:ascii="Calisto MT" w:hAnsi="Calisto MT"/>
+                              <w:b/>
+                              <w:bCs/>
+                              <w:sz w:val="24"/>
+                              <w:szCs w:val="24"/>
+                            </w:rPr>
+                            <w:t>Rodriguez</w:t>
+                          </w:r>
+                          <w:proofErr w:type="spellEnd"/>
+                          <w:r>
+                            <w:rPr>
+                              <w:rFonts w:ascii="Calisto MT" w:hAnsi="Calisto MT"/>
+                              <w:b/>
+                              <w:bCs/>
+                              <w:sz w:val="24"/>
+                              <w:szCs w:val="24"/>
+                            </w:rPr>
+                            <w:t xml:space="preserve"> Pinillos</w:t>
                           </w:r>
                         </w:p>
                         <w:p>
@@ -267,8 +345,42 @@
                               <w:sz w:val="24"/>
                               <w:szCs w:val="24"/>
                             </w:rPr>
-                            <w:t>Alex Andrei Stoica</w:t>
+                            <w:t xml:space="preserve">Alex </w:t>
                           </w:r>
+                          <w:proofErr w:type="spellStart"/>
+                          <w:r>
+                            <w:rPr>
+                              <w:rFonts w:ascii="Calisto MT" w:hAnsi="Calisto MT"/>
+                              <w:b/>
+                              <w:bCs/>
+                              <w:sz w:val="24"/>
+                              <w:szCs w:val="24"/>
+                            </w:rPr>
+                            <w:t>Andrei</w:t>
+                          </w:r>
+                          <w:proofErr w:type="spellEnd"/>
+                          <w:r>
+                            <w:rPr>
+                              <w:rFonts w:ascii="Calisto MT" w:hAnsi="Calisto MT"/>
+                              <w:b/>
+                              <w:bCs/>
+                              <w:sz w:val="24"/>
+                              <w:szCs w:val="24"/>
+                            </w:rPr>
+                            <w:t xml:space="preserve"> </w:t>
+                          </w:r>
+                          <w:proofErr w:type="spellStart"/>
+                          <w:r>
+                            <w:rPr>
+                              <w:rFonts w:ascii="Calisto MT" w:hAnsi="Calisto MT"/>
+                              <w:b/>
+                              <w:bCs/>
+                              <w:sz w:val="24"/>
+                              <w:szCs w:val="24"/>
+                            </w:rPr>
+                            <w:t>Stoica</w:t>
+                          </w:r>
+                          <w:proofErr w:type="spellEnd"/>
                         </w:p>
                         <w:p>
                           <w:pPr>
@@ -852,7 +964,7 @@
                             <w:pPr>
                               <w:pStyle w:val="Ttulo1"/>
                             </w:pPr>
-                            <w:bookmarkStart w:id="0" w:name="_Toc228141096"/>
+                            <w:bookmarkStart w:id="0" w:name="_Toc228146718"/>
                             <w:r>
                               <w:rPr>
                                 <w:rFonts w:ascii="Segoe UI Emoji" w:hAnsi="Segoe UI Emoji"/>
@@ -891,7 +1003,7 @@
                       <w:pPr>
                         <w:pStyle w:val="Ttulo1"/>
                       </w:pPr>
-                      <w:bookmarkStart w:id="1" w:name="_Toc228141096"/>
+                      <w:bookmarkStart w:id="1" w:name="_Toc228146718"/>
                       <w:r>
                         <w:rPr>
                           <w:rFonts w:ascii="Segoe UI Emoji" w:hAnsi="Segoe UI Emoji"/>
@@ -967,7 +1079,7 @@
           <w:r>
             <w:fldChar w:fldCharType="separate"/>
           </w:r>
-          <w:hyperlink w:anchor="_Toc228141096" w:history="1">
+          <w:hyperlink w:anchor="_Toc228146718" w:history="1">
             <w:r>
               <w:rPr>
                 <w:rStyle w:val="Hipervnculo"/>
@@ -1002,7 +1114,7 @@
                 <w:noProof/>
                 <w:webHidden/>
               </w:rPr>
-              <w:instrText xml:space="preserve"> PAGEREF _Toc228141096 \h </w:instrText>
+              <w:instrText xml:space="preserve"> PAGEREF _Toc228146718 \h </w:instrText>
             </w:r>
             <w:r>
               <w:rPr>
@@ -1049,7 +1161,7 @@
               <w14:ligatures w14:val="standardContextual"/>
             </w:rPr>
           </w:pPr>
-          <w:hyperlink w:anchor="_Toc228141097" w:history="1">
+          <w:hyperlink w:anchor="_Toc228146719" w:history="1">
             <w:r>
               <w:rPr>
                 <w:rStyle w:val="Hipervnculo"/>
@@ -1084,7 +1196,7 @@
                 <w:noProof/>
                 <w:webHidden/>
               </w:rPr>
-              <w:instrText xml:space="preserve"> PAGEREF _Toc228141097 \h </w:instrText>
+              <w:instrText xml:space="preserve"> PAGEREF _Toc228146719 \h </w:instrText>
             </w:r>
             <w:r>
               <w:rPr>
@@ -1129,7 +1241,7 @@
               <w14:ligatures w14:val="standardContextual"/>
             </w:rPr>
           </w:pPr>
-          <w:hyperlink w:anchor="_Toc228141098" w:history="1">
+          <w:hyperlink w:anchor="_Toc228146720" w:history="1">
             <w:r>
               <w:rPr>
                 <w:rStyle w:val="Hipervnculo"/>
@@ -1152,7 +1264,7 @@
               <w:rPr>
                 <w:webHidden/>
               </w:rPr>
-              <w:instrText xml:space="preserve"> PAGEREF _Toc228141098 \h </w:instrText>
+              <w:instrText xml:space="preserve"> PAGEREF _Toc228146720 \h </w:instrText>
             </w:r>
             <w:r>
               <w:rPr>
@@ -1193,7 +1305,7 @@
               <w14:ligatures w14:val="standardContextual"/>
             </w:rPr>
           </w:pPr>
-          <w:hyperlink w:anchor="_Toc228141099" w:history="1">
+          <w:hyperlink w:anchor="_Toc228146721" w:history="1">
             <w:r>
               <w:rPr>
                 <w:rStyle w:val="Hipervnculo"/>
@@ -1216,7 +1328,7 @@
               <w:rPr>
                 <w:webHidden/>
               </w:rPr>
-              <w:instrText xml:space="preserve"> PAGEREF _Toc228141099 \h </w:instrText>
+              <w:instrText xml:space="preserve"> PAGEREF _Toc228146721 \h </w:instrText>
             </w:r>
             <w:r>
               <w:rPr>
@@ -1259,7 +1371,7 @@
               <w14:ligatures w14:val="standardContextual"/>
             </w:rPr>
           </w:pPr>
-          <w:hyperlink w:anchor="_Toc228141100" w:history="1">
+          <w:hyperlink w:anchor="_Toc228146722" w:history="1">
             <w:r>
               <w:rPr>
                 <w:rStyle w:val="Hipervnculo"/>
@@ -1286,7 +1398,7 @@
                 <w:noProof/>
                 <w:webHidden/>
               </w:rPr>
-              <w:instrText xml:space="preserve"> PAGEREF _Toc228141100 \h </w:instrText>
+              <w:instrText xml:space="preserve"> PAGEREF _Toc228146722 \h </w:instrText>
             </w:r>
             <w:r>
               <w:rPr>
@@ -1333,7 +1445,7 @@
               <w14:ligatures w14:val="standardContextual"/>
             </w:rPr>
           </w:pPr>
-          <w:hyperlink w:anchor="_Toc228141101" w:history="1">
+          <w:hyperlink w:anchor="_Toc228146723" w:history="1">
             <w:r>
               <w:rPr>
                 <w:rStyle w:val="Hipervnculo"/>
@@ -1360,7 +1472,7 @@
                 <w:noProof/>
                 <w:webHidden/>
               </w:rPr>
-              <w:instrText xml:space="preserve"> PAGEREF _Toc228141101 \h </w:instrText>
+              <w:instrText xml:space="preserve"> PAGEREF _Toc228146723 \h </w:instrText>
             </w:r>
             <w:r>
               <w:rPr>
@@ -1405,7 +1517,7 @@
               <w14:ligatures w14:val="standardContextual"/>
             </w:rPr>
           </w:pPr>
-          <w:hyperlink w:anchor="_Toc228141102" w:history="1">
+          <w:hyperlink w:anchor="_Toc228146724" w:history="1">
             <w:r>
               <w:rPr>
                 <w:rStyle w:val="Hipervnculo"/>
@@ -1428,7 +1540,7 @@
               <w:rPr>
                 <w:webHidden/>
               </w:rPr>
-              <w:instrText xml:space="preserve"> PAGEREF _Toc228141102 \h </w:instrText>
+              <w:instrText xml:space="preserve"> PAGEREF _Toc228146724 \h </w:instrText>
             </w:r>
             <w:r>
               <w:rPr>
@@ -1469,7 +1581,7 @@
               <w14:ligatures w14:val="standardContextual"/>
             </w:rPr>
           </w:pPr>
-          <w:hyperlink w:anchor="_Toc228141103" w:history="1">
+          <w:hyperlink w:anchor="_Toc228146725" w:history="1">
             <w:r>
               <w:rPr>
                 <w:rStyle w:val="Hipervnculo"/>
@@ -1492,7 +1604,7 @@
               <w:rPr>
                 <w:webHidden/>
               </w:rPr>
-              <w:instrText xml:space="preserve"> PAGEREF _Toc228141103 \h </w:instrText>
+              <w:instrText xml:space="preserve"> PAGEREF _Toc228146725 \h </w:instrText>
             </w:r>
             <w:r>
               <w:rPr>
@@ -1535,7 +1647,7 @@
               <w14:ligatures w14:val="standardContextual"/>
             </w:rPr>
           </w:pPr>
-          <w:hyperlink w:anchor="_Toc228141104" w:history="1">
+          <w:hyperlink w:anchor="_Toc228146726" w:history="1">
             <w:r>
               <w:rPr>
                 <w:rStyle w:val="Hipervnculo"/>
@@ -1562,7 +1674,7 @@
                 <w:noProof/>
                 <w:webHidden/>
               </w:rPr>
-              <w:instrText xml:space="preserve"> PAGEREF _Toc228141104 \h </w:instrText>
+              <w:instrText xml:space="preserve"> PAGEREF _Toc228146726 \h </w:instrText>
             </w:r>
             <w:r>
               <w:rPr>
@@ -1609,7 +1721,7 @@
               <w14:ligatures w14:val="standardContextual"/>
             </w:rPr>
           </w:pPr>
-          <w:hyperlink w:anchor="_Toc228141105" w:history="1">
+          <w:hyperlink w:anchor="_Toc228146727" w:history="1">
             <w:r>
               <w:rPr>
                 <w:rStyle w:val="Hipervnculo"/>
@@ -1636,7 +1748,7 @@
                 <w:noProof/>
                 <w:webHidden/>
               </w:rPr>
-              <w:instrText xml:space="preserve"> PAGEREF _Toc228141105 \h </w:instrText>
+              <w:instrText xml:space="preserve"> PAGEREF _Toc228146727 \h </w:instrText>
             </w:r>
             <w:r>
               <w:rPr>
@@ -1683,7 +1795,7 @@
               <w14:ligatures w14:val="standardContextual"/>
             </w:rPr>
           </w:pPr>
-          <w:hyperlink w:anchor="_Toc228141106" w:history="1">
+          <w:hyperlink w:anchor="_Toc228146728" w:history="1">
             <w:r>
               <w:rPr>
                 <w:rStyle w:val="Hipervnculo"/>
@@ -1710,7 +1822,7 @@
                 <w:noProof/>
                 <w:webHidden/>
               </w:rPr>
-              <w:instrText xml:space="preserve"> PAGEREF _Toc228141106 \h </w:instrText>
+              <w:instrText xml:space="preserve"> PAGEREF _Toc228146728 \h </w:instrText>
             </w:r>
             <w:r>
               <w:rPr>
@@ -1731,6 +1843,726 @@
                 <w:webHidden/>
               </w:rPr>
               <w:t>14</w:t>
+            </w:r>
+            <w:r>
+              <w:rPr>
+                <w:noProof/>
+                <w:webHidden/>
+              </w:rPr>
+              <w:fldChar w:fldCharType="end"/>
+            </w:r>
+          </w:hyperlink>
+        </w:p>
+        <w:p>
+          <w:pPr>
+            <w:pStyle w:val="TDC3"/>
+            <w:tabs>
+              <w:tab w:val="right" w:leader="dot" w:pos="8494"/>
+            </w:tabs>
+            <w:rPr>
+              <w:rFonts w:eastAsiaTheme="minorEastAsia"/>
+              <w:noProof/>
+              <w:kern w:val="2"/>
+              <w:sz w:val="24"/>
+              <w:szCs w:val="24"/>
+              <w:lang w:eastAsia="es-ES"/>
+              <w14:ligatures w14:val="standardContextual"/>
+            </w:rPr>
+          </w:pPr>
+          <w:hyperlink w:anchor="_Toc228146729" w:history="1">
+            <w:r>
+              <w:rPr>
+                <w:rStyle w:val="Hipervnculo"/>
+                <w:noProof/>
+              </w:rPr>
+              <w:t>Otros casos de uso</w:t>
+            </w:r>
+            <w:r>
+              <w:rPr>
+                <w:noProof/>
+                <w:webHidden/>
+              </w:rPr>
+              <w:tab/>
+            </w:r>
+            <w:r>
+              <w:rPr>
+                <w:noProof/>
+                <w:webHidden/>
+              </w:rPr>
+              <w:fldChar w:fldCharType="begin"/>
+            </w:r>
+            <w:r>
+              <w:rPr>
+                <w:noProof/>
+                <w:webHidden/>
+              </w:rPr>
+              <w:instrText xml:space="preserve"> PAGEREF _Toc228146729 \h </w:instrText>
+            </w:r>
+            <w:r>
+              <w:rPr>
+                <w:noProof/>
+                <w:webHidden/>
+              </w:rPr>
+            </w:r>
+            <w:r>
+              <w:rPr>
+                <w:noProof/>
+                <w:webHidden/>
+              </w:rPr>
+              <w:fldChar w:fldCharType="separate"/>
+            </w:r>
+            <w:r>
+              <w:rPr>
+                <w:noProof/>
+                <w:webHidden/>
+              </w:rPr>
+              <w:t>16</w:t>
+            </w:r>
+            <w:r>
+              <w:rPr>
+                <w:noProof/>
+                <w:webHidden/>
+              </w:rPr>
+              <w:fldChar w:fldCharType="end"/>
+            </w:r>
+          </w:hyperlink>
+        </w:p>
+        <w:p>
+          <w:pPr>
+            <w:pStyle w:val="TDC2"/>
+            <w:rPr>
+              <w:rFonts w:eastAsiaTheme="minorEastAsia"/>
+              <w:b w:val="0"/>
+              <w:bCs w:val="0"/>
+              <w:kern w:val="2"/>
+              <w:sz w:val="24"/>
+              <w:szCs w:val="24"/>
+              <w:lang w:eastAsia="es-ES"/>
+              <w14:ligatures w14:val="standardContextual"/>
+            </w:rPr>
+          </w:pPr>
+          <w:hyperlink w:anchor="_Toc228146730" w:history="1">
+            <w:r>
+              <w:rPr>
+                <w:rStyle w:val="Hipervnculo"/>
+              </w:rPr>
+              <w:t>Justificación de Casos de Uso</w:t>
+            </w:r>
+            <w:r>
+              <w:rPr>
+                <w:webHidden/>
+              </w:rPr>
+              <w:tab/>
+            </w:r>
+            <w:r>
+              <w:rPr>
+                <w:webHidden/>
+              </w:rPr>
+              <w:fldChar w:fldCharType="begin"/>
+            </w:r>
+            <w:r>
+              <w:rPr>
+                <w:webHidden/>
+              </w:rPr>
+              <w:instrText xml:space="preserve"> PAGEREF _Toc228146730 \h </w:instrText>
+            </w:r>
+            <w:r>
+              <w:rPr>
+                <w:webHidden/>
+              </w:rPr>
+            </w:r>
+            <w:r>
+              <w:rPr>
+                <w:webHidden/>
+              </w:rPr>
+              <w:fldChar w:fldCharType="separate"/>
+            </w:r>
+            <w:r>
+              <w:rPr>
+                <w:webHidden/>
+              </w:rPr>
+              <w:t>17</w:t>
+            </w:r>
+            <w:r>
+              <w:rPr>
+                <w:webHidden/>
+              </w:rPr>
+              <w:fldChar w:fldCharType="end"/>
+            </w:r>
+          </w:hyperlink>
+        </w:p>
+        <w:p>
+          <w:pPr>
+            <w:pStyle w:val="TDC3"/>
+            <w:tabs>
+              <w:tab w:val="right" w:leader="dot" w:pos="8494"/>
+            </w:tabs>
+            <w:rPr>
+              <w:rFonts w:eastAsiaTheme="minorEastAsia"/>
+              <w:noProof/>
+              <w:kern w:val="2"/>
+              <w:sz w:val="24"/>
+              <w:szCs w:val="24"/>
+              <w:lang w:eastAsia="es-ES"/>
+              <w14:ligatures w14:val="standardContextual"/>
+            </w:rPr>
+          </w:pPr>
+          <w:hyperlink w:anchor="_Toc228146731" w:history="1">
+            <w:r>
+              <w:rPr>
+                <w:rStyle w:val="Hipervnculo"/>
+                <w:noProof/>
+              </w:rPr>
+              <w:t>Casos de uso Principales</w:t>
+            </w:r>
+            <w:r>
+              <w:rPr>
+                <w:noProof/>
+                <w:webHidden/>
+              </w:rPr>
+              <w:tab/>
+            </w:r>
+            <w:r>
+              <w:rPr>
+                <w:noProof/>
+                <w:webHidden/>
+              </w:rPr>
+              <w:fldChar w:fldCharType="begin"/>
+            </w:r>
+            <w:r>
+              <w:rPr>
+                <w:noProof/>
+                <w:webHidden/>
+              </w:rPr>
+              <w:instrText xml:space="preserve"> PAGEREF _Toc228146731 \h </w:instrText>
+            </w:r>
+            <w:r>
+              <w:rPr>
+                <w:noProof/>
+                <w:webHidden/>
+              </w:rPr>
+            </w:r>
+            <w:r>
+              <w:rPr>
+                <w:noProof/>
+                <w:webHidden/>
+              </w:rPr>
+              <w:fldChar w:fldCharType="separate"/>
+            </w:r>
+            <w:r>
+              <w:rPr>
+                <w:noProof/>
+                <w:webHidden/>
+              </w:rPr>
+              <w:t>17</w:t>
+            </w:r>
+            <w:r>
+              <w:rPr>
+                <w:noProof/>
+                <w:webHidden/>
+              </w:rPr>
+              <w:fldChar w:fldCharType="end"/>
+            </w:r>
+          </w:hyperlink>
+        </w:p>
+        <w:p>
+          <w:pPr>
+            <w:pStyle w:val="TDC3"/>
+            <w:tabs>
+              <w:tab w:val="right" w:leader="dot" w:pos="8494"/>
+            </w:tabs>
+            <w:rPr>
+              <w:rFonts w:eastAsiaTheme="minorEastAsia"/>
+              <w:noProof/>
+              <w:kern w:val="2"/>
+              <w:sz w:val="24"/>
+              <w:szCs w:val="24"/>
+              <w:lang w:eastAsia="es-ES"/>
+              <w14:ligatures w14:val="standardContextual"/>
+            </w:rPr>
+          </w:pPr>
+          <w:hyperlink w:anchor="_Toc228146732" w:history="1">
+            <w:r>
+              <w:rPr>
+                <w:rStyle w:val="Hipervnculo"/>
+                <w:noProof/>
+              </w:rPr>
+              <w:t>Casos de Uso Secundarios debido a subpasos</w:t>
+            </w:r>
+            <w:r>
+              <w:rPr>
+                <w:noProof/>
+                <w:webHidden/>
+              </w:rPr>
+              <w:tab/>
+            </w:r>
+            <w:r>
+              <w:rPr>
+                <w:noProof/>
+                <w:webHidden/>
+              </w:rPr>
+              <w:fldChar w:fldCharType="begin"/>
+            </w:r>
+            <w:r>
+              <w:rPr>
+                <w:noProof/>
+                <w:webHidden/>
+              </w:rPr>
+              <w:instrText xml:space="preserve"> PAGEREF _Toc228146732 \h </w:instrText>
+            </w:r>
+            <w:r>
+              <w:rPr>
+                <w:noProof/>
+                <w:webHidden/>
+              </w:rPr>
+            </w:r>
+            <w:r>
+              <w:rPr>
+                <w:noProof/>
+                <w:webHidden/>
+              </w:rPr>
+              <w:fldChar w:fldCharType="separate"/>
+            </w:r>
+            <w:r>
+              <w:rPr>
+                <w:noProof/>
+                <w:webHidden/>
+              </w:rPr>
+              <w:t>18</w:t>
+            </w:r>
+            <w:r>
+              <w:rPr>
+                <w:noProof/>
+                <w:webHidden/>
+              </w:rPr>
+              <w:fldChar w:fldCharType="end"/>
+            </w:r>
+          </w:hyperlink>
+        </w:p>
+        <w:p>
+          <w:pPr>
+            <w:pStyle w:val="TDC3"/>
+            <w:tabs>
+              <w:tab w:val="right" w:leader="dot" w:pos="8494"/>
+            </w:tabs>
+            <w:rPr>
+              <w:rFonts w:eastAsiaTheme="minorEastAsia"/>
+              <w:noProof/>
+              <w:kern w:val="2"/>
+              <w:sz w:val="24"/>
+              <w:szCs w:val="24"/>
+              <w:lang w:eastAsia="es-ES"/>
+              <w14:ligatures w14:val="standardContextual"/>
+            </w:rPr>
+          </w:pPr>
+          <w:hyperlink w:anchor="_Toc228146733" w:history="1">
+            <w:r>
+              <w:rPr>
+                <w:rStyle w:val="Hipervnculo"/>
+                <w:noProof/>
+              </w:rPr>
+              <w:t>Casos de Uso Secundarios debido a especialización</w:t>
+            </w:r>
+            <w:r>
+              <w:rPr>
+                <w:noProof/>
+                <w:webHidden/>
+              </w:rPr>
+              <w:tab/>
+            </w:r>
+            <w:r>
+              <w:rPr>
+                <w:noProof/>
+                <w:webHidden/>
+              </w:rPr>
+              <w:fldChar w:fldCharType="begin"/>
+            </w:r>
+            <w:r>
+              <w:rPr>
+                <w:noProof/>
+                <w:webHidden/>
+              </w:rPr>
+              <w:instrText xml:space="preserve"> PAGEREF _Toc228146733 \h </w:instrText>
+            </w:r>
+            <w:r>
+              <w:rPr>
+                <w:noProof/>
+                <w:webHidden/>
+              </w:rPr>
+            </w:r>
+            <w:r>
+              <w:rPr>
+                <w:noProof/>
+                <w:webHidden/>
+              </w:rPr>
+              <w:fldChar w:fldCharType="separate"/>
+            </w:r>
+            <w:r>
+              <w:rPr>
+                <w:noProof/>
+                <w:webHidden/>
+              </w:rPr>
+              <w:t>18</w:t>
+            </w:r>
+            <w:r>
+              <w:rPr>
+                <w:noProof/>
+                <w:webHidden/>
+              </w:rPr>
+              <w:fldChar w:fldCharType="end"/>
+            </w:r>
+          </w:hyperlink>
+        </w:p>
+        <w:p>
+          <w:pPr>
+            <w:pStyle w:val="TDC3"/>
+            <w:tabs>
+              <w:tab w:val="right" w:leader="dot" w:pos="8494"/>
+            </w:tabs>
+            <w:rPr>
+              <w:rFonts w:eastAsiaTheme="minorEastAsia"/>
+              <w:noProof/>
+              <w:kern w:val="2"/>
+              <w:sz w:val="24"/>
+              <w:szCs w:val="24"/>
+              <w:lang w:eastAsia="es-ES"/>
+              <w14:ligatures w14:val="standardContextual"/>
+            </w:rPr>
+          </w:pPr>
+          <w:hyperlink w:anchor="_Toc228146734" w:history="1">
+            <w:r>
+              <w:rPr>
+                <w:rStyle w:val="Hipervnculo"/>
+                <w:noProof/>
+              </w:rPr>
+              <w:t>Casos de Uso Secundarios debido a uso común</w:t>
+            </w:r>
+            <w:r>
+              <w:rPr>
+                <w:noProof/>
+                <w:webHidden/>
+              </w:rPr>
+              <w:tab/>
+            </w:r>
+            <w:r>
+              <w:rPr>
+                <w:noProof/>
+                <w:webHidden/>
+              </w:rPr>
+              <w:fldChar w:fldCharType="begin"/>
+            </w:r>
+            <w:r>
+              <w:rPr>
+                <w:noProof/>
+                <w:webHidden/>
+              </w:rPr>
+              <w:instrText xml:space="preserve"> PAGEREF _Toc228146734 \h </w:instrText>
+            </w:r>
+            <w:r>
+              <w:rPr>
+                <w:noProof/>
+                <w:webHidden/>
+              </w:rPr>
+            </w:r>
+            <w:r>
+              <w:rPr>
+                <w:noProof/>
+                <w:webHidden/>
+              </w:rPr>
+              <w:fldChar w:fldCharType="separate"/>
+            </w:r>
+            <w:r>
+              <w:rPr>
+                <w:noProof/>
+                <w:webHidden/>
+              </w:rPr>
+              <w:t>19</w:t>
+            </w:r>
+            <w:r>
+              <w:rPr>
+                <w:noProof/>
+                <w:webHidden/>
+              </w:rPr>
+              <w:fldChar w:fldCharType="end"/>
+            </w:r>
+          </w:hyperlink>
+        </w:p>
+        <w:p>
+          <w:pPr>
+            <w:pStyle w:val="TDC2"/>
+            <w:rPr>
+              <w:rFonts w:eastAsiaTheme="minorEastAsia"/>
+              <w:b w:val="0"/>
+              <w:bCs w:val="0"/>
+              <w:kern w:val="2"/>
+              <w:sz w:val="24"/>
+              <w:szCs w:val="24"/>
+              <w:lang w:eastAsia="es-ES"/>
+              <w14:ligatures w14:val="standardContextual"/>
+            </w:rPr>
+          </w:pPr>
+          <w:hyperlink w:anchor="_Toc228146735" w:history="1">
+            <w:r>
+              <w:rPr>
+                <w:rStyle w:val="Hipervnculo"/>
+              </w:rPr>
+              <w:t>Relaciones entre Casos de Uso</w:t>
+            </w:r>
+            <w:r>
+              <w:rPr>
+                <w:webHidden/>
+              </w:rPr>
+              <w:tab/>
+            </w:r>
+            <w:r>
+              <w:rPr>
+                <w:webHidden/>
+              </w:rPr>
+              <w:fldChar w:fldCharType="begin"/>
+            </w:r>
+            <w:r>
+              <w:rPr>
+                <w:webHidden/>
+              </w:rPr>
+              <w:instrText xml:space="preserve"> PAGEREF _Toc228146735 \h </w:instrText>
+            </w:r>
+            <w:r>
+              <w:rPr>
+                <w:webHidden/>
+              </w:rPr>
+            </w:r>
+            <w:r>
+              <w:rPr>
+                <w:webHidden/>
+              </w:rPr>
+              <w:fldChar w:fldCharType="separate"/>
+            </w:r>
+            <w:r>
+              <w:rPr>
+                <w:webHidden/>
+              </w:rPr>
+              <w:t>20</w:t>
+            </w:r>
+            <w:r>
+              <w:rPr>
+                <w:webHidden/>
+              </w:rPr>
+              <w:fldChar w:fldCharType="end"/>
+            </w:r>
+          </w:hyperlink>
+        </w:p>
+        <w:p>
+          <w:pPr>
+            <w:pStyle w:val="TDC3"/>
+            <w:tabs>
+              <w:tab w:val="right" w:leader="dot" w:pos="8494"/>
+            </w:tabs>
+            <w:rPr>
+              <w:rFonts w:eastAsiaTheme="minorEastAsia"/>
+              <w:noProof/>
+              <w:kern w:val="2"/>
+              <w:sz w:val="24"/>
+              <w:szCs w:val="24"/>
+              <w:lang w:eastAsia="es-ES"/>
+              <w14:ligatures w14:val="standardContextual"/>
+            </w:rPr>
+          </w:pPr>
+          <w:hyperlink w:anchor="_Toc228146736" w:history="1">
+            <w:r>
+              <w:rPr>
+                <w:rStyle w:val="Hipervnculo"/>
+                <w:noProof/>
+              </w:rPr>
+              <w:t>Relaciones &lt;&lt;Include&gt;&gt;</w:t>
+            </w:r>
+            <w:r>
+              <w:rPr>
+                <w:noProof/>
+                <w:webHidden/>
+              </w:rPr>
+              <w:tab/>
+            </w:r>
+            <w:r>
+              <w:rPr>
+                <w:noProof/>
+                <w:webHidden/>
+              </w:rPr>
+              <w:fldChar w:fldCharType="begin"/>
+            </w:r>
+            <w:r>
+              <w:rPr>
+                <w:noProof/>
+                <w:webHidden/>
+              </w:rPr>
+              <w:instrText xml:space="preserve"> PAGEREF _Toc228146736 \h </w:instrText>
+            </w:r>
+            <w:r>
+              <w:rPr>
+                <w:noProof/>
+                <w:webHidden/>
+              </w:rPr>
+            </w:r>
+            <w:r>
+              <w:rPr>
+                <w:noProof/>
+                <w:webHidden/>
+              </w:rPr>
+              <w:fldChar w:fldCharType="separate"/>
+            </w:r>
+            <w:r>
+              <w:rPr>
+                <w:noProof/>
+                <w:webHidden/>
+              </w:rPr>
+              <w:t>20</w:t>
+            </w:r>
+            <w:r>
+              <w:rPr>
+                <w:noProof/>
+                <w:webHidden/>
+              </w:rPr>
+              <w:fldChar w:fldCharType="end"/>
+            </w:r>
+          </w:hyperlink>
+        </w:p>
+        <w:p>
+          <w:pPr>
+            <w:pStyle w:val="TDC3"/>
+            <w:tabs>
+              <w:tab w:val="right" w:leader="dot" w:pos="8494"/>
+            </w:tabs>
+            <w:rPr>
+              <w:rFonts w:eastAsiaTheme="minorEastAsia"/>
+              <w:noProof/>
+              <w:kern w:val="2"/>
+              <w:sz w:val="24"/>
+              <w:szCs w:val="24"/>
+              <w:lang w:eastAsia="es-ES"/>
+              <w14:ligatures w14:val="standardContextual"/>
+            </w:rPr>
+          </w:pPr>
+          <w:hyperlink w:anchor="_Toc228146737" w:history="1">
+            <w:r>
+              <w:rPr>
+                <w:rStyle w:val="Hipervnculo"/>
+                <w:noProof/>
+              </w:rPr>
+              <w:t>Relaciones &lt;&lt;extend&gt;&gt;</w:t>
+            </w:r>
+            <w:r>
+              <w:rPr>
+                <w:noProof/>
+                <w:webHidden/>
+              </w:rPr>
+              <w:tab/>
+            </w:r>
+            <w:r>
+              <w:rPr>
+                <w:noProof/>
+                <w:webHidden/>
+              </w:rPr>
+              <w:fldChar w:fldCharType="begin"/>
+            </w:r>
+            <w:r>
+              <w:rPr>
+                <w:noProof/>
+                <w:webHidden/>
+              </w:rPr>
+              <w:instrText xml:space="preserve"> PAGEREF _Toc228146737 \h </w:instrText>
+            </w:r>
+            <w:r>
+              <w:rPr>
+                <w:noProof/>
+                <w:webHidden/>
+              </w:rPr>
+            </w:r>
+            <w:r>
+              <w:rPr>
+                <w:noProof/>
+                <w:webHidden/>
+              </w:rPr>
+              <w:fldChar w:fldCharType="separate"/>
+            </w:r>
+            <w:r>
+              <w:rPr>
+                <w:noProof/>
+                <w:webHidden/>
+              </w:rPr>
+              <w:t>20</w:t>
+            </w:r>
+            <w:r>
+              <w:rPr>
+                <w:noProof/>
+                <w:webHidden/>
+              </w:rPr>
+              <w:fldChar w:fldCharType="end"/>
+            </w:r>
+          </w:hyperlink>
+        </w:p>
+        <w:p>
+          <w:pPr>
+            <w:pStyle w:val="TDC3"/>
+            <w:tabs>
+              <w:tab w:val="right" w:leader="dot" w:pos="8494"/>
+            </w:tabs>
+            <w:rPr>
+              <w:rFonts w:eastAsiaTheme="minorEastAsia"/>
+              <w:noProof/>
+              <w:kern w:val="2"/>
+              <w:sz w:val="24"/>
+              <w:szCs w:val="24"/>
+              <w:lang w:eastAsia="es-ES"/>
+              <w14:ligatures w14:val="standardContextual"/>
+            </w:rPr>
+          </w:pPr>
+          <w:hyperlink w:anchor="_Toc228146738" w:history="1">
+            <w:r>
+              <w:rPr>
+                <w:rStyle w:val="Hipervnculo"/>
+                <w:noProof/>
+              </w:rPr>
+              <w:t>Relaciones de especialización</w:t>
+            </w:r>
+            <w:r>
+              <w:rPr>
+                <w:noProof/>
+                <w:webHidden/>
+              </w:rPr>
+              <w:tab/>
+            </w:r>
+            <w:r>
+              <w:rPr>
+                <w:noProof/>
+                <w:webHidden/>
+              </w:rPr>
+              <w:fldChar w:fldCharType="begin"/>
+            </w:r>
+            <w:r>
+              <w:rPr>
+                <w:noProof/>
+                <w:webHidden/>
+              </w:rPr>
+              <w:instrText xml:space="preserve"> PAGEREF _Toc228146738 \h </w:instrText>
+            </w:r>
+            <w:r>
+              <w:rPr>
+                <w:noProof/>
+                <w:webHidden/>
+              </w:rPr>
+            </w:r>
+            <w:r>
+              <w:rPr>
+                <w:noProof/>
+                <w:webHidden/>
+              </w:rPr>
+              <w:fldChar w:fldCharType="separate"/>
+            </w:r>
+            <w:r>
+              <w:rPr>
+                <w:noProof/>
+                <w:webHidden/>
+              </w:rPr>
+              <w:t>21</w:t>
             </w:r>
             <w:r>
               <w:rPr>
@@ -1815,7 +2647,7 @@
                             <w:bookmarkStart w:id="2" w:name="_Toc201837460"/>
                             <w:bookmarkStart w:id="3" w:name="_Toc201837471"/>
                             <w:bookmarkStart w:id="4" w:name="_Toc201837593"/>
-                            <w:bookmarkStart w:id="5" w:name="_Toc228141097"/>
+                            <w:bookmarkStart w:id="5" w:name="_Toc228146719"/>
                             <w:r>
                               <w:rPr>
                                 <w:rFonts w:ascii="Segoe UI Emoji" w:hAnsi="Segoe UI Emoji"/>
@@ -1860,7 +2692,7 @@
                       <w:bookmarkStart w:id="6" w:name="_Toc201837460"/>
                       <w:bookmarkStart w:id="7" w:name="_Toc201837471"/>
                       <w:bookmarkStart w:id="8" w:name="_Toc201837593"/>
-                      <w:bookmarkStart w:id="9" w:name="_Toc228141097"/>
+                      <w:bookmarkStart w:id="9" w:name="_Toc228146719"/>
                       <w:r>
                         <w:rPr>
                           <w:rFonts w:ascii="Segoe UI Emoji" w:hAnsi="Segoe UI Emoji"/>
@@ -1891,7 +2723,7 @@
       <w:pPr>
         <w:pStyle w:val="Ttulo2"/>
       </w:pPr>
-      <w:bookmarkStart w:id="10" w:name="_Toc228141098"/>
+      <w:bookmarkStart w:id="10" w:name="_Toc228146720"/>
       <w:r>
         <w:lastRenderedPageBreak/>
         <w:t>Propósito del Sistema</w:t>
@@ -1934,7 +2766,7 @@
       <w:pPr>
         <w:pStyle w:val="Ttulo2"/>
       </w:pPr>
-      <w:bookmarkStart w:id="11" w:name="_Toc228141099"/>
+      <w:bookmarkStart w:id="11" w:name="_Toc228146721"/>
       <w:r>
         <w:t>ACTORES</w:t>
       </w:r>
@@ -2206,7 +3038,7 @@
       <w:pPr>
         <w:pStyle w:val="Ttulo3"/>
       </w:pPr>
-      <w:bookmarkStart w:id="12" w:name="_Toc228141100"/>
+      <w:bookmarkStart w:id="12" w:name="_Toc228146722"/>
       <w:r>
         <w:t xml:space="preserve">¿Por qué </w:t>
       </w:r>
@@ -2252,7 +3084,7 @@
       <w:pPr>
         <w:pStyle w:val="Ttulo3"/>
       </w:pPr>
-      <w:bookmarkStart w:id="13" w:name="_Toc228141101"/>
+      <w:bookmarkStart w:id="13" w:name="_Toc228146723"/>
       <w:r>
         <w:lastRenderedPageBreak/>
         <w:t>Imagen de la jerarquía de generalización de los actores</w:t>
@@ -2320,7 +3152,7 @@
       <w:pPr>
         <w:pStyle w:val="Ttulo2"/>
       </w:pPr>
-      <w:bookmarkStart w:id="14" w:name="_Toc228141102"/>
+      <w:bookmarkStart w:id="14" w:name="_Toc228146724"/>
       <w:r>
         <w:lastRenderedPageBreak/>
         <w:t>Diagrama de Casos de Uso</w:t>
@@ -2417,7 +3249,7 @@
       <w:pPr>
         <w:pStyle w:val="Ttulo2"/>
       </w:pPr>
-      <w:bookmarkStart w:id="15" w:name="_Toc228141103"/>
+      <w:bookmarkStart w:id="15" w:name="_Toc228146725"/>
       <w:r>
         <w:lastRenderedPageBreak/>
         <w:t xml:space="preserve">Fichas Descriptivas </w:t>
@@ -2434,7 +3266,7 @@
       <w:pPr>
         <w:pStyle w:val="Ttulo3"/>
       </w:pPr>
-      <w:bookmarkStart w:id="16" w:name="_Toc228141104"/>
+      <w:bookmarkStart w:id="16" w:name="_Toc228146726"/>
       <w:r>
         <w:t>Gestión de Asignación y Traslados</w:t>
       </w:r>
@@ -4219,13 +5051,10 @@
       <w:pPr>
         <w:pStyle w:val="Ttulo3"/>
       </w:pPr>
-      <w:bookmarkStart w:id="17" w:name="_Toc228141105"/>
+      <w:bookmarkStart w:id="17" w:name="_Toc228146727"/>
       <w:r>
         <w:lastRenderedPageBreak/>
-        <w:t xml:space="preserve">Seguimiento </w:t>
-      </w:r>
-      <w:r>
-        <w:t>Clínico</w:t>
+        <w:t>Seguimiento Clínico</w:t>
       </w:r>
       <w:bookmarkEnd w:id="17"/>
     </w:p>
@@ -4807,10 +5636,7 @@
               <w:spacing w:before="120"/>
             </w:pPr>
             <w:r>
-              <w:t xml:space="preserve">El actor podrá </w:t>
-            </w:r>
-            <w:r>
-              <w:t>registrar el cambio de los tratamientos que se le deben suministrar a un paciente</w:t>
+              <w:t>El actor podrá registrar el cambio de los tratamientos que se le deben suministrar a un paciente</w:t>
             </w:r>
             <w:r>
               <w:t xml:space="preserve"> al registrar una ronda medica diaria</w:t>
@@ -5040,7 +5866,7 @@
       <w:pPr>
         <w:pStyle w:val="Ttulo3"/>
       </w:pPr>
-      <w:bookmarkStart w:id="18" w:name="_Toc228141106"/>
+      <w:bookmarkStart w:id="18" w:name="_Toc228146728"/>
       <w:r>
         <w:lastRenderedPageBreak/>
         <w:t>Gestión de Altas</w:t>
@@ -5253,7 +6079,15 @@
               <w:t xml:space="preserve">.- El sistema </w:t>
             </w:r>
             <w:r>
-              <w:t>muestra una lista de los pacientes, cuya ultima ronda medica registrada marquen que están listos para que le confirmen la evaluación final.</w:t>
+              <w:t xml:space="preserve">muestra una lista de los pacientes, cuya </w:t>
+            </w:r>
+            <w:proofErr w:type="spellStart"/>
+            <w:r>
+              <w:t>ultima</w:t>
+            </w:r>
+            <w:proofErr w:type="spellEnd"/>
+            <w:r>
+              <w:t xml:space="preserve"> ronda medica registrada marquen que están listos para que le confirmen la evaluación final.</w:t>
             </w:r>
           </w:p>
           <w:p>
@@ -5329,13 +6163,7 @@
               <w:spacing w:before="120"/>
             </w:pPr>
             <w:r>
-              <w:t xml:space="preserve">1.A.- Si no hay pacientes donde </w:t>
-            </w:r>
-            <w:r>
-              <w:t>su última ronda médica registrada marquen que están listos para confirmar la evaluación final</w:t>
-            </w:r>
-            <w:r>
-              <w:t>, se le avisara.</w:t>
+              <w:t>1.A.- Si no hay pacientes donde su última ronda médica registrada marquen que están listos para confirmar la evaluación final, se le avisara.</w:t>
             </w:r>
           </w:p>
           <w:p>
@@ -5538,10 +6366,7 @@
               <w:spacing w:before="120"/>
             </w:pPr>
             <w:r>
-              <w:t xml:space="preserve">El actor </w:t>
-            </w:r>
-            <w:r>
-              <w:t>documentar las altas de los pacientes que fueron dados de alta.</w:t>
+              <w:t>El actor documentar las altas de los pacientes que fueron dados de alta.</w:t>
             </w:r>
           </w:p>
           <w:p/>
@@ -5574,10 +6399,7 @@
               <w:spacing w:before="120"/>
             </w:pPr>
             <w:r>
-              <w:t xml:space="preserve">Debe </w:t>
-            </w:r>
-            <w:r>
-              <w:t>haber pacientes que hayan sido dados de alta por recuperación o traslado</w:t>
+              <w:t>Debe haber pacientes que hayan sido dados de alta por recuperación o traslado</w:t>
             </w:r>
             <w:r>
               <w:t xml:space="preserve"> en algún ingreso.</w:t>
@@ -5736,13 +6558,7 @@
               <w:spacing w:before="120"/>
             </w:pPr>
             <w:r>
-              <w:t xml:space="preserve">1.A.- Si no hay </w:t>
-            </w:r>
-            <w:r>
-              <w:t>ningún paciente al que documentarle las altas, se le avisara al actor</w:t>
-            </w:r>
-            <w:r>
-              <w:t>.</w:t>
+              <w:t>1.A.- Si no hay ningún paciente al que documentarle las altas, se le avisara al actor.</w:t>
             </w:r>
           </w:p>
           <w:p>
@@ -5813,10 +6629,12 @@
       <w:pPr>
         <w:pStyle w:val="Ttulo3"/>
       </w:pPr>
+      <w:bookmarkStart w:id="19" w:name="_Toc228146729"/>
       <w:r>
         <w:lastRenderedPageBreak/>
         <w:t>Otros casos de uso</w:t>
       </w:r>
+      <w:bookmarkEnd w:id="19"/>
     </w:p>
     <w:tbl>
       <w:tblPr>
@@ -5941,13 +6759,7 @@
               <w:spacing w:before="120"/>
             </w:pPr>
             <w:r>
-              <w:t xml:space="preserve">El actor </w:t>
-            </w:r>
-            <w:r>
-              <w:t>entra al sistema eligiendo un rol</w:t>
-            </w:r>
-            <w:r>
-              <w:t>.</w:t>
+              <w:t>El actor entra al sistema eligiendo un rol.</w:t>
             </w:r>
           </w:p>
           <w:p/>
@@ -6140,18 +6952,22 @@
       <w:pPr>
         <w:pStyle w:val="Ttulo2"/>
       </w:pPr>
+      <w:bookmarkStart w:id="20" w:name="_Toc228146730"/>
       <w:r>
         <w:lastRenderedPageBreak/>
         <w:t>Justificación de Casos de Uso</w:t>
       </w:r>
+      <w:bookmarkEnd w:id="20"/>
     </w:p>
     <w:p>
       <w:pPr>
-        <w:pStyle w:val="Ttulo4"/>
-      </w:pPr>
+        <w:pStyle w:val="Ttulo3"/>
+      </w:pPr>
+      <w:bookmarkStart w:id="21" w:name="_Toc228146731"/>
       <w:r>
         <w:t>Casos de uso Principales</w:t>
       </w:r>
+      <w:bookmarkEnd w:id="21"/>
     </w:p>
     <w:p>
       <w:pPr>
@@ -6253,15 +7069,20 @@
     </w:p>
     <w:p>
       <w:pPr>
-        <w:pStyle w:val="Ttulo4"/>
-      </w:pPr>
+        <w:pStyle w:val="Ttulo3"/>
+        <w:jc w:val="both"/>
+      </w:pPr>
+      <w:bookmarkStart w:id="22" w:name="_Toc228146732"/>
       <w:r>
         <w:lastRenderedPageBreak/>
         <w:t xml:space="preserve">Casos de Uso Secundarios debido a </w:t>
       </w:r>
+      <w:proofErr w:type="spellStart"/>
       <w:r>
         <w:t>subpasos</w:t>
       </w:r>
+      <w:bookmarkEnd w:id="22"/>
+      <w:proofErr w:type="spellEnd"/>
     </w:p>
     <w:p>
       <w:pPr>
@@ -6279,7 +7100,23 @@
         <w:t>Cuando en un caso de uso principal</w:t>
       </w:r>
       <w:r>
-        <w:t xml:space="preserve">, la acción directa del actor divide un paso en subpasos relacionados, es señal de que deberíamos sacar un caso secundario representando esa acción que genera subpasos. </w:t>
+        <w:t xml:space="preserve">, la acción directa del actor divide un paso en </w:t>
+      </w:r>
+      <w:proofErr w:type="spellStart"/>
+      <w:r>
+        <w:t>subpasos</w:t>
+      </w:r>
+      <w:proofErr w:type="spellEnd"/>
+      <w:r>
+        <w:t xml:space="preserve"> relacionados, es señal de que deberíamos sacar un caso secundario representando esa acción que genera </w:t>
+      </w:r>
+      <w:proofErr w:type="spellStart"/>
+      <w:r>
+        <w:t>subpasos</w:t>
+      </w:r>
+      <w:proofErr w:type="spellEnd"/>
+      <w:r>
+        <w:t xml:space="preserve">. </w:t>
       </w:r>
     </w:p>
     <w:p>
@@ -6295,6 +7132,9 @@
         <w:jc w:val="both"/>
       </w:pPr>
       <w:r>
+        <w:rPr>
+          <w:noProof/>
+        </w:rPr>
         <w:drawing>
           <wp:inline distT="0" distB="0" distL="0" distR="0" wp14:anchorId="4FD5645A" wp14:editId="3B892663">
             <wp:extent cx="5400040" cy="884555"/>
@@ -6339,8 +7179,10 @@
     </w:p>
     <w:p>
       <w:pPr>
-        <w:pStyle w:val="Ttulo4"/>
-      </w:pPr>
+        <w:pStyle w:val="Ttulo3"/>
+        <w:jc w:val="both"/>
+      </w:pPr>
+      <w:bookmarkStart w:id="23" w:name="_Toc228146733"/>
       <w:r>
         <w:t xml:space="preserve">Casos de </w:t>
       </w:r>
@@ -6356,6 +7198,7 @@
       <w:r>
         <w:t>especialización</w:t>
       </w:r>
+      <w:bookmarkEnd w:id="23"/>
     </w:p>
     <w:p>
       <w:pPr>
@@ -6468,7 +7311,13 @@
       </w:r>
     </w:p>
     <w:p>
-      <w:r>
+      <w:pPr>
+        <w:jc w:val="both"/>
+      </w:pPr>
+      <w:r>
+        <w:rPr>
+          <w:noProof/>
+        </w:rPr>
         <w:drawing>
           <wp:inline distT="0" distB="0" distL="0" distR="0" wp14:anchorId="1540C330" wp14:editId="04395CBF">
             <wp:extent cx="5400040" cy="1838960"/>
@@ -6511,14 +7360,32 @@
         </w:drawing>
       </w:r>
     </w:p>
-    <w:p/>
-    <w:p/>
-    <w:p/>
-    <w:p/>
     <w:p>
       <w:pPr>
-        <w:pStyle w:val="Ttulo4"/>
-      </w:pPr>
+        <w:jc w:val="both"/>
+      </w:pPr>
+    </w:p>
+    <w:p>
+      <w:pPr>
+        <w:jc w:val="both"/>
+      </w:pPr>
+    </w:p>
+    <w:p>
+      <w:pPr>
+        <w:jc w:val="both"/>
+      </w:pPr>
+    </w:p>
+    <w:p>
+      <w:pPr>
+        <w:jc w:val="both"/>
+      </w:pPr>
+    </w:p>
+    <w:p>
+      <w:pPr>
+        <w:pStyle w:val="Ttulo3"/>
+        <w:jc w:val="both"/>
+      </w:pPr>
+      <w:bookmarkStart w:id="24" w:name="_Toc228146734"/>
       <w:r>
         <w:lastRenderedPageBreak/>
         <w:t>Casos de Uso</w:t>
@@ -6526,30 +7393,40 @@
       <w:r>
         <w:t xml:space="preserve"> Secundarios debido a uso común</w:t>
       </w:r>
+      <w:bookmarkEnd w:id="24"/>
     </w:p>
     <w:p>
+      <w:pPr>
+        <w:jc w:val="both"/>
+      </w:pPr>
       <w:r>
         <w:t>Para determinar la existencia de un caso de uso hice lo siguiente:</w:t>
       </w:r>
     </w:p>
     <w:p>
-      <w:r>
-        <w:t>Cuando en</w:t>
-      </w:r>
-      <w:r>
-        <w:t xml:space="preserve"> los pasos de 2 o más casos de uso, se repite varios pasos relacionados a la acción del actor sobre el sistema, es señal de que deberíamos sacar un caso de uso secundario relacionado a dichos casos de uso</w:t>
-      </w:r>
-      <w:r>
-        <w:t>.</w:t>
+      <w:pPr>
+        <w:jc w:val="both"/>
+      </w:pPr>
+      <w:r>
+        <w:t>Cuando en los pasos de 2 o más casos de uso, se repite varios pasos relacionados a la acción del actor sobre el sistema, es señal de que deberíamos sacar un caso de uso secundario relacionado a dichos casos de uso.</w:t>
       </w:r>
     </w:p>
     <w:p>
+      <w:pPr>
+        <w:jc w:val="both"/>
+      </w:pPr>
       <w:r>
         <w:t>Eso es lo que pasa con los casos de uso “Consultar Información Paciente” y “Traslado Paciente otra Unidad”.</w:t>
       </w:r>
     </w:p>
     <w:p>
-      <w:r>
+      <w:pPr>
+        <w:jc w:val="both"/>
+      </w:pPr>
+      <w:r>
+        <w:rPr>
+          <w:noProof/>
+        </w:rPr>
         <w:drawing>
           <wp:inline distT="0" distB="0" distL="0" distR="0" wp14:anchorId="3BA1AA8B" wp14:editId="36EBAFC9">
             <wp:extent cx="5400040" cy="2357120"/>
@@ -6593,6 +7470,9 @@
       </w:r>
     </w:p>
     <w:p>
+      <w:pPr>
+        <w:jc w:val="both"/>
+      </w:pPr>
       <w:r>
         <w:t xml:space="preserve">En el caso de “Traslado Paciente otra Unidad”, aparte de ser un paso común entre 2 casos de uso principales, también es una especialización de uno de esos 2 caso de uso </w:t>
       </w:r>
@@ -6603,42 +7483,116 @@
         <w:t>.</w:t>
       </w:r>
     </w:p>
-    <w:p/>
-    <w:p/>
-    <w:p/>
-    <w:p/>
-    <w:p/>
-    <w:p/>
-    <w:p/>
-    <w:p/>
-    <w:p/>
-    <w:p/>
-    <w:p/>
-    <w:p/>
-    <w:p/>
     <w:p>
       <w:pPr>
-        <w:pStyle w:val="Ttulo3"/>
-      </w:pPr>
+        <w:jc w:val="both"/>
+      </w:pPr>
+    </w:p>
+    <w:p>
+      <w:pPr>
+        <w:jc w:val="both"/>
+      </w:pPr>
+    </w:p>
+    <w:p>
+      <w:pPr>
+        <w:jc w:val="both"/>
+      </w:pPr>
+    </w:p>
+    <w:p>
+      <w:pPr>
+        <w:jc w:val="both"/>
+      </w:pPr>
+    </w:p>
+    <w:p>
+      <w:pPr>
+        <w:jc w:val="both"/>
+      </w:pPr>
+    </w:p>
+    <w:p>
+      <w:pPr>
+        <w:jc w:val="both"/>
+      </w:pPr>
+    </w:p>
+    <w:p>
+      <w:pPr>
+        <w:jc w:val="both"/>
+      </w:pPr>
+    </w:p>
+    <w:p>
+      <w:pPr>
+        <w:jc w:val="both"/>
+      </w:pPr>
+    </w:p>
+    <w:p>
+      <w:pPr>
+        <w:jc w:val="both"/>
+      </w:pPr>
+    </w:p>
+    <w:p>
+      <w:pPr>
+        <w:jc w:val="both"/>
+      </w:pPr>
+    </w:p>
+    <w:p>
+      <w:pPr>
+        <w:jc w:val="both"/>
+      </w:pPr>
+    </w:p>
+    <w:p>
+      <w:pPr>
+        <w:jc w:val="both"/>
+      </w:pPr>
+    </w:p>
+    <w:p>
+      <w:pPr>
+        <w:jc w:val="both"/>
+      </w:pPr>
+    </w:p>
+    <w:p>
+      <w:pPr>
+        <w:pStyle w:val="Ttulo2"/>
+        <w:jc w:val="both"/>
+      </w:pPr>
+      <w:bookmarkStart w:id="25" w:name="_Toc228146735"/>
       <w:r>
         <w:lastRenderedPageBreak/>
         <w:t>Relaciones entre Casos de Uso</w:t>
       </w:r>
+      <w:bookmarkEnd w:id="25"/>
     </w:p>
     <w:p>
       <w:pPr>
-        <w:pStyle w:val="Ttulo4"/>
-      </w:pPr>
-      <w:r>
-        <w:t>Relaciones &lt;&lt;Include&gt;&gt;</w:t>
-      </w:r>
+        <w:pStyle w:val="Ttulo3"/>
+        <w:jc w:val="both"/>
+      </w:pPr>
+      <w:bookmarkStart w:id="26" w:name="_Toc228146736"/>
+      <w:r>
+        <w:t>Relaciones &lt;&lt;</w:t>
+      </w:r>
+      <w:proofErr w:type="spellStart"/>
+      <w:r>
+        <w:t>Include</w:t>
+      </w:r>
+      <w:proofErr w:type="spellEnd"/>
+      <w:r>
+        <w:t>&gt;&gt;</w:t>
+      </w:r>
+      <w:bookmarkEnd w:id="26"/>
     </w:p>
     <w:p>
       <w:pPr>
         <w:jc w:val="both"/>
       </w:pPr>
       <w:r>
-        <w:t xml:space="preserve">Una relación &lt;&lt;Include&gt;&gt; marca que un caso de uso usa si o si otro. </w:t>
+        <w:t>Una relación &lt;&lt;</w:t>
+      </w:r>
+      <w:proofErr w:type="spellStart"/>
+      <w:r>
+        <w:t>Include</w:t>
+      </w:r>
+      <w:proofErr w:type="spellEnd"/>
+      <w:r>
+        <w:t xml:space="preserve">&gt;&gt; marca que un caso de uso usa si o si otro. </w:t>
       </w:r>
     </w:p>
     <w:p>
@@ -6662,7 +7616,15 @@
         <w:jc w:val="both"/>
       </w:pPr>
       <w:r>
-        <w:t>“Traslado Paciente otra Unidad” que es un paso obligatorio no tendría por qué estar separado, pero como es un paso común en varios casos de uso, se le separa y se le marca con una relación &lt;&lt;include&gt;&gt;.</w:t>
+        <w:t>“Traslado Paciente otra Unidad” que es un paso obligatorio no tendría por qué estar separado, pero como es un paso común en varios casos de uso, se le separa y se le marca con una relación &lt;&lt;</w:t>
+      </w:r>
+      <w:proofErr w:type="spellStart"/>
+      <w:r>
+        <w:t>include</w:t>
+      </w:r>
+      <w:proofErr w:type="spellEnd"/>
+      <w:r>
+        <w:t>&gt;&gt;.</w:t>
       </w:r>
     </w:p>
     <w:p>
@@ -6670,6 +7632,9 @@
         <w:jc w:val="both"/>
       </w:pPr>
       <w:r>
+        <w:rPr>
+          <w:noProof/>
+        </w:rPr>
         <w:drawing>
           <wp:inline distT="0" distB="0" distL="0" distR="0" wp14:anchorId="78138339" wp14:editId="6E565C13">
             <wp:extent cx="5400040" cy="1198880"/>
@@ -6714,19 +7679,37 @@
     </w:p>
     <w:p>
       <w:pPr>
-        <w:pStyle w:val="Ttulo4"/>
+        <w:pStyle w:val="Ttulo3"/>
         <w:jc w:val="both"/>
       </w:pPr>
-      <w:r>
-        <w:t>Relaciones &lt;&lt;extend&gt;&gt;</w:t>
-      </w:r>
+      <w:bookmarkStart w:id="27" w:name="_Toc228146737"/>
+      <w:r>
+        <w:t>Relaciones &lt;&lt;</w:t>
+      </w:r>
+      <w:proofErr w:type="spellStart"/>
+      <w:r>
+        <w:t>extend</w:t>
+      </w:r>
+      <w:proofErr w:type="spellEnd"/>
+      <w:r>
+        <w:t>&gt;&gt;</w:t>
+      </w:r>
+      <w:bookmarkEnd w:id="27"/>
     </w:p>
     <w:p>
       <w:pPr>
         <w:jc w:val="both"/>
       </w:pPr>
       <w:r>
-        <w:t>Una relación &lt;&lt;extend&gt;&gt; marca que un caso de uso puede opcionalmente usar a otro.</w:t>
+        <w:t>Una relación &lt;&lt;</w:t>
+      </w:r>
+      <w:proofErr w:type="spellStart"/>
+      <w:r>
+        <w:t>extend</w:t>
+      </w:r>
+      <w:proofErr w:type="spellEnd"/>
+      <w:r>
+        <w:t>&gt;&gt; marca que un caso de uso puede opcionalmente usar a otro.</w:t>
       </w:r>
     </w:p>
     <w:p>
@@ -6737,7 +7720,23 @@
         <w:t>Un caso de uso secundario no es más que un paso dentro de otro caso de uso, puede ocurrir que un paso opcional</w:t>
       </w:r>
       <w:r>
-        <w:t xml:space="preserve"> genere subpasos dentro del caso de uso principal, la decisión es sacar un caso de uso de ello y, al ser opcional, marcarlo con &lt;&lt;extend&gt;&gt;.</w:t>
+        <w:t xml:space="preserve"> genere </w:t>
+      </w:r>
+      <w:proofErr w:type="spellStart"/>
+      <w:r>
+        <w:t>subpasos</w:t>
+      </w:r>
+      <w:proofErr w:type="spellEnd"/>
+      <w:r>
+        <w:t xml:space="preserve"> dentro del caso de uso principal, la decisión es sacar un caso de uso de ello y, al ser opcional, marcarlo con &lt;&lt;</w:t>
+      </w:r>
+      <w:proofErr w:type="spellStart"/>
+      <w:r>
+        <w:t>extend</w:t>
+      </w:r>
+      <w:proofErr w:type="spellEnd"/>
+      <w:r>
+        <w:t>&gt;&gt;.</w:t>
       </w:r>
     </w:p>
     <w:p>
@@ -6753,6 +7752,9 @@
         <w:jc w:val="both"/>
       </w:pPr>
       <w:r>
+        <w:rPr>
+          <w:noProof/>
+        </w:rPr>
         <w:drawing>
           <wp:inline distT="0" distB="0" distL="0" distR="0" wp14:anchorId="211C502A" wp14:editId="6B0E5CE6">
             <wp:extent cx="5400040" cy="885825"/>
@@ -6830,11 +7832,18 @@
         <w:jc w:val="both"/>
       </w:pPr>
       <w:r>
-        <w:lastRenderedPageBreak/>
         <w:t>También puede ocurrir lo del caso de uso “Consultar Información”, como 2 casos de uso usan la misma serie de pasos, se</w:t>
       </w:r>
       <w:r>
-        <w:t xml:space="preserve"> saca un caso de uso como resultado, además, como ese uso era opcional, se marca &lt;&lt;extend&gt;&gt; en la relación.</w:t>
+        <w:t xml:space="preserve"> saca un caso de uso como resultado, además, como ese uso era opcional, se marca &lt;&lt;</w:t>
+      </w:r>
+      <w:proofErr w:type="spellStart"/>
+      <w:r>
+        <w:t>extend</w:t>
+      </w:r>
+      <w:proofErr w:type="spellEnd"/>
+      <w:r>
+        <w:t>&gt;&gt; en la relación.</w:t>
       </w:r>
     </w:p>
     <w:p>
@@ -6842,6 +7851,9 @@
         <w:jc w:val="both"/>
       </w:pPr>
       <w:r>
+        <w:rPr>
+          <w:noProof/>
+        </w:rPr>
         <w:drawing>
           <wp:inline distT="0" distB="0" distL="0" distR="0" wp14:anchorId="6676797C" wp14:editId="6BFCC64E">
             <wp:extent cx="5400040" cy="2357120"/>
@@ -6886,8 +7898,79 @@
     </w:p>
     <w:p>
       <w:pPr>
+        <w:pStyle w:val="Ttulo3"/>
+      </w:pPr>
+      <w:bookmarkStart w:id="28" w:name="_Toc228146738"/>
+      <w:r>
+        <w:t>Relaciones de especialización</w:t>
+      </w:r>
+      <w:bookmarkEnd w:id="28"/>
+    </w:p>
+    <w:p>
+      <w:pPr>
         <w:jc w:val="both"/>
       </w:pPr>
+      <w:r>
+        <w:t>Las relaciones de especialización marcan que un caso de uso, debido a la acción directa del actor, se divide en 2 o más ramas principales, donde se tiene que elegir entre una u otra.</w:t>
+      </w:r>
+    </w:p>
+    <w:p>
+      <w:pPr>
+        <w:jc w:val="both"/>
+        <w:rPr>
+          <w:u w:val="single"/>
+        </w:rPr>
+      </w:pPr>
+      <w:r>
+        <w:t>Ese es el caso las relaciones de especialización que salen de “Traslado Paciente.</w:t>
+      </w:r>
+    </w:p>
+    <w:p>
+      <w:r>
+        <w:rPr>
+          <w:noProof/>
+        </w:rPr>
+        <w:drawing>
+          <wp:inline distT="0" distB="0" distL="0" distR="0" wp14:anchorId="6D0577A3" wp14:editId="694D8A2F">
+            <wp:extent cx="5400040" cy="1838960"/>
+            <wp:effectExtent l="19050" t="19050" r="10160" b="27940"/>
+            <wp:docPr id="9" name="Imagen 9"/>
+            <wp:cNvGraphicFramePr>
+              <a:graphicFrameLocks xmlns:a="http://schemas.openxmlformats.org/drawingml/2006/main" noChangeAspect="1"/>
+            </wp:cNvGraphicFramePr>
+            <a:graphic xmlns:a="http://schemas.openxmlformats.org/drawingml/2006/main">
+              <a:graphicData uri="http://schemas.openxmlformats.org/drawingml/2006/picture">
+                <pic:pic xmlns:pic="http://schemas.openxmlformats.org/drawingml/2006/picture">
+                  <pic:nvPicPr>
+                    <pic:cNvPr id="1" name=""/>
+                    <pic:cNvPicPr/>
+                  </pic:nvPicPr>
+                  <pic:blipFill>
+                    <a:blip r:embed="rId13"/>
+                    <a:stretch>
+                      <a:fillRect/>
+                    </a:stretch>
+                  </pic:blipFill>
+                  <pic:spPr>
+                    <a:xfrm>
+                      <a:off x="0" y="0"/>
+                      <a:ext cx="5400040" cy="1838960"/>
+                    </a:xfrm>
+                    <a:prstGeom prst="rect">
+                      <a:avLst/>
+                    </a:prstGeom>
+                    <a:ln>
+                      <a:solidFill>
+                        <a:schemeClr val="accent1"/>
+                      </a:solidFill>
+                    </a:ln>
+                  </pic:spPr>
+                </pic:pic>
+              </a:graphicData>
+            </a:graphic>
+          </wp:inline>
+        </w:drawing>
+      </w:r>
     </w:p>
     <w:sectPr>
       <w:footerReference w:type="default" r:id="rId17"/>
@@ -9180,6 +10263,7 @@
   <w:style w:type="character" w:default="1" w:styleId="Fuentedeprrafopredeter">
     <w:name w:val="Default Paragraph Font"/>
     <w:uiPriority w:val="1"/>
+    <w:semiHidden/>
     <w:unhideWhenUsed/>
   </w:style>
   <w:style w:type="table" w:default="1" w:styleId="Tablanormal">

</xml_diff>

<commit_message>
Comenzando el diagrama de actividad en base a los casos de uso del diagrama de casos de uso
</commit_message>
<xml_diff>
--- a/documentacion/Diagrama de Casos de Uso/PROYECTO-RETO – Diagrama-Casos-De-Uso _ Grupo2.docx
+++ b/documentacion/Diagrama de Casos de Uso/PROYECTO-RETO – Diagrama-Casos-De-Uso _ Grupo2.docx
@@ -116,29 +116,7 @@
                                     <w:sz w:val="24"/>
                                     <w:szCs w:val="24"/>
                                   </w:rPr>
-                                  <w:t xml:space="preserve">Diana </w:t>
-                                </w:r>
-                                <w:proofErr w:type="spellStart"/>
-                                <w:r>
-                                  <w:rPr>
-                                    <w:rFonts w:ascii="Calisto MT" w:hAnsi="Calisto MT"/>
-                                    <w:b/>
-                                    <w:bCs/>
-                                    <w:sz w:val="24"/>
-                                    <w:szCs w:val="24"/>
-                                  </w:rPr>
-                                  <w:t>Rodriguez</w:t>
-                                </w:r>
-                                <w:proofErr w:type="spellEnd"/>
-                                <w:r>
-                                  <w:rPr>
-                                    <w:rFonts w:ascii="Calisto MT" w:hAnsi="Calisto MT"/>
-                                    <w:b/>
-                                    <w:bCs/>
-                                    <w:sz w:val="24"/>
-                                    <w:szCs w:val="24"/>
-                                  </w:rPr>
-                                  <w:t xml:space="preserve"> Pinillos</w:t>
+                                  <w:t>Diana Rodriguez Pinillos</w:t>
                                 </w:r>
                               </w:p>
                               <w:p>
@@ -160,42 +138,8 @@
                                     <w:sz w:val="24"/>
                                     <w:szCs w:val="24"/>
                                   </w:rPr>
-                                  <w:t xml:space="preserve">Alex </w:t>
+                                  <w:t>Alex Andrei Stoica</w:t>
                                 </w:r>
-                                <w:proofErr w:type="spellStart"/>
-                                <w:r>
-                                  <w:rPr>
-                                    <w:rFonts w:ascii="Calisto MT" w:hAnsi="Calisto MT"/>
-                                    <w:b/>
-                                    <w:bCs/>
-                                    <w:sz w:val="24"/>
-                                    <w:szCs w:val="24"/>
-                                  </w:rPr>
-                                  <w:t>Andrei</w:t>
-                                </w:r>
-                                <w:proofErr w:type="spellEnd"/>
-                                <w:r>
-                                  <w:rPr>
-                                    <w:rFonts w:ascii="Calisto MT" w:hAnsi="Calisto MT"/>
-                                    <w:b/>
-                                    <w:bCs/>
-                                    <w:sz w:val="24"/>
-                                    <w:szCs w:val="24"/>
-                                  </w:rPr>
-                                  <w:t xml:space="preserve"> </w:t>
-                                </w:r>
-                                <w:proofErr w:type="spellStart"/>
-                                <w:r>
-                                  <w:rPr>
-                                    <w:rFonts w:ascii="Calisto MT" w:hAnsi="Calisto MT"/>
-                                    <w:b/>
-                                    <w:bCs/>
-                                    <w:sz w:val="24"/>
-                                    <w:szCs w:val="24"/>
-                                  </w:rPr>
-                                  <w:t>Stoica</w:t>
-                                </w:r>
-                                <w:proofErr w:type="spellEnd"/>
                               </w:p>
                               <w:p>
                                 <w:pPr>
@@ -301,29 +245,7 @@
                               <w:sz w:val="24"/>
                               <w:szCs w:val="24"/>
                             </w:rPr>
-                            <w:t xml:space="preserve">Diana </w:t>
-                          </w:r>
-                          <w:proofErr w:type="spellStart"/>
-                          <w:r>
-                            <w:rPr>
-                              <w:rFonts w:ascii="Calisto MT" w:hAnsi="Calisto MT"/>
-                              <w:b/>
-                              <w:bCs/>
-                              <w:sz w:val="24"/>
-                              <w:szCs w:val="24"/>
-                            </w:rPr>
-                            <w:t>Rodriguez</w:t>
-                          </w:r>
-                          <w:proofErr w:type="spellEnd"/>
-                          <w:r>
-                            <w:rPr>
-                              <w:rFonts w:ascii="Calisto MT" w:hAnsi="Calisto MT"/>
-                              <w:b/>
-                              <w:bCs/>
-                              <w:sz w:val="24"/>
-                              <w:szCs w:val="24"/>
-                            </w:rPr>
-                            <w:t xml:space="preserve"> Pinillos</w:t>
+                            <w:t>Diana Rodriguez Pinillos</w:t>
                           </w:r>
                         </w:p>
                         <w:p>
@@ -345,42 +267,8 @@
                               <w:sz w:val="24"/>
                               <w:szCs w:val="24"/>
                             </w:rPr>
-                            <w:t xml:space="preserve">Alex </w:t>
+                            <w:t>Alex Andrei Stoica</w:t>
                           </w:r>
-                          <w:proofErr w:type="spellStart"/>
-                          <w:r>
-                            <w:rPr>
-                              <w:rFonts w:ascii="Calisto MT" w:hAnsi="Calisto MT"/>
-                              <w:b/>
-                              <w:bCs/>
-                              <w:sz w:val="24"/>
-                              <w:szCs w:val="24"/>
-                            </w:rPr>
-                            <w:t>Andrei</w:t>
-                          </w:r>
-                          <w:proofErr w:type="spellEnd"/>
-                          <w:r>
-                            <w:rPr>
-                              <w:rFonts w:ascii="Calisto MT" w:hAnsi="Calisto MT"/>
-                              <w:b/>
-                              <w:bCs/>
-                              <w:sz w:val="24"/>
-                              <w:szCs w:val="24"/>
-                            </w:rPr>
-                            <w:t xml:space="preserve"> </w:t>
-                          </w:r>
-                          <w:proofErr w:type="spellStart"/>
-                          <w:r>
-                            <w:rPr>
-                              <w:rFonts w:ascii="Calisto MT" w:hAnsi="Calisto MT"/>
-                              <w:b/>
-                              <w:bCs/>
-                              <w:sz w:val="24"/>
-                              <w:szCs w:val="24"/>
-                            </w:rPr>
-                            <w:t>Stoica</w:t>
-                          </w:r>
-                          <w:proofErr w:type="spellEnd"/>
                         </w:p>
                         <w:p>
                           <w:pPr>
@@ -3202,6 +3090,9 @@
     </w:p>
     <w:p>
       <w:r>
+        <w:rPr>
+          <w:noProof/>
+        </w:rPr>
         <w:drawing>
           <wp:inline distT="0" distB="0" distL="0" distR="0" wp14:anchorId="471F3CE2" wp14:editId="38564D5A">
             <wp:extent cx="5204957" cy="5752080"/>
@@ -3514,10 +3405,7 @@
               <w:spacing w:before="120"/>
             </w:pPr>
             <w:r>
-              <w:t xml:space="preserve">El actor </w:t>
-            </w:r>
-            <w:r>
-              <w:t>puede gestionar la ubicación de</w:t>
+              <w:t>El actor puede gestionar la ubicación de</w:t>
             </w:r>
             <w:r>
               <w:t xml:space="preserve"> los</w:t>
@@ -3565,13 +3453,7 @@
               <w:spacing w:before="120"/>
             </w:pPr>
             <w:r>
-              <w:t xml:space="preserve">El actor debe </w:t>
-            </w:r>
-            <w:r>
-              <w:t>tener el rol adecuado para esta acción, y haber seleccionado está opción en el menú del sistema</w:t>
-            </w:r>
-            <w:r>
-              <w:t>.</w:t>
+              <w:t>El actor debe tener el rol adecuado para esta acción, y haber seleccionado está opción en el menú del sistema.</w:t>
             </w:r>
           </w:p>
           <w:p/>
@@ -4011,7 +3893,13 @@
               <w:spacing w:before="120"/>
             </w:pPr>
             <w:r>
-              <w:t>3.- El paciente le da la opción al actor de seleccionar un paciente</w:t>
+              <w:t xml:space="preserve">3.- El </w:t>
+            </w:r>
+            <w:r>
+              <w:t>sistema</w:t>
+            </w:r>
+            <w:r>
+              <w:t xml:space="preserve"> le da la opción al actor de seleccionar un paciente</w:t>
             </w:r>
             <w:r>
               <w:t>.</w:t>
@@ -4044,10 +3932,7 @@
               <w:t xml:space="preserve">       - Ver Información del Paciente</w:t>
             </w:r>
             <w:r>
-              <w:t xml:space="preserve"> </w:t>
-            </w:r>
-            <w:r>
-              <w:t>(Caso de uso “Consultar Información Paciente”)</w:t>
+              <w:t xml:space="preserve"> (Caso de uso “Consultar Información Paciente”)</w:t>
             </w:r>
           </w:p>
           <w:p>
@@ -4347,15 +4232,7 @@
               <w:spacing w:before="120"/>
             </w:pPr>
             <w:r>
-              <w:t xml:space="preserve">El actor registra en el sistema la </w:t>
-            </w:r>
-            <w:proofErr w:type="spellStart"/>
-            <w:r>
-              <w:t>desasignación</w:t>
-            </w:r>
-            <w:proofErr w:type="spellEnd"/>
-            <w:r>
-              <w:t xml:space="preserve"> de un paciente </w:t>
+              <w:t xml:space="preserve">El actor registra en el sistema la desasignación de un paciente </w:t>
             </w:r>
             <w:r>
               <w:t xml:space="preserve">residente </w:t>
@@ -4537,10 +4414,7 @@
               <w:t xml:space="preserve">       - Ver Información del Paciente</w:t>
             </w:r>
             <w:r>
-              <w:t xml:space="preserve"> </w:t>
-            </w:r>
-            <w:r>
-              <w:t>(Caso de uso “Consultar Información Paciente”)</w:t>
+              <w:t xml:space="preserve"> (Caso de uso “Consultar Información Paciente”)</w:t>
             </w:r>
           </w:p>
           <w:p>
@@ -4584,14 +4458,12 @@
             <w:r>
               <w:t xml:space="preserve">registra la </w:t>
             </w:r>
-            <w:proofErr w:type="spellStart"/>
             <w:r>
               <w:t>desasigna</w:t>
             </w:r>
             <w:r>
               <w:t>ción</w:t>
             </w:r>
-            <w:proofErr w:type="spellEnd"/>
             <w:r>
               <w:t xml:space="preserve"> </w:t>
             </w:r>
@@ -4932,44 +4804,23 @@
               <w:spacing w:before="120"/>
             </w:pPr>
             <w:r>
-              <w:t xml:space="preserve">2.- </w:t>
-            </w:r>
-            <w:r>
-              <w:t>El sistema muestra una lista con las unidades con pacientes asignados.</w:t>
-            </w:r>
-          </w:p>
-          <w:p>
-            <w:pPr>
-              <w:spacing w:before="120"/>
-            </w:pPr>
-            <w:r>
-              <w:t xml:space="preserve">3.- El actor escoge la unidad donde este el paciente que quiere </w:t>
-            </w:r>
-            <w:r>
-              <w:t>trasladar</w:t>
-            </w:r>
-            <w:r>
-              <w:t>.</w:t>
-            </w:r>
-          </w:p>
-          <w:p>
-            <w:pPr>
-              <w:spacing w:before="120"/>
-            </w:pPr>
-            <w:r>
-              <w:t>4.- El sistema muestra una lista con los pacientes ya asignados de la unidad elegida</w:t>
-            </w:r>
-            <w:r>
-              <w:t>.</w:t>
-            </w:r>
-            <w:r>
-              <w:t xml:space="preserve"> </w:t>
-            </w:r>
-            <w:r>
-              <w:t>E</w:t>
-            </w:r>
-            <w:r>
-              <w:t>n cada paciente se muestra su estado como resumen.</w:t>
+              <w:t>2.- El sistema muestra una lista con las unidades con pacientes asignados.</w:t>
+            </w:r>
+          </w:p>
+          <w:p>
+            <w:pPr>
+              <w:spacing w:before="120"/>
+            </w:pPr>
+            <w:r>
+              <w:t>3.- El actor escoge la unidad donde este el paciente que quiere trasladar.</w:t>
+            </w:r>
+          </w:p>
+          <w:p>
+            <w:pPr>
+              <w:spacing w:before="120"/>
+            </w:pPr>
+            <w:r>
+              <w:t>4.- El sistema muestra una lista con los pacientes ya asignados de la unidad elegida. En cada paciente se muestra su estado como resumen.</w:t>
             </w:r>
           </w:p>
           <w:p>
@@ -7153,15 +7004,7 @@
               <w:t xml:space="preserve">.- El sistema </w:t>
             </w:r>
             <w:r>
-              <w:t xml:space="preserve">muestra una lista de los pacientes, cuya </w:t>
-            </w:r>
-            <w:proofErr w:type="spellStart"/>
-            <w:r>
-              <w:t>ultima</w:t>
-            </w:r>
-            <w:proofErr w:type="spellEnd"/>
-            <w:r>
-              <w:t xml:space="preserve"> ronda medica registrada marquen que están listos para que le confirmen la evaluación final.</w:t>
+              <w:t>muestra una lista de los pacientes, cuya ultima ronda medica registrada marquen que están listos para que le confirmen la evaluación final.</w:t>
             </w:r>
           </w:p>
           <w:p>
@@ -7758,7 +7601,7 @@
               <w:spacing w:before="120"/>
             </w:pPr>
             <w:r>
-              <w:t>Iniciar Sesión</w:t>
+              <w:t>Seleccionar Rol</w:t>
             </w:r>
           </w:p>
         </w:tc>
@@ -8064,6 +7907,9 @@
         <w:jc w:val="both"/>
       </w:pPr>
       <w:r>
+        <w:rPr>
+          <w:noProof/>
+        </w:rPr>
         <w:drawing>
           <wp:inline distT="0" distB="0" distL="0" distR="0" wp14:anchorId="1F01DD71" wp14:editId="2A10F79B">
             <wp:extent cx="5380990" cy="6140673"/>
@@ -8139,12 +7985,10 @@
         <w:lastRenderedPageBreak/>
         <w:t xml:space="preserve">Casos de Uso Secundarios debido a </w:t>
       </w:r>
-      <w:proofErr w:type="spellStart"/>
       <w:r>
         <w:t>subpasos</w:t>
       </w:r>
       <w:bookmarkEnd w:id="22"/>
-      <w:proofErr w:type="spellEnd"/>
     </w:p>
     <w:p>
       <w:pPr>
@@ -8162,23 +8006,7 @@
         <w:t>Cuando en un caso de uso principal</w:t>
       </w:r>
       <w:r>
-        <w:t xml:space="preserve">, la acción directa del actor divide un paso en </w:t>
-      </w:r>
-      <w:proofErr w:type="spellStart"/>
-      <w:r>
-        <w:t>subpasos</w:t>
-      </w:r>
-      <w:proofErr w:type="spellEnd"/>
-      <w:r>
-        <w:t xml:space="preserve"> relacionados, es señal de que deberíamos sacar un caso secundario representando esa acción que genera </w:t>
-      </w:r>
-      <w:proofErr w:type="spellStart"/>
-      <w:r>
-        <w:t>subpasos</w:t>
-      </w:r>
-      <w:proofErr w:type="spellEnd"/>
-      <w:r>
-        <w:t xml:space="preserve">. </w:t>
+        <w:t xml:space="preserve">, la acción directa del actor divide un paso en subpasos relacionados, es señal de que deberíamos sacar un caso secundario representando esa acción que genera subpasos. </w:t>
       </w:r>
     </w:p>
     <w:p>
@@ -8374,6 +8202,9 @@
         <w:jc w:val="both"/>
       </w:pPr>
       <w:r>
+        <w:rPr>
+          <w:noProof/>
+        </w:rPr>
         <w:drawing>
           <wp:inline distT="0" distB="0" distL="0" distR="0" wp14:anchorId="5BABF0F5" wp14:editId="728F00C3">
             <wp:extent cx="5400040" cy="2421890"/>
@@ -8678,6 +8509,9 @@
         <w:jc w:val="both"/>
       </w:pPr>
       <w:r>
+        <w:rPr>
+          <w:noProof/>
+        </w:rPr>
         <w:drawing>
           <wp:inline distT="0" distB="0" distL="0" distR="0" wp14:anchorId="73D77410" wp14:editId="3CF40AAE">
             <wp:extent cx="5400040" cy="2344420"/>
@@ -8818,15 +8652,7 @@
       </w:pPr>
       <w:bookmarkStart w:id="26" w:name="_Toc228205815"/>
       <w:r>
-        <w:t>Relaciones &lt;&lt;</w:t>
-      </w:r>
-      <w:proofErr w:type="spellStart"/>
-      <w:r>
-        <w:t>Include</w:t>
-      </w:r>
-      <w:proofErr w:type="spellEnd"/>
-      <w:r>
-        <w:t>&gt;&gt;</w:t>
+        <w:t>Relaciones &lt;&lt;Include&gt;&gt;</w:t>
       </w:r>
       <w:bookmarkEnd w:id="26"/>
     </w:p>
@@ -8835,15 +8661,7 @@
         <w:jc w:val="both"/>
       </w:pPr>
       <w:r>
-        <w:t>Una relación &lt;&lt;</w:t>
-      </w:r>
-      <w:proofErr w:type="spellStart"/>
-      <w:r>
-        <w:t>Include</w:t>
-      </w:r>
-      <w:proofErr w:type="spellEnd"/>
-      <w:r>
-        <w:t xml:space="preserve">&gt;&gt; marca que un caso de uso usa si o si otro. </w:t>
+        <w:t xml:space="preserve">Una relación &lt;&lt;Include&gt;&gt; marca que un caso de uso usa si o si otro. </w:t>
       </w:r>
     </w:p>
     <w:p>
@@ -8891,15 +8709,7 @@
         <w:jc w:val="both"/>
       </w:pPr>
       <w:r>
-        <w:t>“Traslado Paciente otra Unidad” que es un paso obligatorio no tendría por qué estar separado, pero como es un paso común en varios casos de uso, se le separa y se le marca con una relación &lt;&lt;</w:t>
-      </w:r>
-      <w:proofErr w:type="spellStart"/>
-      <w:r>
-        <w:t>include</w:t>
-      </w:r>
-      <w:proofErr w:type="spellEnd"/>
-      <w:r>
-        <w:t>&gt;&gt;.</w:t>
+        <w:t>“Traslado Paciente otra Unidad” que es un paso obligatorio no tendría por qué estar separado, pero como es un paso común en varios casos de uso, se le separa y se le marca con una relación &lt;&lt;include&gt;&gt;.</w:t>
       </w:r>
     </w:p>
     <w:p>
@@ -9020,15 +8830,7 @@
       <w:bookmarkStart w:id="27" w:name="_Toc228205816"/>
       <w:r>
         <w:lastRenderedPageBreak/>
-        <w:t>Relaciones &lt;&lt;</w:t>
-      </w:r>
-      <w:proofErr w:type="spellStart"/>
-      <w:r>
-        <w:t>extend</w:t>
-      </w:r>
-      <w:proofErr w:type="spellEnd"/>
-      <w:r>
-        <w:t>&gt;&gt;</w:t>
+        <w:t>Relaciones &lt;&lt;extend&gt;&gt;</w:t>
       </w:r>
       <w:bookmarkEnd w:id="27"/>
     </w:p>
@@ -9037,15 +8839,7 @@
         <w:jc w:val="both"/>
       </w:pPr>
       <w:r>
-        <w:t>Una relación &lt;&lt;</w:t>
-      </w:r>
-      <w:proofErr w:type="spellStart"/>
-      <w:r>
-        <w:t>extend</w:t>
-      </w:r>
-      <w:proofErr w:type="spellEnd"/>
-      <w:r>
-        <w:t>&gt;&gt; marca que un caso de uso puede opcionalmente usar a otro.</w:t>
+        <w:t>Una relación &lt;&lt;extend&gt;&gt; marca que un caso de uso puede opcionalmente usar a otro.</w:t>
       </w:r>
     </w:p>
     <w:p>
@@ -9074,23 +8868,7 @@
         <w:t>uede ocurrir que un paso opcional</w:t>
       </w:r>
       <w:r>
-        <w:t xml:space="preserve"> genere </w:t>
-      </w:r>
-      <w:proofErr w:type="spellStart"/>
-      <w:r>
-        <w:t>subpasos</w:t>
-      </w:r>
-      <w:proofErr w:type="spellEnd"/>
-      <w:r>
-        <w:t xml:space="preserve"> dentro del caso de uso principal, la decisión es sacar un caso de uso de ello y, al ser opcional, marcarlo con &lt;&lt;</w:t>
-      </w:r>
-      <w:proofErr w:type="spellStart"/>
-      <w:r>
-        <w:t>extend</w:t>
-      </w:r>
-      <w:proofErr w:type="spellEnd"/>
-      <w:r>
-        <w:t>&gt;&gt;.</w:t>
+        <w:t xml:space="preserve"> genere subpasos dentro del caso de uso principal, la decisión es sacar un caso de uso de ello y, al ser opcional, marcarlo con &lt;&lt;extend&gt;&gt;.</w:t>
       </w:r>
     </w:p>
     <w:p>
@@ -9159,15 +8937,7 @@
         <w:t>También puede ocurrir lo del caso de uso “Consultar Información”, como 2 casos de uso usan la misma serie de pasos, se</w:t>
       </w:r>
       <w:r>
-        <w:t xml:space="preserve"> saca un caso de uso como resultado, además, como ese uso era opcional, se marca &lt;&lt;</w:t>
-      </w:r>
-      <w:proofErr w:type="spellStart"/>
-      <w:r>
-        <w:t>extend</w:t>
-      </w:r>
-      <w:proofErr w:type="spellEnd"/>
-      <w:r>
-        <w:t>&gt;&gt; en la relación.</w:t>
+        <w:t xml:space="preserve"> saca un caso de uso como resultado, además, como ese uso era opcional, se marca &lt;&lt;extend&gt;&gt; en la relación.</w:t>
       </w:r>
     </w:p>
     <w:p>
@@ -9291,6 +9061,9 @@
         </w:rPr>
       </w:pPr>
       <w:r>
+        <w:rPr>
+          <w:noProof/>
+        </w:rPr>
         <w:drawing>
           <wp:inline distT="0" distB="0" distL="0" distR="0" wp14:anchorId="178BADAE" wp14:editId="5AE173E6">
             <wp:extent cx="5400040" cy="2695575"/>
@@ -9335,6 +9108,9 @@
     </w:p>
     <w:p>
       <w:r>
+        <w:rPr>
+          <w:noProof/>
+        </w:rPr>
         <w:drawing>
           <wp:inline distT="0" distB="0" distL="0" distR="0" wp14:anchorId="1AD63721" wp14:editId="551BDBBF">
             <wp:extent cx="5400040" cy="1844040"/>

</xml_diff>

<commit_message>
Corrección documentación diagrama de casos de uso y progreso en diagrama de Actividades
- Correccón de numeración en la documentación del diagrama de casos de uso
en el caso de uso "Traslado Paciente"

- En proceso de la representación del caso de uso "Traslado Paciente" en el diagrama de actividades
</commit_message>
<xml_diff>
--- a/documentacion/Diagrama de Casos de Uso/PROYECTO-RETO – Diagrama-Casos-De-Uso _ Grupo2.docx
+++ b/documentacion/Diagrama de Casos de Uso/PROYECTO-RETO – Diagrama-Casos-De-Uso _ Grupo2.docx
@@ -4836,15 +4836,21 @@
               <w:spacing w:before="120"/>
             </w:pPr>
             <w:r>
-              <w:t>3.- El actor selecciona un paciente de la lista.</w:t>
-            </w:r>
-          </w:p>
-          <w:p>
-            <w:pPr>
-              <w:spacing w:before="120"/>
-            </w:pPr>
-            <w:r>
-              <w:t>4.- El sistema muestra una lista de acciones sobre el paciente:</w:t>
+              <w:t>6</w:t>
+            </w:r>
+            <w:r>
+              <w:t>.- El actor selecciona un paciente de la lista.</w:t>
+            </w:r>
+          </w:p>
+          <w:p>
+            <w:pPr>
+              <w:spacing w:before="120"/>
+            </w:pPr>
+            <w:r>
+              <w:t>7</w:t>
+            </w:r>
+            <w:r>
+              <w:t>.- El sistema muestra una lista de acciones sobre el paciente:</w:t>
             </w:r>
           </w:p>
           <w:p>
@@ -4871,23 +4877,32 @@
               <w:spacing w:before="120"/>
             </w:pPr>
             <w:r>
-              <w:t>5.- El actor Selecciona “Trasladar Paciente”.</w:t>
-            </w:r>
-          </w:p>
-          <w:p>
-            <w:pPr>
-              <w:spacing w:before="120"/>
-            </w:pPr>
-            <w:r>
-              <w:t>6.- El sistema muestra las opciones “Trasladar a otra unidad” y “Trasladar a otro hospital”.</w:t>
-            </w:r>
-          </w:p>
-          <w:p>
-            <w:pPr>
-              <w:spacing w:before="120"/>
-            </w:pPr>
-            <w:r>
-              <w:t xml:space="preserve">7.- El actor elige donde trasladar </w:t>
+              <w:t>8</w:t>
+            </w:r>
+            <w:r>
+              <w:t>.- El actor Selecciona “Trasladar Paciente”.</w:t>
+            </w:r>
+          </w:p>
+          <w:p>
+            <w:pPr>
+              <w:spacing w:before="120"/>
+            </w:pPr>
+            <w:r>
+              <w:t>9</w:t>
+            </w:r>
+            <w:r>
+              <w:t>.- El sistema muestra las opciones “Trasladar a otra unidad” y “Trasladar a otro hospital”.</w:t>
+            </w:r>
+          </w:p>
+          <w:p>
+            <w:pPr>
+              <w:spacing w:before="120"/>
+            </w:pPr>
+            <w:r>
+              <w:t>10</w:t>
+            </w:r>
+            <w:r>
+              <w:t xml:space="preserve">.- El actor elige donde trasladar </w:t>
             </w:r>
             <w:r>
               <w:t>a</w:t>
@@ -4934,7 +4949,10 @@
               <w:spacing w:before="120" w:after="120"/>
             </w:pPr>
             <w:r>
-              <w:t>4.B.- El actor Selecciona “Ver Información del Paciente” (Caso de Uso “Consultar Información Paciente”).</w:t>
+              <w:t>7</w:t>
+            </w:r>
+            <w:r>
+              <w:t>.B.- El actor Selecciona “Ver Información del Paciente” (Caso de Uso “Consultar Información Paciente”).</w:t>
             </w:r>
           </w:p>
           <w:p>
@@ -4942,12 +4960,18 @@
               <w:spacing w:after="120"/>
             </w:pPr>
             <w:r>
-              <w:t>7.C.- El actor selecciona “Trasladar a otra Unidad” (Caso de Uso “Traslado Paciente otra Unidad”).</w:t>
-            </w:r>
-          </w:p>
-          <w:p>
-            <w:r>
-              <w:t>7.D.- El actor selecciona “Trasladar a otro Hospital”</w:t>
+              <w:t>10</w:t>
+            </w:r>
+            <w:r>
+              <w:t>.C.- El actor selecciona “Trasladar a otra Unidad” (Caso de Uso “Traslado Paciente otra Unidad”).</w:t>
+            </w:r>
+          </w:p>
+          <w:p>
+            <w:r>
+              <w:t>10</w:t>
+            </w:r>
+            <w:r>
+              <w:t>.D.- El actor selecciona “Trasladar a otro Hospital”</w:t>
             </w:r>
             <w:r>
               <w:t xml:space="preserve"> (Caso de Uso “Traslado Paciente otro Hospital”)</w:t>

</xml_diff>